<commit_message>
Docs : transformations v2 — zones forcées (avec assets) séparées des blocs
Reprise sur la correction du game design : le tableau 1 devient la
matrice 3×3 des ZONES FORCÉES (asset par zone : douche proposée /
hublot fendu déjà en jeu / radiateur proposé, cases ① coût ② comment-
quand), le tableau 2 isole les BLOCS à aura (par particule), le
tableau 3 garde les changements volontaires. Recommandation ajoutée :
aligner les assets des zones (conduite rompue vs radiateur, chambre
pressurisée vs douche).

Co-Authored-By: Claude Fable 5 <noreply@anthropic.com>
Claude-Session: https://claude.ai/code/session_01JcgQjhbx7n2WuX197SocGM
</commit_message>
<xml_diff>
--- a/docs/Sujet21-transformations.docx
+++ b/docs/Sujet21-transformations.docx
@@ -31,7 +31,7 @@
           <w:sz w:val="20"/>
           <w:szCs w:val="20"/>
         </w:rPr>
-        <w:t xml:space="preserve">Règles vivantes du protocole : causes, seuils, coûts et temps. Les valeurs entre parenthèses sont les paramètres du banc (état du code au 12/08/2026) — ce document est fait pour être modifié quand les règles bougent.</w:t>
+        <w:t xml:space="preserve">Règles vivantes du protocole. Deux familles de causes, bien distinctes : les ZONES FORCÉES (une région impose son état à tout le corps, un ASSET raconte pourquoi) et les BLOCS (des surfaces posées dans le décor, qui agissent par aura, particule par particule). Valeurs entre parenthèses : paramètres du banc, état du code au 12/08/2026 — document fait pour être modifié quand les règles bougent.</w:t>
       </w:r>
     </w:p>
     <w:p>
@@ -47,7 +47,7 @@
           <w:sz w:val="26"/>
           <w:szCs w:val="26"/>
         </w:rPr>
-        <w:t xml:space="preserve">1. Causes de transformation — seuils</w:t>
+        <w:t xml:space="preserve">1. Transformations par ZONES FORCÉES — ① coût · ② comment / quand</w:t>
       </w:r>
     </w:p>
     <w:p>
@@ -61,7 +61,608 @@
           <w:sz w:val="18"/>
           <w:szCs w:val="18"/>
         </w:rPr>
-        <w:t xml:space="preserve">Deux régimes aujourd’hui : les MATÉRIAUX (auras) transforment par particule — le corps peut être partiellement transformé ; les ZONES se déclenchent quand le centre du corps y entre, et convertissent tout. La colonne « Seuil » se remplit quand la règle des % sera fixée (recommandation nº 1).</w:t>
+        <w:t xml:space="preserve">Une zone impose son état : déclenchement quand le CENTRE du corps y entre (≈ majorité du volume — le seuil en % est la recommandation nº 1), conversion du corps ENTIER aux vitesses ci-dessous, sélecteur verrouillé tant qu’on y est, et l’état persiste à la sortie jusqu’à un changement volontaire.</w:t>
+      </w:r>
+    </w:p>
+    <w:tbl>
+      <w:tblPr>
+        <w:tblW w:type="dxa" w:w="11200"/>
+        <w:tblBorders>
+          <w:top w:val="single" w:color="auto" w:sz="4"/>
+          <w:left w:val="single" w:color="auto" w:sz="4"/>
+          <w:bottom w:val="single" w:color="auto" w:sz="4"/>
+          <w:right w:val="single" w:color="auto" w:sz="4"/>
+          <w:insideH w:val="single" w:color="auto" w:sz="4"/>
+          <w:insideV w:val="single" w:color="auto" w:sz="4"/>
+        </w:tblBorders>
+      </w:tblPr>
+      <w:tblGrid>
+        <w:gridCol w:w="1400"/>
+        <w:gridCol w:w="3260"/>
+        <w:gridCol w:w="3260"/>
+        <w:gridCol w:w="3280"/>
+      </w:tblGrid>
+      <w:tr>
+        <w:tc>
+          <w:tcPr>
+            <w:tcW w:type="dxa" w:w="1400"/>
+            <w:shd w:fill="1F5C8B" w:val="clear"/>
+            <w:tcMar>
+              <w:top w:type="dxa" w:w="60"/>
+              <w:left w:type="dxa" w:w="100"/>
+              <w:bottom w:type="dxa" w:w="60"/>
+              <w:right w:type="dxa" w:w="100"/>
+            </w:tcMar>
+          </w:tcPr>
+          <w:p>
+            <w:pPr>
+              <w:spacing w:after="20"/>
+            </w:pPr>
+            <w:r>
+              <w:rPr>
+                <w:rFonts w:ascii="Calibri" w:cs="Calibri" w:eastAsia="Calibri" w:hAnsi="Calibri"/>
+                <w:b/>
+                <w:bCs/>
+                <w:color w:val="FFFFFF"/>
+                <w:sz w:val="19"/>
+                <w:szCs w:val="19"/>
+              </w:rPr>
+              <w:t xml:space="preserve">de \ vers</w:t>
+            </w:r>
+          </w:p>
+        </w:tc>
+        <w:tc>
+          <w:tcPr>
+            <w:tcW w:type="dxa" w:w="3260"/>
+            <w:shd w:fill="1F5C8B" w:val="clear"/>
+            <w:tcMar>
+              <w:top w:type="dxa" w:w="60"/>
+              <w:left w:type="dxa" w:w="100"/>
+              <w:bottom w:type="dxa" w:w="60"/>
+              <w:right w:type="dxa" w:w="100"/>
+            </w:tcMar>
+          </w:tcPr>
+          <w:p>
+            <w:pPr>
+              <w:spacing w:after="20"/>
+            </w:pPr>
+            <w:r>
+              <w:rPr>
+                <w:rFonts w:ascii="Calibri" w:cs="Calibri" w:eastAsia="Calibri" w:hAnsi="Calibri"/>
+                <w:b/>
+                <w:bCs/>
+                <w:color w:val="FFFFFF"/>
+                <w:sz w:val="19"/>
+                <w:szCs w:val="19"/>
+              </w:rPr>
+              <w:t xml:space="preserve">Zone forcée LIQUIDE</w:t>
+            </w:r>
+          </w:p>
+          <w:p>
+            <w:pPr>
+              <w:spacing w:after="20"/>
+            </w:pPr>
+            <w:r>
+              <w:rPr>
+                <w:rFonts w:ascii="Calibri" w:cs="Calibri" w:eastAsia="Calibri" w:hAnsi="Calibri"/>
+                <w:b w:val="false"/>
+                <w:bCs w:val="false"/>
+                <w:color w:val="FFFFFF"/>
+                <w:sz w:val="15"/>
+                <w:szCs w:val="15"/>
+              </w:rPr>
+              <w:t xml:space="preserve">asset : douche de décontamination (proposé — jeu actuel : « chambre pressurisée »)</w:t>
+            </w:r>
+          </w:p>
+        </w:tc>
+        <w:tc>
+          <w:tcPr>
+            <w:tcW w:type="dxa" w:w="3260"/>
+            <w:shd w:fill="1F5C8B" w:val="clear"/>
+            <w:tcMar>
+              <w:top w:type="dxa" w:w="60"/>
+              <w:left w:type="dxa" w:w="100"/>
+              <w:bottom w:type="dxa" w:w="60"/>
+              <w:right w:type="dxa" w:w="100"/>
+            </w:tcMar>
+          </w:tcPr>
+          <w:p>
+            <w:pPr>
+              <w:spacing w:after="20"/>
+            </w:pPr>
+            <w:r>
+              <w:rPr>
+                <w:rFonts w:ascii="Calibri" w:cs="Calibri" w:eastAsia="Calibri" w:hAnsi="Calibri"/>
+                <w:b/>
+                <w:bCs/>
+                <w:color w:val="FFFFFF"/>
+                <w:sz w:val="19"/>
+                <w:szCs w:val="19"/>
+              </w:rPr>
+              <w:t xml:space="preserve">Zone forcée SOLIDE</w:t>
+            </w:r>
+          </w:p>
+          <w:p>
+            <w:pPr>
+              <w:spacing w:after="20"/>
+            </w:pPr>
+            <w:r>
+              <w:rPr>
+                <w:rFonts w:ascii="Calibri" w:cs="Calibri" w:eastAsia="Calibri" w:hAnsi="Calibri"/>
+                <w:b w:val="false"/>
+                <w:bCs w:val="false"/>
+                <w:color w:val="FFFFFF"/>
+                <w:sz w:val="15"/>
+                <w:szCs w:val="15"/>
+              </w:rPr>
+              <w:t xml:space="preserve">asset : hublot brisé (déjà dans le jeu : « hublot fendu »)</w:t>
+            </w:r>
+          </w:p>
+        </w:tc>
+        <w:tc>
+          <w:tcPr>
+            <w:tcW w:type="dxa" w:w="3280"/>
+            <w:shd w:fill="1F5C8B" w:val="clear"/>
+            <w:tcMar>
+              <w:top w:type="dxa" w:w="60"/>
+              <w:left w:type="dxa" w:w="100"/>
+              <w:bottom w:type="dxa" w:w="60"/>
+              <w:right w:type="dxa" w:w="100"/>
+            </w:tcMar>
+          </w:tcPr>
+          <w:p>
+            <w:pPr>
+              <w:spacing w:after="20"/>
+            </w:pPr>
+            <w:r>
+              <w:rPr>
+                <w:rFonts w:ascii="Calibri" w:cs="Calibri" w:eastAsia="Calibri" w:hAnsi="Calibri"/>
+                <w:b/>
+                <w:bCs/>
+                <w:color w:val="FFFFFF"/>
+                <w:sz w:val="19"/>
+                <w:szCs w:val="19"/>
+              </w:rPr>
+              <w:t xml:space="preserve">Zone forcée GAZ</w:t>
+            </w:r>
+          </w:p>
+          <w:p>
+            <w:pPr>
+              <w:spacing w:after="20"/>
+            </w:pPr>
+            <w:r>
+              <w:rPr>
+                <w:rFonts w:ascii="Calibri" w:cs="Calibri" w:eastAsia="Calibri" w:hAnsi="Calibri"/>
+                <w:b w:val="false"/>
+                <w:bCs w:val="false"/>
+                <w:color w:val="FFFFFF"/>
+                <w:sz w:val="15"/>
+                <w:szCs w:val="15"/>
+              </w:rPr>
+              <w:t xml:space="preserve">asset : radiateur (proposé — jeu actuel : « conduite rompue »)</w:t>
+            </w:r>
+          </w:p>
+        </w:tc>
+      </w:tr>
+      <w:tr>
+        <w:tc>
+          <w:tcPr>
+            <w:tcW w:type="dxa" w:w="1400"/>
+            <w:shd w:fill="1F5C8B" w:val="clear"/>
+            <w:tcMar>
+              <w:top w:type="dxa" w:w="60"/>
+              <w:left w:type="dxa" w:w="100"/>
+              <w:bottom w:type="dxa" w:w="60"/>
+              <w:right w:type="dxa" w:w="100"/>
+            </w:tcMar>
+          </w:tcPr>
+          <w:p>
+            <w:pPr>
+              <w:spacing w:after="20"/>
+            </w:pPr>
+            <w:r>
+              <w:rPr>
+                <w:rFonts w:ascii="Calibri" w:cs="Calibri" w:eastAsia="Calibri" w:hAnsi="Calibri"/>
+                <w:b/>
+                <w:bCs/>
+                <w:color w:val="FFFFFF"/>
+                <w:sz w:val="19"/>
+                <w:szCs w:val="19"/>
+              </w:rPr>
+              <w:t xml:space="preserve">LIQUIDE</w:t>
+            </w:r>
+          </w:p>
+        </w:tc>
+        <w:tc>
+          <w:tcPr>
+            <w:tcW w:type="dxa" w:w="3260"/>
+            <w:tcMar>
+              <w:top w:type="dxa" w:w="60"/>
+              <w:left w:type="dxa" w:w="100"/>
+              <w:bottom w:type="dxa" w:w="60"/>
+              <w:right w:type="dxa" w:w="100"/>
+            </w:tcMar>
+          </w:tcPr>
+          <w:p>
+            <w:pPr>
+              <w:spacing w:after="80"/>
+              <w:jc w:val="center"/>
+            </w:pPr>
+            <w:r>
+              <w:rPr>
+                <w:rFonts w:ascii="Calibri" w:cs="Calibri" w:eastAsia="Calibri" w:hAnsi="Calibri"/>
+                <w:color w:val="5A6672"/>
+                <w:sz w:val="28"/>
+                <w:szCs w:val="28"/>
+              </w:rPr>
+              <w:t xml:space="preserve">⟍</w:t>
+            </w:r>
+          </w:p>
+        </w:tc>
+        <w:tc>
+          <w:tcPr>
+            <w:tcW w:type="dxa" w:w="3260"/>
+            <w:tcMar>
+              <w:top w:type="dxa" w:w="60"/>
+              <w:left w:type="dxa" w:w="100"/>
+              <w:bottom w:type="dxa" w:w="60"/>
+              <w:right w:type="dxa" w:w="100"/>
+            </w:tcMar>
+          </w:tcPr>
+          <w:p>
+            <w:pPr>
+              <w:spacing w:after="30"/>
+            </w:pPr>
+            <w:r>
+              <w:rPr>
+                <w:rFonts w:ascii="Calibri" w:cs="Calibri" w:eastAsia="Calibri" w:hAnsi="Calibri"/>
+                <w:sz w:val="20"/>
+                <w:szCs w:val="20"/>
+              </w:rPr>
+              <w:t xml:space="preserve">① Coût : aucun.</w:t>
+            </w:r>
+          </w:p>
+          <w:p>
+            <w:pPr>
+              <w:spacing w:after="40"/>
+            </w:pPr>
+            <w:r>
+              <w:rPr>
+                <w:rFonts w:ascii="Calibri" w:cs="Calibri" w:eastAsia="Calibri" w:hAnsi="Calibri"/>
+                <w:sz w:val="20"/>
+                <w:szCs w:val="20"/>
+              </w:rPr>
+              <w:t xml:space="preserve">② Quand : le CENTRE du corps entre dans la zone (seuil 70 % du volume : recommandé, à implémenter). Prise en 0,45 s, tout le corps. État verrouillé tant qu’on est dedans ; il PERSISTE à la sortie, jusqu’à un changement volontaire.</w:t>
+            </w:r>
+          </w:p>
+        </w:tc>
+        <w:tc>
+          <w:tcPr>
+            <w:tcW w:type="dxa" w:w="3280"/>
+            <w:tcMar>
+              <w:top w:type="dxa" w:w="60"/>
+              <w:left w:type="dxa" w:w="100"/>
+              <w:bottom w:type="dxa" w:w="60"/>
+              <w:right w:type="dxa" w:w="100"/>
+            </w:tcMar>
+          </w:tcPr>
+          <w:p>
+            <w:pPr>
+              <w:spacing w:after="30"/>
+            </w:pPr>
+            <w:r>
+              <w:rPr>
+                <w:rFonts w:ascii="Calibri" w:cs="Calibri" w:eastAsia="Calibri" w:hAnsi="Calibri"/>
+                <w:sz w:val="20"/>
+                <w:szCs w:val="20"/>
+              </w:rPr>
+              <w:t xml:space="preserve">① Coût : la conversion est gratuite ; l’ÉTAT gazeux se paie ensuite (−2 part./s, grille qui essore, dashs comptés).</w:t>
+            </w:r>
+          </w:p>
+          <w:p>
+            <w:pPr>
+              <w:spacing w:after="40"/>
+            </w:pPr>
+            <w:r>
+              <w:rPr>
+                <w:rFonts w:ascii="Calibri" w:cs="Calibri" w:eastAsia="Calibri" w:hAnsi="Calibri"/>
+                <w:sz w:val="20"/>
+                <w:szCs w:val="20"/>
+              </w:rPr>
+              <w:t xml:space="preserve">② Quand : centre du corps dans la zone. Vaporisation 0,5 s, corps entier. Verrouillé dedans, persiste à la sortie.</w:t>
+            </w:r>
+          </w:p>
+        </w:tc>
+      </w:tr>
+      <w:tr>
+        <w:tc>
+          <w:tcPr>
+            <w:tcW w:type="dxa" w:w="1400"/>
+            <w:shd w:fill="1F5C8B" w:val="clear"/>
+            <w:tcMar>
+              <w:top w:type="dxa" w:w="60"/>
+              <w:left w:type="dxa" w:w="100"/>
+              <w:bottom w:type="dxa" w:w="60"/>
+              <w:right w:type="dxa" w:w="100"/>
+            </w:tcMar>
+          </w:tcPr>
+          <w:p>
+            <w:pPr>
+              <w:spacing w:after="20"/>
+            </w:pPr>
+            <w:r>
+              <w:rPr>
+                <w:rFonts w:ascii="Calibri" w:cs="Calibri" w:eastAsia="Calibri" w:hAnsi="Calibri"/>
+                <w:b/>
+                <w:bCs/>
+                <w:color w:val="FFFFFF"/>
+                <w:sz w:val="19"/>
+                <w:szCs w:val="19"/>
+              </w:rPr>
+              <w:t xml:space="preserve">SOLIDE</w:t>
+            </w:r>
+          </w:p>
+        </w:tc>
+        <w:tc>
+          <w:tcPr>
+            <w:tcW w:type="dxa" w:w="3260"/>
+            <w:tcMar>
+              <w:top w:type="dxa" w:w="60"/>
+              <w:left w:type="dxa" w:w="100"/>
+              <w:bottom w:type="dxa" w:w="60"/>
+              <w:right w:type="dxa" w:w="100"/>
+            </w:tcMar>
+          </w:tcPr>
+          <w:p>
+            <w:pPr>
+              <w:spacing w:after="30"/>
+            </w:pPr>
+            <w:r>
+              <w:rPr>
+                <w:rFonts w:ascii="Calibri" w:cs="Calibri" w:eastAsia="Calibri" w:hAnsi="Calibri"/>
+                <w:sz w:val="20"/>
+                <w:szCs w:val="20"/>
+              </w:rPr>
+              <w:t xml:space="preserve">① Coût : aucun.</w:t>
+            </w:r>
+          </w:p>
+          <w:p>
+            <w:pPr>
+              <w:spacing w:after="40"/>
+            </w:pPr>
+            <w:r>
+              <w:rPr>
+                <w:rFonts w:ascii="Calibri" w:cs="Calibri" w:eastAsia="Calibri" w:hAnsi="Calibri"/>
+                <w:sz w:val="20"/>
+                <w:szCs w:val="20"/>
+              </w:rPr>
+              <w:t xml:space="preserve">② Quand : centre du corps dans la zone. Dégel 2,5 s (le bloc fond sur son élan), corps entier. Verrouillé dedans, persiste à la sortie.</w:t>
+            </w:r>
+          </w:p>
+        </w:tc>
+        <w:tc>
+          <w:tcPr>
+            <w:tcW w:type="dxa" w:w="3260"/>
+            <w:tcMar>
+              <w:top w:type="dxa" w:w="60"/>
+              <w:left w:type="dxa" w:w="100"/>
+              <w:bottom w:type="dxa" w:w="60"/>
+              <w:right w:type="dxa" w:w="100"/>
+            </w:tcMar>
+          </w:tcPr>
+          <w:p>
+            <w:pPr>
+              <w:spacing w:after="80"/>
+              <w:jc w:val="center"/>
+            </w:pPr>
+            <w:r>
+              <w:rPr>
+                <w:rFonts w:ascii="Calibri" w:cs="Calibri" w:eastAsia="Calibri" w:hAnsi="Calibri"/>
+                <w:color w:val="5A6672"/>
+                <w:sz w:val="28"/>
+                <w:szCs w:val="28"/>
+              </w:rPr>
+              <w:t xml:space="preserve">⟍</w:t>
+            </w:r>
+          </w:p>
+        </w:tc>
+        <w:tc>
+          <w:tcPr>
+            <w:tcW w:type="dxa" w:w="3280"/>
+            <w:tcMar>
+              <w:top w:type="dxa" w:w="60"/>
+              <w:left w:type="dxa" w:w="100"/>
+              <w:bottom w:type="dxa" w:w="60"/>
+              <w:right w:type="dxa" w:w="100"/>
+            </w:tcMar>
+          </w:tcPr>
+          <w:p>
+            <w:pPr>
+              <w:spacing w:after="30"/>
+            </w:pPr>
+            <w:r>
+              <w:rPr>
+                <w:rFonts w:ascii="Calibri" w:cs="Calibri" w:eastAsia="Calibri" w:hAnsi="Calibri"/>
+                <w:sz w:val="20"/>
+                <w:szCs w:val="20"/>
+              </w:rPr>
+              <w:t xml:space="preserve">① Coût : gratuit à la conversion ; l’état gazeux se paie ensuite.</w:t>
+            </w:r>
+          </w:p>
+          <w:p>
+            <w:pPr>
+              <w:spacing w:after="40"/>
+            </w:pPr>
+            <w:r>
+              <w:rPr>
+                <w:rFonts w:ascii="Calibri" w:cs="Calibri" w:eastAsia="Calibri" w:hAnsi="Calibri"/>
+                <w:sz w:val="20"/>
+                <w:szCs w:val="20"/>
+              </w:rPr>
+              <w:t xml:space="preserve">② Quand : centre du corps dans la zone. Pas de sublimation directe : dégel 2,5 s PUIS vaporisation 0,5 s (enchaînés automatiquement par la zone).</w:t>
+            </w:r>
+          </w:p>
+        </w:tc>
+      </w:tr>
+      <w:tr>
+        <w:tc>
+          <w:tcPr>
+            <w:tcW w:type="dxa" w:w="1400"/>
+            <w:shd w:fill="1F5C8B" w:val="clear"/>
+            <w:tcMar>
+              <w:top w:type="dxa" w:w="60"/>
+              <w:left w:type="dxa" w:w="100"/>
+              <w:bottom w:type="dxa" w:w="60"/>
+              <w:right w:type="dxa" w:w="100"/>
+            </w:tcMar>
+          </w:tcPr>
+          <w:p>
+            <w:pPr>
+              <w:spacing w:after="20"/>
+            </w:pPr>
+            <w:r>
+              <w:rPr>
+                <w:rFonts w:ascii="Calibri" w:cs="Calibri" w:eastAsia="Calibri" w:hAnsi="Calibri"/>
+                <w:b/>
+                <w:bCs/>
+                <w:color w:val="FFFFFF"/>
+                <w:sz w:val="19"/>
+                <w:szCs w:val="19"/>
+              </w:rPr>
+              <w:t xml:space="preserve">GAZEUX</w:t>
+            </w:r>
+          </w:p>
+        </w:tc>
+        <w:tc>
+          <w:tcPr>
+            <w:tcW w:type="dxa" w:w="3260"/>
+            <w:tcMar>
+              <w:top w:type="dxa" w:w="60"/>
+              <w:left w:type="dxa" w:w="100"/>
+              <w:bottom w:type="dxa" w:w="60"/>
+              <w:right w:type="dxa" w:w="100"/>
+            </w:tcMar>
+          </w:tcPr>
+          <w:p>
+            <w:pPr>
+              <w:spacing w:after="30"/>
+            </w:pPr>
+            <w:r>
+              <w:rPr>
+                <w:rFonts w:ascii="Calibri" w:cs="Calibri" w:eastAsia="Calibri" w:hAnsi="Calibri"/>
+                <w:sz w:val="20"/>
+                <w:szCs w:val="20"/>
+              </w:rPr>
+              <w:t xml:space="preserve">① Coût : aucun (les pertes ont déjà eu lieu pendant l’état vapeur).</w:t>
+            </w:r>
+          </w:p>
+          <w:p>
+            <w:pPr>
+              <w:spacing w:after="40"/>
+            </w:pPr>
+            <w:r>
+              <w:rPr>
+                <w:rFonts w:ascii="Calibri" w:cs="Calibri" w:eastAsia="Calibri" w:hAnsi="Calibri"/>
+                <w:sz w:val="20"/>
+                <w:szCs w:val="20"/>
+              </w:rPr>
+              <w:t xml:space="preserve">② Quand : centre du corps dans la zone. Condensation 0,9 s + regroupement (les gouttelettes sont rappelées vers le corps, 420 u/s²).</w:t>
+            </w:r>
+          </w:p>
+        </w:tc>
+        <w:tc>
+          <w:tcPr>
+            <w:tcW w:type="dxa" w:w="3260"/>
+            <w:tcMar>
+              <w:top w:type="dxa" w:w="60"/>
+              <w:left w:type="dxa" w:w="100"/>
+              <w:bottom w:type="dxa" w:w="60"/>
+              <w:right w:type="dxa" w:w="100"/>
+            </w:tcMar>
+          </w:tcPr>
+          <w:p>
+            <w:pPr>
+              <w:spacing w:after="30"/>
+            </w:pPr>
+            <w:r>
+              <w:rPr>
+                <w:rFonts w:ascii="Calibri" w:cs="Calibri" w:eastAsia="Calibri" w:hAnsi="Calibri"/>
+                <w:sz w:val="20"/>
+                <w:szCs w:val="20"/>
+              </w:rPr>
+              <w:t xml:space="preserve">① Coût : aucun.</w:t>
+            </w:r>
+          </w:p>
+          <w:p>
+            <w:pPr>
+              <w:spacing w:after="40"/>
+            </w:pPr>
+            <w:r>
+              <w:rPr>
+                <w:rFonts w:ascii="Calibri" w:cs="Calibri" w:eastAsia="Calibri" w:hAnsi="Calibri"/>
+                <w:sz w:val="20"/>
+                <w:szCs w:val="20"/>
+              </w:rPr>
+              <w:t xml:space="preserve">② Quand : centre du corps dans la zone. Pas de direct : condensation 0,9 s PUIS prise 0,45 s (enchaînées par la zone).</w:t>
+            </w:r>
+          </w:p>
+        </w:tc>
+        <w:tc>
+          <w:tcPr>
+            <w:tcW w:type="dxa" w:w="3280"/>
+            <w:tcMar>
+              <w:top w:type="dxa" w:w="60"/>
+              <w:left w:type="dxa" w:w="100"/>
+              <w:bottom w:type="dxa" w:w="60"/>
+              <w:right w:type="dxa" w:w="100"/>
+            </w:tcMar>
+          </w:tcPr>
+          <w:p>
+            <w:pPr>
+              <w:spacing w:after="80"/>
+              <w:jc w:val="center"/>
+            </w:pPr>
+            <w:r>
+              <w:rPr>
+                <w:rFonts w:ascii="Calibri" w:cs="Calibri" w:eastAsia="Calibri" w:hAnsi="Calibri"/>
+                <w:color w:val="5A6672"/>
+                <w:sz w:val="28"/>
+                <w:szCs w:val="28"/>
+              </w:rPr>
+              <w:t xml:space="preserve">⟍</w:t>
+            </w:r>
+          </w:p>
+        </w:tc>
+      </w:tr>
+    </w:tbl>
+    <w:p>
+      <w:pPr>
+        <w:pStyle w:val="Heading1"/>
+      </w:pPr>
+      <w:r>
+        <w:rPr>
+          <w:rFonts w:ascii="Calibri" w:cs="Calibri" w:eastAsia="Calibri" w:hAnsi="Calibri"/>
+          <w:b/>
+          <w:bCs/>
+          <w:color w:val="1F5C8B"/>
+          <w:sz w:val="26"/>
+          <w:szCs w:val="26"/>
+        </w:rPr>
+        <w:t xml:space="preserve">2. Transformations par BLOCS (matériaux à aura)</w:t>
+      </w:r>
+    </w:p>
+    <w:p>
+      <w:pPr>
+        <w:spacing w:after="80"/>
+      </w:pPr>
+      <w:r>
+        <w:rPr>
+          <w:rFonts w:ascii="Calibri" w:cs="Calibri" w:eastAsia="Calibri" w:hAnsi="Calibri"/>
+          <w:color w:val="5A6672"/>
+          <w:sz w:val="18"/>
+          <w:szCs w:val="18"/>
+        </w:rPr>
+        <w:t xml:space="preserve">Les blocs n’imposent rien au corps entier : leur aura travaille PARTICULE PAR PARTICULE — on peut n’être que partiellement gelé ou vaporisé, et la traversée rapide limite l’effet.</w:t>
       </w:r>
     </w:p>
     <w:tbl>
@@ -79,9 +680,9 @@
       <w:tblGrid>
         <w:gridCol w:w="1750"/>
         <w:gridCol w:w="1150"/>
-        <w:gridCol w:w="3300"/>
-        <w:gridCol w:w="2650"/>
-        <w:gridCol w:w="2350"/>
+        <w:gridCol w:w="3600"/>
+        <w:gridCol w:w="2500"/>
+        <w:gridCol w:w="2200"/>
       </w:tblGrid>
       <w:tr>
         <w:tc>
@@ -97,7 +698,7 @@
           </w:tcPr>
           <w:p>
             <w:pPr>
-              <w:spacing w:after="80"/>
+              <w:spacing w:after="20"/>
             </w:pPr>
             <w:r>
               <w:rPr>
@@ -108,7 +709,7 @@
                 <w:sz w:val="19"/>
                 <w:szCs w:val="19"/>
               </w:rPr>
-              <w:t xml:space="preserve">Cause</w:t>
+              <w:t xml:space="preserve">Bloc</w:t>
             </w:r>
           </w:p>
         </w:tc>
@@ -125,7 +726,7 @@
           </w:tcPr>
           <w:p>
             <w:pPr>
-              <w:spacing w:after="80"/>
+              <w:spacing w:after="20"/>
             </w:pPr>
             <w:r>
               <w:rPr>
@@ -142,7 +743,7 @@
         </w:tc>
         <w:tc>
           <w:tcPr>
-            <w:tcW w:type="dxa" w:w="3300"/>
+            <w:tcW w:type="dxa" w:w="3600"/>
             <w:shd w:fill="1F5C8B" w:val="clear"/>
             <w:tcMar>
               <w:top w:type="dxa" w:w="60"/>
@@ -153,7 +754,7 @@
           </w:tcPr>
           <w:p>
             <w:pPr>
-              <w:spacing w:after="80"/>
+              <w:spacing w:after="20"/>
             </w:pPr>
             <w:r>
               <w:rPr>
@@ -164,13 +765,13 @@
                 <w:sz w:val="19"/>
                 <w:szCs w:val="19"/>
               </w:rPr>
-              <w:t xml:space="preserve">Déclencheur (règle actuelle)</w:t>
-            </w:r>
-          </w:p>
-        </w:tc>
-        <w:tc>
-          <w:tcPr>
-            <w:tcW w:type="dxa" w:w="2650"/>
+              <w:t xml:space="preserve">Règle actuelle</w:t>
+            </w:r>
+          </w:p>
+        </w:tc>
+        <w:tc>
+          <w:tcPr>
+            <w:tcW w:type="dxa" w:w="2500"/>
             <w:shd w:fill="1F5C8B" w:val="clear"/>
             <w:tcMar>
               <w:top w:type="dxa" w:w="60"/>
@@ -181,7 +782,7 @@
           </w:tcPr>
           <w:p>
             <w:pPr>
-              <w:spacing w:after="80"/>
+              <w:spacing w:after="20"/>
             </w:pPr>
             <w:r>
               <w:rPr>
@@ -192,13 +793,13 @@
                 <w:sz w:val="19"/>
                 <w:szCs w:val="19"/>
               </w:rPr>
-              <w:t xml:space="preserve">Vitesse actuelle</w:t>
-            </w:r>
-          </w:p>
-        </w:tc>
-        <w:tc>
-          <w:tcPr>
-            <w:tcW w:type="dxa" w:w="2350"/>
+              <w:t xml:space="preserve">Vitesse</w:t>
+            </w:r>
+          </w:p>
+        </w:tc>
+        <w:tc>
+          <w:tcPr>
+            <w:tcW w:type="dxa" w:w="2200"/>
             <w:shd w:fill="1F5C8B" w:val="clear"/>
             <w:tcMar>
               <w:top w:type="dxa" w:w="60"/>
@@ -209,7 +810,7 @@
           </w:tcPr>
           <w:p>
             <w:pPr>
-              <w:spacing w:after="80"/>
+              <w:spacing w:after="20"/>
             </w:pPr>
             <w:r>
               <w:rPr>
@@ -220,7 +821,7 @@
                 <w:sz w:val="19"/>
                 <w:szCs w:val="19"/>
               </w:rPr>
-              <w:t xml:space="preserve">Seuil (à définir)</w:t>
+              <w:t xml:space="preserve">Seuil</w:t>
             </w:r>
           </w:p>
         </w:tc>
@@ -229,6 +830,254 @@
         <w:tc>
           <w:tcPr>
             <w:tcW w:type="dxa" w:w="1750"/>
+            <w:tcMar>
+              <w:top w:type="dxa" w:w="60"/>
+              <w:left w:type="dxa" w:w="100"/>
+              <w:bottom w:type="dxa" w:w="60"/>
+              <w:right w:type="dxa" w:w="100"/>
+            </w:tcMar>
+          </w:tcPr>
+          <w:p>
+            <w:pPr>
+              <w:spacing w:after="40"/>
+            </w:pPr>
+            <w:r>
+              <w:rPr>
+                <w:rFonts w:ascii="Calibri" w:cs="Calibri" w:eastAsia="Calibri" w:hAnsi="Calibri"/>
+                <w:b/>
+                <w:bCs/>
+                <w:sz w:val="20"/>
+                <w:szCs w:val="20"/>
+              </w:rPr>
+              <w:t xml:space="preserve">Hublot / plaque froide</w:t>
+            </w:r>
+          </w:p>
+        </w:tc>
+        <w:tc>
+          <w:tcPr>
+            <w:tcW w:type="dxa" w:w="1150"/>
+            <w:tcMar>
+              <w:top w:type="dxa" w:w="60"/>
+              <w:left w:type="dxa" w:w="100"/>
+              <w:bottom w:type="dxa" w:w="60"/>
+              <w:right w:type="dxa" w:w="100"/>
+            </w:tcMar>
+          </w:tcPr>
+          <w:p>
+            <w:pPr>
+              <w:spacing w:after="40"/>
+            </w:pPr>
+            <w:r>
+              <w:rPr>
+                <w:rFonts w:ascii="Calibri" w:cs="Calibri" w:eastAsia="Calibri" w:hAnsi="Calibri"/>
+                <w:sz w:val="20"/>
+                <w:szCs w:val="20"/>
+              </w:rPr>
+              <w:t xml:space="preserve">SOLIDE</w:t>
+            </w:r>
+          </w:p>
+        </w:tc>
+        <w:tc>
+          <w:tcPr>
+            <w:tcW w:type="dxa" w:w="3600"/>
+            <w:tcMar>
+              <w:top w:type="dxa" w:w="60"/>
+              <w:left w:type="dxa" w:w="100"/>
+              <w:bottom w:type="dxa" w:w="60"/>
+              <w:right w:type="dxa" w:w="100"/>
+            </w:tcMar>
+          </w:tcPr>
+          <w:p>
+            <w:pPr>
+              <w:spacing w:after="40"/>
+            </w:pPr>
+            <w:r>
+              <w:rPr>
+                <w:rFonts w:ascii="Calibri" w:cs="Calibri" w:eastAsia="Calibri" w:hAnsi="Calibri"/>
+                <w:sz w:val="20"/>
+                <w:szCs w:val="20"/>
+              </w:rPr>
+              <w:t xml:space="preserve">Aura de gel, PAR PARTICULE : chaque goutte exposée givre (traînée) puis gèle — le corps peut être partiellement gelé. La glace qui touche la plaque est SOUDÉE net. La vapeur y condense vite, et la vapeur perdue ailleurs y perle en rosée récupérable.</w:t>
+            </w:r>
+          </w:p>
+        </w:tc>
+        <w:tc>
+          <w:tcPr>
+            <w:tcW w:type="dxa" w:w="2500"/>
+            <w:tcMar>
+              <w:top w:type="dxa" w:w="60"/>
+              <w:left w:type="dxa" w:w="100"/>
+              <w:bottom w:type="dxa" w:w="60"/>
+              <w:right w:type="dxa" w:w="100"/>
+            </w:tcMar>
+          </w:tcPr>
+          <w:p>
+            <w:pPr>
+              <w:spacing w:after="40"/>
+            </w:pPr>
+            <w:r>
+              <w:rPr>
+                <w:rFonts w:ascii="Calibri" w:cs="Calibri" w:eastAsia="Calibri" w:hAnsi="Calibri"/>
+                <w:sz w:val="20"/>
+                <w:szCs w:val="20"/>
+              </w:rPr>
+              <w:t xml:space="preserve">1,2 s à plein bain (freezeTime) ; givre : traînée 3/s (frostSluggish)</w:t>
+            </w:r>
+          </w:p>
+        </w:tc>
+        <w:tc>
+          <w:tcPr>
+            <w:tcW w:type="dxa" w:w="2200"/>
+            <w:tcMar>
+              <w:top w:type="dxa" w:w="60"/>
+              <w:left w:type="dxa" w:w="100"/>
+              <w:bottom w:type="dxa" w:w="60"/>
+              <w:right w:type="dxa" w:w="100"/>
+            </w:tcMar>
+          </w:tcPr>
+          <w:p>
+            <w:pPr>
+              <w:spacing w:after="40"/>
+            </w:pPr>
+            <w:r>
+              <w:rPr>
+                <w:rFonts w:ascii="Calibri" w:cs="Calibri" w:eastAsia="Calibri" w:hAnsi="Calibri"/>
+                <w:sz w:val="20"/>
+                <w:szCs w:val="20"/>
+              </w:rPr>
+              <w:t xml:space="preserve">aucun : par particule</w:t>
+            </w:r>
+          </w:p>
+        </w:tc>
+      </w:tr>
+      <w:tr>
+        <w:tc>
+          <w:tcPr>
+            <w:tcW w:type="dxa" w:w="1750"/>
+            <w:tcMar>
+              <w:top w:type="dxa" w:w="60"/>
+              <w:left w:type="dxa" w:w="100"/>
+              <w:bottom w:type="dxa" w:w="60"/>
+              <w:right w:type="dxa" w:w="100"/>
+            </w:tcMar>
+          </w:tcPr>
+          <w:p>
+            <w:pPr>
+              <w:spacing w:after="40"/>
+            </w:pPr>
+            <w:r>
+              <w:rPr>
+                <w:rFonts w:ascii="Calibri" w:cs="Calibri" w:eastAsia="Calibri" w:hAnsi="Calibri"/>
+                <w:b/>
+                <w:bCs/>
+                <w:sz w:val="20"/>
+                <w:szCs w:val="20"/>
+              </w:rPr>
+              <w:t xml:space="preserve">Radiateur</w:t>
+            </w:r>
+          </w:p>
+        </w:tc>
+        <w:tc>
+          <w:tcPr>
+            <w:tcW w:type="dxa" w:w="1150"/>
+            <w:tcMar>
+              <w:top w:type="dxa" w:w="60"/>
+              <w:left w:type="dxa" w:w="100"/>
+              <w:bottom w:type="dxa" w:w="60"/>
+              <w:right w:type="dxa" w:w="100"/>
+            </w:tcMar>
+          </w:tcPr>
+          <w:p>
+            <w:pPr>
+              <w:spacing w:after="40"/>
+            </w:pPr>
+            <w:r>
+              <w:rPr>
+                <w:rFonts w:ascii="Calibri" w:cs="Calibri" w:eastAsia="Calibri" w:hAnsi="Calibri"/>
+                <w:sz w:val="20"/>
+                <w:szCs w:val="20"/>
+              </w:rPr>
+              <w:t xml:space="preserve">GAZEUX</w:t>
+            </w:r>
+          </w:p>
+        </w:tc>
+        <w:tc>
+          <w:tcPr>
+            <w:tcW w:type="dxa" w:w="3600"/>
+            <w:tcMar>
+              <w:top w:type="dxa" w:w="60"/>
+              <w:left w:type="dxa" w:w="100"/>
+              <w:bottom w:type="dxa" w:w="60"/>
+              <w:right w:type="dxa" w:w="100"/>
+            </w:tcMar>
+          </w:tcPr>
+          <w:p>
+            <w:pPr>
+              <w:spacing w:after="40"/>
+            </w:pPr>
+            <w:r>
+              <w:rPr>
+                <w:rFonts w:ascii="Calibri" w:cs="Calibri" w:eastAsia="Calibri" w:hAnsi="Calibri"/>
+                <w:sz w:val="20"/>
+                <w:szCs w:val="20"/>
+              </w:rPr>
+              <w:t xml:space="preserve">Aura de chaleur, PAR PARTICULE : l’eau frémit puis se vaporise, qu’on le veuille ou non. Dégèle la glace (libère un bloc soudé). La vapeur qui FRÔLE le halo recharge un dash (+1 impulsion offerte). La vapeur qui s’attarde s’évapore (perdue).</w:t>
+            </w:r>
+          </w:p>
+        </w:tc>
+        <w:tc>
+          <w:tcPr>
+            <w:tcW w:type="dxa" w:w="2500"/>
+            <w:tcMar>
+              <w:top w:type="dxa" w:w="60"/>
+              <w:left w:type="dxa" w:w="100"/>
+              <w:bottom w:type="dxa" w:w="60"/>
+              <w:right w:type="dxa" w:w="100"/>
+            </w:tcMar>
+          </w:tcPr>
+          <w:p>
+            <w:pPr>
+              <w:spacing w:after="40"/>
+            </w:pPr>
+            <w:r>
+              <w:rPr>
+                <w:rFonts w:ascii="Calibri" w:cs="Calibri" w:eastAsia="Calibri" w:hAnsi="Calibri"/>
+                <w:sz w:val="20"/>
+                <w:szCs w:val="20"/>
+              </w:rPr>
+              <w:t xml:space="preserve">1,2 s à plein bain (boilTime) ; dégel forcé 0,35 s (heatThawTime)</w:t>
+            </w:r>
+          </w:p>
+        </w:tc>
+        <w:tc>
+          <w:tcPr>
+            <w:tcW w:type="dxa" w:w="2200"/>
+            <w:tcMar>
+              <w:top w:type="dxa" w:w="60"/>
+              <w:left w:type="dxa" w:w="100"/>
+              <w:bottom w:type="dxa" w:w="60"/>
+              <w:right w:type="dxa" w:w="100"/>
+            </w:tcMar>
+          </w:tcPr>
+          <w:p>
+            <w:pPr>
+              <w:spacing w:after="40"/>
+            </w:pPr>
+            <w:r>
+              <w:rPr>
+                <w:rFonts w:ascii="Calibri" w:cs="Calibri" w:eastAsia="Calibri" w:hAnsi="Calibri"/>
+                <w:sz w:val="20"/>
+                <w:szCs w:val="20"/>
+              </w:rPr>
+              <w:t xml:space="preserve">aucun : par particule</w:t>
+            </w:r>
+          </w:p>
+        </w:tc>
+      </w:tr>
+      <w:tr>
+        <w:tc>
+          <w:tcPr>
+            <w:tcW w:type="dxa" w:w="1750"/>
             <w:shd w:fill="FFF3D6" w:val="clear"/>
             <w:tcMar>
               <w:top w:type="dxa" w:w="60"/>
@@ -239,7 +1088,7 @@
           </w:tcPr>
           <w:p>
             <w:pPr>
-              <w:spacing w:after="20"/>
+              <w:spacing w:after="30"/>
             </w:pPr>
             <w:r>
               <w:rPr>
@@ -265,7 +1114,7 @@
                 <w:sz w:val="17"/>
                 <w:szCs w:val="17"/>
               </w:rPr>
-              <w:t xml:space="preserve">n’existe pas encore</w:t>
+              <w:t xml:space="preserve">n’existe pas encore — proposition</w:t>
             </w:r>
           </w:p>
         </w:tc>
@@ -296,7 +1145,7 @@
         </w:tc>
         <w:tc>
           <w:tcPr>
-            <w:tcW w:type="dxa" w:w="3300"/>
+            <w:tcW w:type="dxa" w:w="3600"/>
             <w:shd w:fill="FFF3D6" w:val="clear"/>
             <w:tcMar>
               <w:top w:type="dxa" w:w="60"/>
@@ -315,13 +1164,13 @@
                 <w:sz w:val="20"/>
                 <w:szCs w:val="20"/>
               </w:rPr>
-              <w:t xml:space="preserve">Proposition : jet vertical qui recondense tout ce qui le traverse. Équivalents actuels : zone EAU (« chambre pressurisée ») ; le radiateur dégèle la glace.</w:t>
-            </w:r>
-          </w:p>
-        </w:tc>
-        <w:tc>
-          <w:tcPr>
-            <w:tcW w:type="dxa" w:w="2650"/>
+              <w:t xml:space="preserve">Proposition : une buse qui arrose vers le bas ; tout ce qui traverse le jet redevient EAU (glace dégelée, vapeur condensée). Le « reset d’état » posé par le level designer — l’inverse exact du radiateur, comme la membrane est l’inverse de la grille.</w:t>
+            </w:r>
+          </w:p>
+        </w:tc>
+        <w:tc>
+          <w:tcPr>
+            <w:tcW w:type="dxa" w:w="2500"/>
             <w:shd w:fill="FFF3D6" w:val="clear"/>
             <w:tcMar>
               <w:top w:type="dxa" w:w="60"/>
@@ -340,13 +1189,13 @@
                 <w:sz w:val="20"/>
                 <w:szCs w:val="20"/>
               </w:rPr>
-              <w:t xml:space="preserve">—</w:t>
-            </w:r>
-          </w:p>
-        </w:tc>
-        <w:tc>
-          <w:tcPr>
-            <w:tcW w:type="dxa" w:w="2350"/>
+              <w:t xml:space="preserve">à définir (suggestion : 0,5 s dans le jet)</w:t>
+            </w:r>
+          </w:p>
+        </w:tc>
+        <w:tc>
+          <w:tcPr>
+            <w:tcW w:type="dxa" w:w="2200"/>
             <w:shd w:fill="FFF3D6" w:val="clear"/>
             <w:tcMar>
               <w:top w:type="dxa" w:w="60"/>
@@ -366,706 +1215,6 @@
                 <w:szCs w:val="20"/>
               </w:rPr>
               <w:t xml:space="preserve">70 % du volume sous le jet (proposé)</w:t>
-            </w:r>
-          </w:p>
-        </w:tc>
-      </w:tr>
-      <w:tr>
-        <w:tc>
-          <w:tcPr>
-            <w:tcW w:type="dxa" w:w="1750"/>
-            <w:tcMar>
-              <w:top w:type="dxa" w:w="60"/>
-              <w:left w:type="dxa" w:w="100"/>
-              <w:bottom w:type="dxa" w:w="60"/>
-              <w:right w:type="dxa" w:w="100"/>
-            </w:tcMar>
-          </w:tcPr>
-          <w:p>
-            <w:pPr>
-              <w:spacing w:after="20"/>
-            </w:pPr>
-            <w:r>
-              <w:rPr>
-                <w:rFonts w:ascii="Calibri" w:cs="Calibri" w:eastAsia="Calibri" w:hAnsi="Calibri"/>
-                <w:b/>
-                <w:bCs/>
-                <w:sz w:val="20"/>
-                <w:szCs w:val="20"/>
-              </w:rPr>
-              <w:t xml:space="preserve">Hublot brisé / plaque froide</w:t>
-            </w:r>
-          </w:p>
-          <w:p>
-            <w:pPr>
-              <w:spacing w:after="40"/>
-            </w:pPr>
-            <w:r>
-              <w:rPr>
-                <w:rFonts w:ascii="Calibri" w:cs="Calibri" w:eastAsia="Calibri" w:hAnsi="Calibri"/>
-                <w:i/>
-                <w:iCs/>
-                <w:color w:val="5A6672"/>
-                <w:sz w:val="17"/>
-                <w:szCs w:val="17"/>
-              </w:rPr>
-              <w:t xml:space="preserve">matériau</w:t>
-            </w:r>
-          </w:p>
-        </w:tc>
-        <w:tc>
-          <w:tcPr>
-            <w:tcW w:type="dxa" w:w="1150"/>
-            <w:tcMar>
-              <w:top w:type="dxa" w:w="60"/>
-              <w:left w:type="dxa" w:w="100"/>
-              <w:bottom w:type="dxa" w:w="60"/>
-              <w:right w:type="dxa" w:w="100"/>
-            </w:tcMar>
-          </w:tcPr>
-          <w:p>
-            <w:pPr>
-              <w:spacing w:after="40"/>
-            </w:pPr>
-            <w:r>
-              <w:rPr>
-                <w:rFonts w:ascii="Calibri" w:cs="Calibri" w:eastAsia="Calibri" w:hAnsi="Calibri"/>
-                <w:sz w:val="20"/>
-                <w:szCs w:val="20"/>
-              </w:rPr>
-              <w:t xml:space="preserve">SOLIDE</w:t>
-            </w:r>
-          </w:p>
-        </w:tc>
-        <w:tc>
-          <w:tcPr>
-            <w:tcW w:type="dxa" w:w="3300"/>
-            <w:tcMar>
-              <w:top w:type="dxa" w:w="60"/>
-              <w:left w:type="dxa" w:w="100"/>
-              <w:bottom w:type="dxa" w:w="60"/>
-              <w:right w:type="dxa" w:w="100"/>
-            </w:tcMar>
-          </w:tcPr>
-          <w:p>
-            <w:pPr>
-              <w:spacing w:after="40"/>
-            </w:pPr>
-            <w:r>
-              <w:rPr>
-                <w:rFonts w:ascii="Calibri" w:cs="Calibri" w:eastAsia="Calibri" w:hAnsi="Calibri"/>
-                <w:sz w:val="20"/>
-                <w:szCs w:val="20"/>
-              </w:rPr>
-              <w:t xml:space="preserve">Aura de gel, PAR PARTICULE : chaque goutte exposée givre puis gèle. La glace qui touche la plaque est soudée net. La vapeur y condense, et la vapeur perdue ailleurs y perle en rosée.</w:t>
-            </w:r>
-          </w:p>
-        </w:tc>
-        <w:tc>
-          <w:tcPr>
-            <w:tcW w:type="dxa" w:w="2650"/>
-            <w:tcMar>
-              <w:top w:type="dxa" w:w="60"/>
-              <w:left w:type="dxa" w:w="100"/>
-              <w:bottom w:type="dxa" w:w="60"/>
-              <w:right w:type="dxa" w:w="100"/>
-            </w:tcMar>
-          </w:tcPr>
-          <w:p>
-            <w:pPr>
-              <w:spacing w:after="40"/>
-            </w:pPr>
-            <w:r>
-              <w:rPr>
-                <w:rFonts w:ascii="Calibri" w:cs="Calibri" w:eastAsia="Calibri" w:hAnsi="Calibri"/>
-                <w:sz w:val="20"/>
-                <w:szCs w:val="20"/>
-              </w:rPr>
-              <w:t xml:space="preserve">1,2 s à plein bain (freezeTime) ; givre = traînée avant la prise (frostSluggish 3/s)</w:t>
-            </w:r>
-          </w:p>
-        </w:tc>
-        <w:tc>
-          <w:tcPr>
-            <w:tcW w:type="dxa" w:w="2350"/>
-            <w:tcMar>
-              <w:top w:type="dxa" w:w="60"/>
-              <w:left w:type="dxa" w:w="100"/>
-              <w:bottom w:type="dxa" w:w="60"/>
-              <w:right w:type="dxa" w:w="100"/>
-            </w:tcMar>
-          </w:tcPr>
-          <w:p>
-            <w:pPr>
-              <w:spacing w:after="40"/>
-            </w:pPr>
-            <w:r>
-              <w:rPr>
-                <w:rFonts w:ascii="Calibri" w:cs="Calibri" w:eastAsia="Calibri" w:hAnsi="Calibri"/>
-                <w:sz w:val="20"/>
-                <w:szCs w:val="20"/>
-              </w:rPr>
-              <w:t xml:space="preserve">aucun (par particule)</w:t>
-            </w:r>
-          </w:p>
-        </w:tc>
-      </w:tr>
-      <w:tr>
-        <w:tc>
-          <w:tcPr>
-            <w:tcW w:type="dxa" w:w="1750"/>
-            <w:tcMar>
-              <w:top w:type="dxa" w:w="60"/>
-              <w:left w:type="dxa" w:w="100"/>
-              <w:bottom w:type="dxa" w:w="60"/>
-              <w:right w:type="dxa" w:w="100"/>
-            </w:tcMar>
-          </w:tcPr>
-          <w:p>
-            <w:pPr>
-              <w:spacing w:after="20"/>
-            </w:pPr>
-            <w:r>
-              <w:rPr>
-                <w:rFonts w:ascii="Calibri" w:cs="Calibri" w:eastAsia="Calibri" w:hAnsi="Calibri"/>
-                <w:b/>
-                <w:bCs/>
-                <w:sz w:val="20"/>
-                <w:szCs w:val="20"/>
-              </w:rPr>
-              <w:t xml:space="preserve">Radiateur</w:t>
-            </w:r>
-          </w:p>
-          <w:p>
-            <w:pPr>
-              <w:spacing w:after="40"/>
-            </w:pPr>
-            <w:r>
-              <w:rPr>
-                <w:rFonts w:ascii="Calibri" w:cs="Calibri" w:eastAsia="Calibri" w:hAnsi="Calibri"/>
-                <w:i/>
-                <w:iCs/>
-                <w:color w:val="5A6672"/>
-                <w:sz w:val="17"/>
-                <w:szCs w:val="17"/>
-              </w:rPr>
-              <w:t xml:space="preserve">matériau</w:t>
-            </w:r>
-          </w:p>
-        </w:tc>
-        <w:tc>
-          <w:tcPr>
-            <w:tcW w:type="dxa" w:w="1150"/>
-            <w:tcMar>
-              <w:top w:type="dxa" w:w="60"/>
-              <w:left w:type="dxa" w:w="100"/>
-              <w:bottom w:type="dxa" w:w="60"/>
-              <w:right w:type="dxa" w:w="100"/>
-            </w:tcMar>
-          </w:tcPr>
-          <w:p>
-            <w:pPr>
-              <w:spacing w:after="40"/>
-            </w:pPr>
-            <w:r>
-              <w:rPr>
-                <w:rFonts w:ascii="Calibri" w:cs="Calibri" w:eastAsia="Calibri" w:hAnsi="Calibri"/>
-                <w:sz w:val="20"/>
-                <w:szCs w:val="20"/>
-              </w:rPr>
-              <w:t xml:space="preserve">GAZEUX</w:t>
-            </w:r>
-          </w:p>
-        </w:tc>
-        <w:tc>
-          <w:tcPr>
-            <w:tcW w:type="dxa" w:w="3300"/>
-            <w:tcMar>
-              <w:top w:type="dxa" w:w="60"/>
-              <w:left w:type="dxa" w:w="100"/>
-              <w:bottom w:type="dxa" w:w="60"/>
-              <w:right w:type="dxa" w:w="100"/>
-            </w:tcMar>
-          </w:tcPr>
-          <w:p>
-            <w:pPr>
-              <w:spacing w:after="40"/>
-            </w:pPr>
-            <w:r>
-              <w:rPr>
-                <w:rFonts w:ascii="Calibri" w:cs="Calibri" w:eastAsia="Calibri" w:hAnsi="Calibri"/>
-                <w:sz w:val="20"/>
-                <w:szCs w:val="20"/>
-              </w:rPr>
-              <w:t xml:space="preserve">Aura de chaleur, PAR PARTICULE. Dégèle aussi la glace (0,35 s). La vapeur qui frôle le halo recharge un dash (+1 impulsion offerte).</w:t>
-            </w:r>
-          </w:p>
-        </w:tc>
-        <w:tc>
-          <w:tcPr>
-            <w:tcW w:type="dxa" w:w="2650"/>
-            <w:tcMar>
-              <w:top w:type="dxa" w:w="60"/>
-              <w:left w:type="dxa" w:w="100"/>
-              <w:bottom w:type="dxa" w:w="60"/>
-              <w:right w:type="dxa" w:w="100"/>
-            </w:tcMar>
-          </w:tcPr>
-          <w:p>
-            <w:pPr>
-              <w:spacing w:after="40"/>
-            </w:pPr>
-            <w:r>
-              <w:rPr>
-                <w:rFonts w:ascii="Calibri" w:cs="Calibri" w:eastAsia="Calibri" w:hAnsi="Calibri"/>
-                <w:sz w:val="20"/>
-                <w:szCs w:val="20"/>
-              </w:rPr>
-              <w:t xml:space="preserve">1,2 s à plein bain (boilTime) ; dégel forcé 0,35 s (heatThawTime)</w:t>
-            </w:r>
-          </w:p>
-        </w:tc>
-        <w:tc>
-          <w:tcPr>
-            <w:tcW w:type="dxa" w:w="2350"/>
-            <w:tcMar>
-              <w:top w:type="dxa" w:w="60"/>
-              <w:left w:type="dxa" w:w="100"/>
-              <w:bottom w:type="dxa" w:w="60"/>
-              <w:right w:type="dxa" w:w="100"/>
-            </w:tcMar>
-          </w:tcPr>
-          <w:p>
-            <w:pPr>
-              <w:spacing w:after="40"/>
-            </w:pPr>
-            <w:r>
-              <w:rPr>
-                <w:rFonts w:ascii="Calibri" w:cs="Calibri" w:eastAsia="Calibri" w:hAnsi="Calibri"/>
-                <w:sz w:val="20"/>
-                <w:szCs w:val="20"/>
-              </w:rPr>
-              <w:t xml:space="preserve">aucun (par particule)</w:t>
-            </w:r>
-          </w:p>
-        </w:tc>
-      </w:tr>
-      <w:tr>
-        <w:tc>
-          <w:tcPr>
-            <w:tcW w:type="dxa" w:w="1750"/>
-            <w:tcMar>
-              <w:top w:type="dxa" w:w="60"/>
-              <w:left w:type="dxa" w:w="100"/>
-              <w:bottom w:type="dxa" w:w="60"/>
-              <w:right w:type="dxa" w:w="100"/>
-            </w:tcMar>
-          </w:tcPr>
-          <w:p>
-            <w:pPr>
-              <w:spacing w:after="20"/>
-            </w:pPr>
-            <w:r>
-              <w:rPr>
-                <w:rFonts w:ascii="Calibri" w:cs="Calibri" w:eastAsia="Calibri" w:hAnsi="Calibri"/>
-                <w:b/>
-                <w:bCs/>
-                <w:sz w:val="20"/>
-                <w:szCs w:val="20"/>
-              </w:rPr>
-              <w:t xml:space="preserve">Zone LIQUIDE</w:t>
-            </w:r>
-          </w:p>
-          <w:p>
-            <w:pPr>
-              <w:spacing w:after="40"/>
-            </w:pPr>
-            <w:r>
-              <w:rPr>
-                <w:rFonts w:ascii="Calibri" w:cs="Calibri" w:eastAsia="Calibri" w:hAnsi="Calibri"/>
-                <w:i/>
-                <w:iCs/>
-                <w:color w:val="5A6672"/>
-                <w:sz w:val="17"/>
-                <w:szCs w:val="17"/>
-              </w:rPr>
-              <w:t xml:space="preserve">« chambre pressurisée »</w:t>
-            </w:r>
-          </w:p>
-        </w:tc>
-        <w:tc>
-          <w:tcPr>
-            <w:tcW w:type="dxa" w:w="1150"/>
-            <w:tcMar>
-              <w:top w:type="dxa" w:w="60"/>
-              <w:left w:type="dxa" w:w="100"/>
-              <w:bottom w:type="dxa" w:w="60"/>
-              <w:right w:type="dxa" w:w="100"/>
-            </w:tcMar>
-          </w:tcPr>
-          <w:p>
-            <w:pPr>
-              <w:spacing w:after="40"/>
-            </w:pPr>
-            <w:r>
-              <w:rPr>
-                <w:rFonts w:ascii="Calibri" w:cs="Calibri" w:eastAsia="Calibri" w:hAnsi="Calibri"/>
-                <w:sz w:val="20"/>
-                <w:szCs w:val="20"/>
-              </w:rPr>
-              <w:t xml:space="preserve">LIQUIDE</w:t>
-            </w:r>
-          </w:p>
-        </w:tc>
-        <w:tc>
-          <w:tcPr>
-            <w:tcW w:type="dxa" w:w="3300"/>
-            <w:tcMar>
-              <w:top w:type="dxa" w:w="60"/>
-              <w:left w:type="dxa" w:w="100"/>
-              <w:bottom w:type="dxa" w:w="60"/>
-              <w:right w:type="dxa" w:w="100"/>
-            </w:tcMar>
-          </w:tcPr>
-          <w:p>
-            <w:pPr>
-              <w:spacing w:after="40"/>
-            </w:pPr>
-            <w:r>
-              <w:rPr>
-                <w:rFonts w:ascii="Calibri" w:cs="Calibri" w:eastAsia="Calibri" w:hAnsi="Calibri"/>
-                <w:sz w:val="20"/>
-                <w:szCs w:val="20"/>
-              </w:rPr>
-              <w:t xml:space="preserve">Le CENTRE du corps entre dans la zone → tout le corps se convertit, sélecteur d’état verrouillé tant qu’on y est.</w:t>
-            </w:r>
-          </w:p>
-        </w:tc>
-        <w:tc>
-          <w:tcPr>
-            <w:tcW w:type="dxa" w:w="2650"/>
-            <w:tcMar>
-              <w:top w:type="dxa" w:w="60"/>
-              <w:left w:type="dxa" w:w="100"/>
-              <w:bottom w:type="dxa" w:w="60"/>
-              <w:right w:type="dxa" w:w="100"/>
-            </w:tcMar>
-          </w:tcPr>
-          <w:p>
-            <w:pPr>
-              <w:spacing w:after="40"/>
-            </w:pPr>
-            <w:r>
-              <w:rPr>
-                <w:rFonts w:ascii="Calibri" w:cs="Calibri" w:eastAsia="Calibri" w:hAnsi="Calibri"/>
-                <w:sz w:val="20"/>
-                <w:szCs w:val="20"/>
-              </w:rPr>
-              <w:t xml:space="preserve">condensation 0,9 s / dégel 2,5 s</w:t>
-            </w:r>
-          </w:p>
-        </w:tc>
-        <w:tc>
-          <w:tcPr>
-            <w:tcW w:type="dxa" w:w="2350"/>
-            <w:tcMar>
-              <w:top w:type="dxa" w:w="60"/>
-              <w:left w:type="dxa" w:w="100"/>
-              <w:bottom w:type="dxa" w:w="60"/>
-              <w:right w:type="dxa" w:w="100"/>
-            </w:tcMar>
-          </w:tcPr>
-          <w:p>
-            <w:pPr>
-              <w:spacing w:after="40"/>
-            </w:pPr>
-            <w:r>
-              <w:rPr>
-                <w:rFonts w:ascii="Calibri" w:cs="Calibri" w:eastAsia="Calibri" w:hAnsi="Calibri"/>
-                <w:sz w:val="20"/>
-                <w:szCs w:val="20"/>
-              </w:rPr>
-              <w:t xml:space="preserve">centroïde (≈ majorité du volume)</w:t>
-            </w:r>
-          </w:p>
-        </w:tc>
-      </w:tr>
-      <w:tr>
-        <w:tc>
-          <w:tcPr>
-            <w:tcW w:type="dxa" w:w="1750"/>
-            <w:tcMar>
-              <w:top w:type="dxa" w:w="60"/>
-              <w:left w:type="dxa" w:w="100"/>
-              <w:bottom w:type="dxa" w:w="60"/>
-              <w:right w:type="dxa" w:w="100"/>
-            </w:tcMar>
-          </w:tcPr>
-          <w:p>
-            <w:pPr>
-              <w:spacing w:after="20"/>
-            </w:pPr>
-            <w:r>
-              <w:rPr>
-                <w:rFonts w:ascii="Calibri" w:cs="Calibri" w:eastAsia="Calibri" w:hAnsi="Calibri"/>
-                <w:b/>
-                <w:bCs/>
-                <w:sz w:val="20"/>
-                <w:szCs w:val="20"/>
-              </w:rPr>
-              <w:t xml:space="preserve">Zone SOLIDE</w:t>
-            </w:r>
-          </w:p>
-          <w:p>
-            <w:pPr>
-              <w:spacing w:after="40"/>
-            </w:pPr>
-            <w:r>
-              <w:rPr>
-                <w:rFonts w:ascii="Calibri" w:cs="Calibri" w:eastAsia="Calibri" w:hAnsi="Calibri"/>
-                <w:i/>
-                <w:iCs/>
-                <w:color w:val="5A6672"/>
-                <w:sz w:val="17"/>
-                <w:szCs w:val="17"/>
-              </w:rPr>
-              <w:t xml:space="preserve">« hublot fendu »</w:t>
-            </w:r>
-          </w:p>
-        </w:tc>
-        <w:tc>
-          <w:tcPr>
-            <w:tcW w:type="dxa" w:w="1150"/>
-            <w:tcMar>
-              <w:top w:type="dxa" w:w="60"/>
-              <w:left w:type="dxa" w:w="100"/>
-              <w:bottom w:type="dxa" w:w="60"/>
-              <w:right w:type="dxa" w:w="100"/>
-            </w:tcMar>
-          </w:tcPr>
-          <w:p>
-            <w:pPr>
-              <w:spacing w:after="40"/>
-            </w:pPr>
-            <w:r>
-              <w:rPr>
-                <w:rFonts w:ascii="Calibri" w:cs="Calibri" w:eastAsia="Calibri" w:hAnsi="Calibri"/>
-                <w:sz w:val="20"/>
-                <w:szCs w:val="20"/>
-              </w:rPr>
-              <w:t xml:space="preserve">SOLIDE</w:t>
-            </w:r>
-          </w:p>
-        </w:tc>
-        <w:tc>
-          <w:tcPr>
-            <w:tcW w:type="dxa" w:w="3300"/>
-            <w:tcMar>
-              <w:top w:type="dxa" w:w="60"/>
-              <w:left w:type="dxa" w:w="100"/>
-              <w:bottom w:type="dxa" w:w="60"/>
-              <w:right w:type="dxa" w:w="100"/>
-            </w:tcMar>
-          </w:tcPr>
-          <w:p>
-            <w:pPr>
-              <w:spacing w:after="40"/>
-            </w:pPr>
-            <w:r>
-              <w:rPr>
-                <w:rFonts w:ascii="Calibri" w:cs="Calibri" w:eastAsia="Calibri" w:hAnsi="Calibri"/>
-                <w:sz w:val="20"/>
-                <w:szCs w:val="20"/>
-              </w:rPr>
-              <w:t xml:space="preserve">Idem : déclenchement au centroïde, conversion du corps entier, état verrouillé.</w:t>
-            </w:r>
-          </w:p>
-        </w:tc>
-        <w:tc>
-          <w:tcPr>
-            <w:tcW w:type="dxa" w:w="2650"/>
-            <w:tcMar>
-              <w:top w:type="dxa" w:w="60"/>
-              <w:left w:type="dxa" w:w="100"/>
-              <w:bottom w:type="dxa" w:w="60"/>
-              <w:right w:type="dxa" w:w="100"/>
-            </w:tcMar>
-          </w:tcPr>
-          <w:p>
-            <w:pPr>
-              <w:spacing w:after="40"/>
-            </w:pPr>
-            <w:r>
-              <w:rPr>
-                <w:rFonts w:ascii="Calibri" w:cs="Calibri" w:eastAsia="Calibri" w:hAnsi="Calibri"/>
-                <w:sz w:val="20"/>
-                <w:szCs w:val="20"/>
-              </w:rPr>
-              <w:t xml:space="preserve">prise 0,45 s (freezeSelfTime)</w:t>
-            </w:r>
-          </w:p>
-        </w:tc>
-        <w:tc>
-          <w:tcPr>
-            <w:tcW w:type="dxa" w:w="2350"/>
-            <w:tcMar>
-              <w:top w:type="dxa" w:w="60"/>
-              <w:left w:type="dxa" w:w="100"/>
-              <w:bottom w:type="dxa" w:w="60"/>
-              <w:right w:type="dxa" w:w="100"/>
-            </w:tcMar>
-          </w:tcPr>
-          <w:p>
-            <w:pPr>
-              <w:spacing w:after="40"/>
-            </w:pPr>
-            <w:r>
-              <w:rPr>
-                <w:rFonts w:ascii="Calibri" w:cs="Calibri" w:eastAsia="Calibri" w:hAnsi="Calibri"/>
-                <w:sz w:val="20"/>
-                <w:szCs w:val="20"/>
-              </w:rPr>
-              <w:t xml:space="preserve">centroïde (≈ majorité du volume)</w:t>
-            </w:r>
-          </w:p>
-        </w:tc>
-      </w:tr>
-      <w:tr>
-        <w:tc>
-          <w:tcPr>
-            <w:tcW w:type="dxa" w:w="1750"/>
-            <w:tcMar>
-              <w:top w:type="dxa" w:w="60"/>
-              <w:left w:type="dxa" w:w="100"/>
-              <w:bottom w:type="dxa" w:w="60"/>
-              <w:right w:type="dxa" w:w="100"/>
-            </w:tcMar>
-          </w:tcPr>
-          <w:p>
-            <w:pPr>
-              <w:spacing w:after="20"/>
-            </w:pPr>
-            <w:r>
-              <w:rPr>
-                <w:rFonts w:ascii="Calibri" w:cs="Calibri" w:eastAsia="Calibri" w:hAnsi="Calibri"/>
-                <w:b/>
-                <w:bCs/>
-                <w:sz w:val="20"/>
-                <w:szCs w:val="20"/>
-              </w:rPr>
-              <w:t xml:space="preserve">Zone GAZ</w:t>
-            </w:r>
-          </w:p>
-          <w:p>
-            <w:pPr>
-              <w:spacing w:after="40"/>
-            </w:pPr>
-            <w:r>
-              <w:rPr>
-                <w:rFonts w:ascii="Calibri" w:cs="Calibri" w:eastAsia="Calibri" w:hAnsi="Calibri"/>
-                <w:i/>
-                <w:iCs/>
-                <w:color w:val="5A6672"/>
-                <w:sz w:val="17"/>
-                <w:szCs w:val="17"/>
-              </w:rPr>
-              <w:t xml:space="preserve">« conduite rompue »</w:t>
-            </w:r>
-          </w:p>
-        </w:tc>
-        <w:tc>
-          <w:tcPr>
-            <w:tcW w:type="dxa" w:w="1150"/>
-            <w:tcMar>
-              <w:top w:type="dxa" w:w="60"/>
-              <w:left w:type="dxa" w:w="100"/>
-              <w:bottom w:type="dxa" w:w="60"/>
-              <w:right w:type="dxa" w:w="100"/>
-            </w:tcMar>
-          </w:tcPr>
-          <w:p>
-            <w:pPr>
-              <w:spacing w:after="40"/>
-            </w:pPr>
-            <w:r>
-              <w:rPr>
-                <w:rFonts w:ascii="Calibri" w:cs="Calibri" w:eastAsia="Calibri" w:hAnsi="Calibri"/>
-                <w:sz w:val="20"/>
-                <w:szCs w:val="20"/>
-              </w:rPr>
-              <w:t xml:space="preserve">GAZEUX</w:t>
-            </w:r>
-          </w:p>
-        </w:tc>
-        <w:tc>
-          <w:tcPr>
-            <w:tcW w:type="dxa" w:w="3300"/>
-            <w:tcMar>
-              <w:top w:type="dxa" w:w="60"/>
-              <w:left w:type="dxa" w:w="100"/>
-              <w:bottom w:type="dxa" w:w="60"/>
-              <w:right w:type="dxa" w:w="100"/>
-            </w:tcMar>
-          </w:tcPr>
-          <w:p>
-            <w:pPr>
-              <w:spacing w:after="40"/>
-            </w:pPr>
-            <w:r>
-              <w:rPr>
-                <w:rFonts w:ascii="Calibri" w:cs="Calibri" w:eastAsia="Calibri" w:hAnsi="Calibri"/>
-                <w:sz w:val="20"/>
-                <w:szCs w:val="20"/>
-              </w:rPr>
-              <w:t xml:space="preserve">Idem : déclenchement au centroïde, conversion du corps entier, état verrouillé.</w:t>
-            </w:r>
-          </w:p>
-        </w:tc>
-        <w:tc>
-          <w:tcPr>
-            <w:tcW w:type="dxa" w:w="2650"/>
-            <w:tcMar>
-              <w:top w:type="dxa" w:w="60"/>
-              <w:left w:type="dxa" w:w="100"/>
-              <w:bottom w:type="dxa" w:w="60"/>
-              <w:right w:type="dxa" w:w="100"/>
-            </w:tcMar>
-          </w:tcPr>
-          <w:p>
-            <w:pPr>
-              <w:spacing w:after="40"/>
-            </w:pPr>
-            <w:r>
-              <w:rPr>
-                <w:rFonts w:ascii="Calibri" w:cs="Calibri" w:eastAsia="Calibri" w:hAnsi="Calibri"/>
-                <w:sz w:val="20"/>
-                <w:szCs w:val="20"/>
-              </w:rPr>
-              <w:t xml:space="preserve">vaporisation 0,5 s (vaporizeTime)</w:t>
-            </w:r>
-          </w:p>
-        </w:tc>
-        <w:tc>
-          <w:tcPr>
-            <w:tcW w:type="dxa" w:w="2350"/>
-            <w:tcMar>
-              <w:top w:type="dxa" w:w="60"/>
-              <w:left w:type="dxa" w:w="100"/>
-              <w:bottom w:type="dxa" w:w="60"/>
-              <w:right w:type="dxa" w:w="100"/>
-            </w:tcMar>
-          </w:tcPr>
-          <w:p>
-            <w:pPr>
-              <w:spacing w:after="40"/>
-            </w:pPr>
-            <w:r>
-              <w:rPr>
-                <w:rFonts w:ascii="Calibri" w:cs="Calibri" w:eastAsia="Calibri" w:hAnsi="Calibri"/>
-                <w:sz w:val="20"/>
-                <w:szCs w:val="20"/>
-              </w:rPr>
-              <w:t xml:space="preserve">centroïde (≈ majorité du volume)</w:t>
             </w:r>
           </w:p>
         </w:tc>
@@ -1084,7 +1233,7 @@
           <w:sz w:val="26"/>
           <w:szCs w:val="26"/>
         </w:rPr>
-        <w:t xml:space="preserve">2. Matrice état → état : ① coût · ② temps</w:t>
+        <w:t xml:space="preserve">3. Changements VOLONTAIRES état → état — ① coût · ② temps</w:t>
       </w:r>
     </w:p>
     <w:p>
@@ -1098,7 +1247,7 @@
           <w:sz w:val="18"/>
           <w:szCs w:val="18"/>
         </w:rPr>
-        <w:t xml:space="preserve">Rappel de lecture : la diagonale ⟍ est l’identité (rien à faire). Les changements volontaires passent par F/G au clavier, X/Y/B à la manette, ❄/💨 au tactile.</w:t>
+        <w:t xml:space="preserve">F/G au clavier, X/Y/B à la manette, ❄/💨 au tactile. La diagonale ⟍ est l’identité.</w:t>
       </w:r>
     </w:p>
     <w:tbl>
@@ -1133,7 +1282,7 @@
           </w:tcPr>
           <w:p>
             <w:pPr>
-              <w:spacing w:after="80"/>
+              <w:spacing w:after="20"/>
             </w:pPr>
             <w:r>
               <w:rPr>
@@ -1161,7 +1310,7 @@
           </w:tcPr>
           <w:p>
             <w:pPr>
-              <w:spacing w:after="80"/>
+              <w:spacing w:after="20"/>
             </w:pPr>
             <w:r>
               <w:rPr>
@@ -1189,7 +1338,7 @@
           </w:tcPr>
           <w:p>
             <w:pPr>
-              <w:spacing w:after="80"/>
+              <w:spacing w:after="20"/>
             </w:pPr>
             <w:r>
               <w:rPr>
@@ -1217,7 +1366,7 @@
           </w:tcPr>
           <w:p>
             <w:pPr>
-              <w:spacing w:after="80"/>
+              <w:spacing w:after="20"/>
             </w:pPr>
             <w:r>
               <w:rPr>
@@ -1247,7 +1396,7 @@
           </w:tcPr>
           <w:p>
             <w:pPr>
-              <w:spacing w:after="80"/>
+              <w:spacing w:after="20"/>
             </w:pPr>
             <w:r>
               <w:rPr>
@@ -1300,7 +1449,7 @@
           </w:tcPr>
           <w:p>
             <w:pPr>
-              <w:spacing w:after="20"/>
+              <w:spacing w:after="30"/>
             </w:pPr>
             <w:r>
               <w:rPr>
@@ -1321,7 +1470,7 @@
                 <w:sz w:val="20"/>
                 <w:szCs w:val="20"/>
               </w:rPr>
-              <w:t xml:space="preserve">② Temps : 0,45 s (touche F / bouton X) · 1,2 s par particule au froid.</w:t>
+              <w:t xml:space="preserve">② Temps : 0,45 s (F / bouton X) · 1,2 s par particule au froid.</w:t>
             </w:r>
           </w:p>
         </w:tc>
@@ -1337,28 +1486,28 @@
           </w:tcPr>
           <w:p>
             <w:pPr>
-              <w:spacing w:after="20"/>
-            </w:pPr>
-            <w:r>
-              <w:rPr>
-                <w:rFonts w:ascii="Calibri" w:cs="Calibri" w:eastAsia="Calibri" w:hAnsi="Calibri"/>
-                <w:sz w:val="20"/>
-                <w:szCs w:val="20"/>
-              </w:rPr>
-              <w:t xml:space="preserve">① Coût : l’état se paie — évaporation continue de 2 part./s ; la grille essore au passage. Les dashs sont COMPTÉS : 3 par écran (réglable par tableau), le radiateur frôlé en offre un.</w:t>
-            </w:r>
-          </w:p>
-          <w:p>
-            <w:pPr>
-              <w:spacing w:after="40"/>
-            </w:pPr>
-            <w:r>
-              <w:rPr>
-                <w:rFonts w:ascii="Calibri" w:cs="Calibri" w:eastAsia="Calibri" w:hAnsi="Calibri"/>
-                <w:sz w:val="20"/>
-                <w:szCs w:val="20"/>
-              </w:rPr>
-              <w:t xml:space="preserve">② Temps : 0,5 s (touche G / bouton Y) · 1,2 s par particule au radiateur.</w:t>
+              <w:spacing w:after="30"/>
+            </w:pPr>
+            <w:r>
+              <w:rPr>
+                <w:rFonts w:ascii="Calibri" w:cs="Calibri" w:eastAsia="Calibri" w:hAnsi="Calibri"/>
+                <w:sz w:val="20"/>
+                <w:szCs w:val="20"/>
+              </w:rPr>
+              <w:t xml:space="preserve">① Coût : l’état se paie — évaporation continue 2 part./s ; la grille essore au passage. Dashs COMPTÉS : 3 par écran (réglable par tableau), radiateur frôlé = +1 offert.</w:t>
+            </w:r>
+          </w:p>
+          <w:p>
+            <w:pPr>
+              <w:spacing w:after="40"/>
+            </w:pPr>
+            <w:r>
+              <w:rPr>
+                <w:rFonts w:ascii="Calibri" w:cs="Calibri" w:eastAsia="Calibri" w:hAnsi="Calibri"/>
+                <w:sz w:val="20"/>
+                <w:szCs w:val="20"/>
+              </w:rPr>
+              <w:t xml:space="preserve">② Temps : 0,5 s (G / bouton Y) · 1,2 s par particule au radiateur.</w:t>
             </w:r>
           </w:p>
         </w:tc>
@@ -1377,7 +1526,7 @@
           </w:tcPr>
           <w:p>
             <w:pPr>
-              <w:spacing w:after="80"/>
+              <w:spacing w:after="20"/>
             </w:pPr>
             <w:r>
               <w:rPr>
@@ -1404,7 +1553,7 @@
           </w:tcPr>
           <w:p>
             <w:pPr>
-              <w:spacing w:after="20"/>
+              <w:spacing w:after="30"/>
             </w:pPr>
             <w:r>
               <w:rPr>
@@ -1476,7 +1625,7 @@
                 <w:sz w:val="20"/>
                 <w:szCs w:val="20"/>
               </w:rPr>
-              <w:t xml:space="preserve">✕ Pas de transition directe (pas de sublimation) : passe par l’eau, ≈ 2,5 + 0,5 s. Le radiateur enchaîne les deux tout seul (0,35 + 1,2 s).</w:t>
+              <w:t xml:space="preserve">✕ Pas de sublimation directe : passe par l’eau (≈ 2,5 + 0,5 s). Le radiateur enchaîne les deux tout seul (0,35 + 1,2 s).</w:t>
             </w:r>
           </w:p>
         </w:tc>
@@ -1495,7 +1644,7 @@
           </w:tcPr>
           <w:p>
             <w:pPr>
-              <w:spacing w:after="80"/>
+              <w:spacing w:after="20"/>
             </w:pPr>
             <w:r>
               <w:rPr>
@@ -1522,28 +1671,28 @@
           </w:tcPr>
           <w:p>
             <w:pPr>
-              <w:spacing w:after="20"/>
-            </w:pPr>
-            <w:r>
-              <w:rPr>
-                <w:rFonts w:ascii="Calibri" w:cs="Calibri" w:eastAsia="Calibri" w:hAnsi="Calibri"/>
-                <w:sz w:val="20"/>
-                <w:szCs w:val="20"/>
-              </w:rPr>
-              <w:t xml:space="preserve">① Coût : aucun coût direct (les pertes ont déjà eu lieu pendant l’état vapeur).</w:t>
-            </w:r>
-          </w:p>
-          <w:p>
-            <w:pPr>
-              <w:spacing w:after="40"/>
-            </w:pPr>
-            <w:r>
-              <w:rPr>
-                <w:rFonts w:ascii="Calibri" w:cs="Calibri" w:eastAsia="Calibri" w:hAnsi="Calibri"/>
-                <w:sz w:val="20"/>
-                <w:szCs w:val="20"/>
-              </w:rPr>
-              <w:t xml:space="preserve">② Temps : 0,9 s (condenseTime) + regroupement — les gouttelettes sont rappelées vers le corps (420 u/s²), rien ne se disperse.</w:t>
+              <w:spacing w:after="30"/>
+            </w:pPr>
+            <w:r>
+              <w:rPr>
+                <w:rFonts w:ascii="Calibri" w:cs="Calibri" w:eastAsia="Calibri" w:hAnsi="Calibri"/>
+                <w:sz w:val="20"/>
+                <w:szCs w:val="20"/>
+              </w:rPr>
+              <w:t xml:space="preserve">① Coût : aucun coût direct (les pertes ont eu lieu pendant l’état vapeur).</w:t>
+            </w:r>
+          </w:p>
+          <w:p>
+            <w:pPr>
+              <w:spacing w:after="40"/>
+            </w:pPr>
+            <w:r>
+              <w:rPr>
+                <w:rFonts w:ascii="Calibri" w:cs="Calibri" w:eastAsia="Calibri" w:hAnsi="Calibri"/>
+                <w:sz w:val="20"/>
+                <w:szCs w:val="20"/>
+              </w:rPr>
+              <w:t xml:space="preserve">② Temps : 0,9 s (condenseTime) + regroupement (420 u/s²) — rien ne se disperse.</w:t>
             </w:r>
           </w:p>
         </w:tc>
@@ -1568,7 +1717,7 @@
                 <w:sz w:val="20"/>
                 <w:szCs w:val="20"/>
               </w:rPr>
-              <w:t xml:space="preserve">✕ Pas de direct : passe par l’eau, ≈ 0,9 + 0,45 s. Les zones l’orchestrent automatiquement.</w:t>
+              <w:t xml:space="preserve">✕ Pas de direct : passe par l’eau (≈ 0,9 + 0,45 s). Les zones l’orchestrent automatiquement.</w:t>
             </w:r>
           </w:p>
         </w:tc>
@@ -1613,7 +1762,7 @@
           <w:sz w:val="26"/>
           <w:szCs w:val="26"/>
         </w:rPr>
-        <w:t xml:space="preserve">3. Recommandations</w:t>
+        <w:t xml:space="preserve">4. Recommandations</w:t>
       </w:r>
     </w:p>
     <w:p>
@@ -1647,7 +1796,7 @@
           <w:sz w:val="19"/>
           <w:szCs w:val="19"/>
         </w:rPr>
-        <w:t xml:space="preserve">Aujourd’hui deux régimes coexistent : les auras convertissent par particule (corps partiellement transformé possible), les zones au centroïde (tout ou rien). Recommandation : un paramètre « seuil de transformation » (défaut 70 %) — quand X % du volume est sous influence, TOUT le corps bascule. Réglable au banc, et par zone/matériau dans l’éditeur. C’est la règle de l’exemple en tête du tableau 1.</w:t>
+        <w:t xml:space="preserve">Aujourd’hui deux régimes : les blocs convertissent par particule (corps partiellement transformé possible), les zones au centroïde (tout ou rien dès que le centre entre). Recommandation : un paramètre « seuil de transformation » (défaut 70 %) — quand X % du volume est sous influence, TOUT le corps bascule. Réglable au banc, et par zone/bloc dans l’éditeur.</w:t>
       </w:r>
     </w:p>
     <w:p>
@@ -1667,7 +1816,7 @@
           <w:sz w:val="20"/>
           <w:szCs w:val="20"/>
         </w:rPr>
-        <w:t xml:space="preserve">Garder l’HYSTÉRÉSIS, et l’écrire dans les règles.</w:t>
+        <w:t xml:space="preserve">Aligner les ASSETS des zones sur ce document.</w:t>
       </w:r>
     </w:p>
     <w:p>
@@ -1681,7 +1830,7 @@
           <w:sz w:val="19"/>
           <w:szCs w:val="19"/>
         </w:rPr>
-        <w:t xml:space="preserve">Une particule devient gaz à vapeur = 1 mais ne redevient liquide qu’en dessous de 0,55 : l’aller-retour n’est pas symétrique. C’est ce qui évite le clignotement au bord des auras — à conserver quel que soit le seuil choisi, et à documenter (ligne « retour » dans le tableau 2).</w:t>
+        <w:t xml:space="preserve">Zone SOLIDE : « hublot fendu » — déjà conforme. Zone GAZ : le jeu peint une « conduite rompue », ce document propose le radiateur. Zone LIQUIDE : le jeu peint une « chambre pressurisée », ce document propose la douche de décontamination. Trancher, puis renommer décors et étiquettes pour qu’un seul vocabulaire circule (jeu, légende, ce document).</w:t>
       </w:r>
     </w:p>
     <w:p>
@@ -1701,7 +1850,7 @@
           <w:sz w:val="20"/>
           <w:szCs w:val="20"/>
         </w:rPr>
-        <w:t xml:space="preserve">Décider du sort de la SUBLIMATION (solide ↔ gazeux).</w:t>
+        <w:t xml:space="preserve">Garder l’HYSTÉRÉSIS, et l’écrire dans les règles.</w:t>
       </w:r>
     </w:p>
     <w:p>
@@ -1715,7 +1864,7 @@
           <w:sz w:val="19"/>
           <w:szCs w:val="19"/>
         </w:rPr>
-        <w:t xml:space="preserve">Aucune transition directe aujourd’hui : lisible, mais deux cases vides dans la matrice. Deux options : l’assumer comme règle du lore (« l’échantillon repasse toujours par l’eau »), ou l’autoriser uniquement via une cause extrême (radiateur au contact d’un bloc = sublimation en 2 s, coûteuse). À trancher avant d’ajouter des zones gaz sur des parcours de glace.</w:t>
+        <w:t xml:space="preserve">Une particule devient gaz à vapeur = 1 mais ne redevient liquide qu’en dessous de 0,55 : l’aller-retour n’est pas symétrique. C’est l’anti-clignotement au bord des auras — à conserver quel que soit le seuil choisi.</w:t>
       </w:r>
     </w:p>
     <w:p>
@@ -1735,7 +1884,7 @@
           <w:sz w:val="20"/>
           <w:szCs w:val="20"/>
         </w:rPr>
-        <w:t xml:space="preserve">Créer la DOUCHE DE DÉCONTAMINATION.</w:t>
+        <w:t xml:space="preserve">Décider du sort de la SUBLIMATION (solide ↔ gazeux).</w:t>
       </w:r>
     </w:p>
     <w:p>
@@ -1749,7 +1898,7 @@
           <w:sz w:val="19"/>
           <w:szCs w:val="19"/>
         </w:rPr>
-        <w:t xml:space="preserve">La colonne existe dans le tableau, pas dans le jeu. Proposition : un matériau « buse » qui arrose vers le bas ; ce qui traverse le jet redevient EAU (glace dégelée, vapeur condensée) au seuil volumique choisi. Rôle de game design : le « reset d’état » placé par le level designer — l’inverse exact du radiateur, comme la membrane est l’inverse de la grille.</w:t>
+        <w:t xml:space="preserve">Aucune transition directe : lisible, mais deux cases barrées. Options : l’assumer comme règle du lore (« l’échantillon repasse toujours par l’eau »), ou l’autoriser via une cause extrême (radiateur au contact d’un bloc = sublimation lente et coûteuse).</w:t>
       </w:r>
     </w:p>
     <w:p>
@@ -1769,7 +1918,7 @@
           <w:sz w:val="20"/>
           <w:szCs w:val="20"/>
         </w:rPr>
-        <w:t xml:space="preserve">Ajouter un TEMPS DE TRANSFORMATION visible.</w:t>
+        <w:t xml:space="preserve">Créer la DOUCHE DE DÉCONTAMINATION (bloc + asset de zone).</w:t>
       </w:r>
     </w:p>
     <w:p>
@@ -1783,7 +1932,7 @@
           <w:sz w:val="19"/>
           <w:szCs w:val="19"/>
         </w:rPr>
-        <w:t xml:space="preserve">Les temps existent (0,45 s / 0,5 s / 0,9 s / 2,5 s) mais rien ne les montre : un anneau de progression autour du corps pendant la prise / la vaporisation / le dégel rendrait la règle lisible sans lire ce document.</w:t>
+        <w:t xml:space="preserve">Elle a deux vies possibles : en BLOC (buse posée par le level designer, tableau 2) et en ASSET de la zone forcée LIQUIDE (tableau 1). Les deux peuvent partager le même décor — une seule modélisation.</w:t>
       </w:r>
     </w:p>
     <w:p>
@@ -1803,7 +1952,7 @@
           <w:sz w:val="20"/>
           <w:szCs w:val="20"/>
         </w:rPr>
-        <w:t xml:space="preserve">Les coûts au même endroit.</w:t>
+        <w:t xml:space="preserve">Rendre les TEMPS DE TRANSFORMATION visibles.</w:t>
       </w:r>
     </w:p>
     <w:p>
@@ -1817,7 +1966,41 @@
           <w:sz w:val="19"/>
           <w:szCs w:val="19"/>
         </w:rPr>
-        <w:t xml:space="preserve">Le seul vrai coût d’état est celui de la vapeur (2 part./s + essorage de grille + dashs comptés). Si d’autres coûts apparaissent (par exemple un péage de gel), les inscrire dans la case ① du tableau 2 — une seule source de vérité, ce document.</w:t>
+        <w:t xml:space="preserve">Les temps existent (0,45 / 0,5 / 0,9 / 2,5 s) mais rien ne les montre : un anneau de progression autour du corps pendant la prise, la vaporisation ou le dégel rendrait la règle lisible sans lire ce document.</w:t>
+      </w:r>
+    </w:p>
+    <w:p>
+      <w:pPr>
+        <w:pStyle w:val="ListParagraph"/>
+        <w:numPr>
+          <w:ilvl w:val="0"/>
+          <w:numId w:val="2"/>
+        </w:numPr>
+        <w:spacing w:after="30" w:before="100"/>
+      </w:pPr>
+      <w:r>
+        <w:rPr>
+          <w:rFonts w:ascii="Calibri" w:cs="Calibri" w:eastAsia="Calibri" w:hAnsi="Calibri"/>
+          <w:b/>
+          <w:bCs/>
+          <w:sz w:val="20"/>
+          <w:szCs w:val="20"/>
+        </w:rPr>
+        <w:t xml:space="preserve">Les coûts au même endroit.</w:t>
+      </w:r>
+    </w:p>
+    <w:p>
+      <w:pPr>
+        <w:spacing w:after="90"/>
+        <w:ind w:left="360"/>
+      </w:pPr>
+      <w:r>
+        <w:rPr>
+          <w:rFonts w:ascii="Calibri" w:cs="Calibri" w:eastAsia="Calibri" w:hAnsi="Calibri"/>
+          <w:sz w:val="19"/>
+          <w:szCs w:val="19"/>
+        </w:rPr>
+        <w:t xml:space="preserve">Le seul vrai coût d’état est celui de la vapeur (2 part./s + essorage de grille + dashs comptés). Tout nouveau coût s’inscrit dans les cases ① — une seule source de vérité, ce document.</w:t>
       </w:r>
     </w:p>
     <w:sectPr>

</xml_diff>

<commit_message>
Docs : transformations v2 — zones forcées (avec assets) séparées des blocs (#101)
Reprise sur la correction du game design : le tableau 1 devient la
matrice 3×3 des ZONES FORCÉES (asset par zone : douche proposée /
hublot fendu déjà en jeu / radiateur proposé, cases ① coût ② comment-
quand), le tableau 2 isole les BLOCS à aura (par particule), le
tableau 3 garde les changements volontaires. Recommandation ajoutée :
aligner les assets des zones (conduite rompue vs radiateur, chambre
pressurisée vs douche).


Claude-Session: https://claude.ai/code/session_01JcgQjhbx7n2WuX197SocGM

Co-authored-by: Claude <noreply@anthropic.com>
</commit_message>
<xml_diff>
--- a/docs/Sujet21-transformations.docx
+++ b/docs/Sujet21-transformations.docx
@@ -31,7 +31,7 @@
           <w:sz w:val="20"/>
           <w:szCs w:val="20"/>
         </w:rPr>
-        <w:t xml:space="preserve">Règles vivantes du protocole : causes, seuils, coûts et temps. Les valeurs entre parenthèses sont les paramètres du banc (état du code au 12/08/2026) — ce document est fait pour être modifié quand les règles bougent.</w:t>
+        <w:t xml:space="preserve">Règles vivantes du protocole. Deux familles de causes, bien distinctes : les ZONES FORCÉES (une région impose son état à tout le corps, un ASSET raconte pourquoi) et les BLOCS (des surfaces posées dans le décor, qui agissent par aura, particule par particule). Valeurs entre parenthèses : paramètres du banc, état du code au 12/08/2026 — document fait pour être modifié quand les règles bougent.</w:t>
       </w:r>
     </w:p>
     <w:p>
@@ -47,7 +47,7 @@
           <w:sz w:val="26"/>
           <w:szCs w:val="26"/>
         </w:rPr>
-        <w:t xml:space="preserve">1. Causes de transformation — seuils</w:t>
+        <w:t xml:space="preserve">1. Transformations par ZONES FORCÉES — ① coût · ② comment / quand</w:t>
       </w:r>
     </w:p>
     <w:p>
@@ -61,7 +61,608 @@
           <w:sz w:val="18"/>
           <w:szCs w:val="18"/>
         </w:rPr>
-        <w:t xml:space="preserve">Deux régimes aujourd’hui : les MATÉRIAUX (auras) transforment par particule — le corps peut être partiellement transformé ; les ZONES se déclenchent quand le centre du corps y entre, et convertissent tout. La colonne « Seuil » se remplit quand la règle des % sera fixée (recommandation nº 1).</w:t>
+        <w:t xml:space="preserve">Une zone impose son état : déclenchement quand le CENTRE du corps y entre (≈ majorité du volume — le seuil en % est la recommandation nº 1), conversion du corps ENTIER aux vitesses ci-dessous, sélecteur verrouillé tant qu’on y est, et l’état persiste à la sortie jusqu’à un changement volontaire.</w:t>
+      </w:r>
+    </w:p>
+    <w:tbl>
+      <w:tblPr>
+        <w:tblW w:type="dxa" w:w="11200"/>
+        <w:tblBorders>
+          <w:top w:val="single" w:color="auto" w:sz="4"/>
+          <w:left w:val="single" w:color="auto" w:sz="4"/>
+          <w:bottom w:val="single" w:color="auto" w:sz="4"/>
+          <w:right w:val="single" w:color="auto" w:sz="4"/>
+          <w:insideH w:val="single" w:color="auto" w:sz="4"/>
+          <w:insideV w:val="single" w:color="auto" w:sz="4"/>
+        </w:tblBorders>
+      </w:tblPr>
+      <w:tblGrid>
+        <w:gridCol w:w="1400"/>
+        <w:gridCol w:w="3260"/>
+        <w:gridCol w:w="3260"/>
+        <w:gridCol w:w="3280"/>
+      </w:tblGrid>
+      <w:tr>
+        <w:tc>
+          <w:tcPr>
+            <w:tcW w:type="dxa" w:w="1400"/>
+            <w:shd w:fill="1F5C8B" w:val="clear"/>
+            <w:tcMar>
+              <w:top w:type="dxa" w:w="60"/>
+              <w:left w:type="dxa" w:w="100"/>
+              <w:bottom w:type="dxa" w:w="60"/>
+              <w:right w:type="dxa" w:w="100"/>
+            </w:tcMar>
+          </w:tcPr>
+          <w:p>
+            <w:pPr>
+              <w:spacing w:after="20"/>
+            </w:pPr>
+            <w:r>
+              <w:rPr>
+                <w:rFonts w:ascii="Calibri" w:cs="Calibri" w:eastAsia="Calibri" w:hAnsi="Calibri"/>
+                <w:b/>
+                <w:bCs/>
+                <w:color w:val="FFFFFF"/>
+                <w:sz w:val="19"/>
+                <w:szCs w:val="19"/>
+              </w:rPr>
+              <w:t xml:space="preserve">de \ vers</w:t>
+            </w:r>
+          </w:p>
+        </w:tc>
+        <w:tc>
+          <w:tcPr>
+            <w:tcW w:type="dxa" w:w="3260"/>
+            <w:shd w:fill="1F5C8B" w:val="clear"/>
+            <w:tcMar>
+              <w:top w:type="dxa" w:w="60"/>
+              <w:left w:type="dxa" w:w="100"/>
+              <w:bottom w:type="dxa" w:w="60"/>
+              <w:right w:type="dxa" w:w="100"/>
+            </w:tcMar>
+          </w:tcPr>
+          <w:p>
+            <w:pPr>
+              <w:spacing w:after="20"/>
+            </w:pPr>
+            <w:r>
+              <w:rPr>
+                <w:rFonts w:ascii="Calibri" w:cs="Calibri" w:eastAsia="Calibri" w:hAnsi="Calibri"/>
+                <w:b/>
+                <w:bCs/>
+                <w:color w:val="FFFFFF"/>
+                <w:sz w:val="19"/>
+                <w:szCs w:val="19"/>
+              </w:rPr>
+              <w:t xml:space="preserve">Zone forcée LIQUIDE</w:t>
+            </w:r>
+          </w:p>
+          <w:p>
+            <w:pPr>
+              <w:spacing w:after="20"/>
+            </w:pPr>
+            <w:r>
+              <w:rPr>
+                <w:rFonts w:ascii="Calibri" w:cs="Calibri" w:eastAsia="Calibri" w:hAnsi="Calibri"/>
+                <w:b w:val="false"/>
+                <w:bCs w:val="false"/>
+                <w:color w:val="FFFFFF"/>
+                <w:sz w:val="15"/>
+                <w:szCs w:val="15"/>
+              </w:rPr>
+              <w:t xml:space="preserve">asset : douche de décontamination (proposé — jeu actuel : « chambre pressurisée »)</w:t>
+            </w:r>
+          </w:p>
+        </w:tc>
+        <w:tc>
+          <w:tcPr>
+            <w:tcW w:type="dxa" w:w="3260"/>
+            <w:shd w:fill="1F5C8B" w:val="clear"/>
+            <w:tcMar>
+              <w:top w:type="dxa" w:w="60"/>
+              <w:left w:type="dxa" w:w="100"/>
+              <w:bottom w:type="dxa" w:w="60"/>
+              <w:right w:type="dxa" w:w="100"/>
+            </w:tcMar>
+          </w:tcPr>
+          <w:p>
+            <w:pPr>
+              <w:spacing w:after="20"/>
+            </w:pPr>
+            <w:r>
+              <w:rPr>
+                <w:rFonts w:ascii="Calibri" w:cs="Calibri" w:eastAsia="Calibri" w:hAnsi="Calibri"/>
+                <w:b/>
+                <w:bCs/>
+                <w:color w:val="FFFFFF"/>
+                <w:sz w:val="19"/>
+                <w:szCs w:val="19"/>
+              </w:rPr>
+              <w:t xml:space="preserve">Zone forcée SOLIDE</w:t>
+            </w:r>
+          </w:p>
+          <w:p>
+            <w:pPr>
+              <w:spacing w:after="20"/>
+            </w:pPr>
+            <w:r>
+              <w:rPr>
+                <w:rFonts w:ascii="Calibri" w:cs="Calibri" w:eastAsia="Calibri" w:hAnsi="Calibri"/>
+                <w:b w:val="false"/>
+                <w:bCs w:val="false"/>
+                <w:color w:val="FFFFFF"/>
+                <w:sz w:val="15"/>
+                <w:szCs w:val="15"/>
+              </w:rPr>
+              <w:t xml:space="preserve">asset : hublot brisé (déjà dans le jeu : « hublot fendu »)</w:t>
+            </w:r>
+          </w:p>
+        </w:tc>
+        <w:tc>
+          <w:tcPr>
+            <w:tcW w:type="dxa" w:w="3280"/>
+            <w:shd w:fill="1F5C8B" w:val="clear"/>
+            <w:tcMar>
+              <w:top w:type="dxa" w:w="60"/>
+              <w:left w:type="dxa" w:w="100"/>
+              <w:bottom w:type="dxa" w:w="60"/>
+              <w:right w:type="dxa" w:w="100"/>
+            </w:tcMar>
+          </w:tcPr>
+          <w:p>
+            <w:pPr>
+              <w:spacing w:after="20"/>
+            </w:pPr>
+            <w:r>
+              <w:rPr>
+                <w:rFonts w:ascii="Calibri" w:cs="Calibri" w:eastAsia="Calibri" w:hAnsi="Calibri"/>
+                <w:b/>
+                <w:bCs/>
+                <w:color w:val="FFFFFF"/>
+                <w:sz w:val="19"/>
+                <w:szCs w:val="19"/>
+              </w:rPr>
+              <w:t xml:space="preserve">Zone forcée GAZ</w:t>
+            </w:r>
+          </w:p>
+          <w:p>
+            <w:pPr>
+              <w:spacing w:after="20"/>
+            </w:pPr>
+            <w:r>
+              <w:rPr>
+                <w:rFonts w:ascii="Calibri" w:cs="Calibri" w:eastAsia="Calibri" w:hAnsi="Calibri"/>
+                <w:b w:val="false"/>
+                <w:bCs w:val="false"/>
+                <w:color w:val="FFFFFF"/>
+                <w:sz w:val="15"/>
+                <w:szCs w:val="15"/>
+              </w:rPr>
+              <w:t xml:space="preserve">asset : radiateur (proposé — jeu actuel : « conduite rompue »)</w:t>
+            </w:r>
+          </w:p>
+        </w:tc>
+      </w:tr>
+      <w:tr>
+        <w:tc>
+          <w:tcPr>
+            <w:tcW w:type="dxa" w:w="1400"/>
+            <w:shd w:fill="1F5C8B" w:val="clear"/>
+            <w:tcMar>
+              <w:top w:type="dxa" w:w="60"/>
+              <w:left w:type="dxa" w:w="100"/>
+              <w:bottom w:type="dxa" w:w="60"/>
+              <w:right w:type="dxa" w:w="100"/>
+            </w:tcMar>
+          </w:tcPr>
+          <w:p>
+            <w:pPr>
+              <w:spacing w:after="20"/>
+            </w:pPr>
+            <w:r>
+              <w:rPr>
+                <w:rFonts w:ascii="Calibri" w:cs="Calibri" w:eastAsia="Calibri" w:hAnsi="Calibri"/>
+                <w:b/>
+                <w:bCs/>
+                <w:color w:val="FFFFFF"/>
+                <w:sz w:val="19"/>
+                <w:szCs w:val="19"/>
+              </w:rPr>
+              <w:t xml:space="preserve">LIQUIDE</w:t>
+            </w:r>
+          </w:p>
+        </w:tc>
+        <w:tc>
+          <w:tcPr>
+            <w:tcW w:type="dxa" w:w="3260"/>
+            <w:tcMar>
+              <w:top w:type="dxa" w:w="60"/>
+              <w:left w:type="dxa" w:w="100"/>
+              <w:bottom w:type="dxa" w:w="60"/>
+              <w:right w:type="dxa" w:w="100"/>
+            </w:tcMar>
+          </w:tcPr>
+          <w:p>
+            <w:pPr>
+              <w:spacing w:after="80"/>
+              <w:jc w:val="center"/>
+            </w:pPr>
+            <w:r>
+              <w:rPr>
+                <w:rFonts w:ascii="Calibri" w:cs="Calibri" w:eastAsia="Calibri" w:hAnsi="Calibri"/>
+                <w:color w:val="5A6672"/>
+                <w:sz w:val="28"/>
+                <w:szCs w:val="28"/>
+              </w:rPr>
+              <w:t xml:space="preserve">⟍</w:t>
+            </w:r>
+          </w:p>
+        </w:tc>
+        <w:tc>
+          <w:tcPr>
+            <w:tcW w:type="dxa" w:w="3260"/>
+            <w:tcMar>
+              <w:top w:type="dxa" w:w="60"/>
+              <w:left w:type="dxa" w:w="100"/>
+              <w:bottom w:type="dxa" w:w="60"/>
+              <w:right w:type="dxa" w:w="100"/>
+            </w:tcMar>
+          </w:tcPr>
+          <w:p>
+            <w:pPr>
+              <w:spacing w:after="30"/>
+            </w:pPr>
+            <w:r>
+              <w:rPr>
+                <w:rFonts w:ascii="Calibri" w:cs="Calibri" w:eastAsia="Calibri" w:hAnsi="Calibri"/>
+                <w:sz w:val="20"/>
+                <w:szCs w:val="20"/>
+              </w:rPr>
+              <w:t xml:space="preserve">① Coût : aucun.</w:t>
+            </w:r>
+          </w:p>
+          <w:p>
+            <w:pPr>
+              <w:spacing w:after="40"/>
+            </w:pPr>
+            <w:r>
+              <w:rPr>
+                <w:rFonts w:ascii="Calibri" w:cs="Calibri" w:eastAsia="Calibri" w:hAnsi="Calibri"/>
+                <w:sz w:val="20"/>
+                <w:szCs w:val="20"/>
+              </w:rPr>
+              <w:t xml:space="preserve">② Quand : le CENTRE du corps entre dans la zone (seuil 70 % du volume : recommandé, à implémenter). Prise en 0,45 s, tout le corps. État verrouillé tant qu’on est dedans ; il PERSISTE à la sortie, jusqu’à un changement volontaire.</w:t>
+            </w:r>
+          </w:p>
+        </w:tc>
+        <w:tc>
+          <w:tcPr>
+            <w:tcW w:type="dxa" w:w="3280"/>
+            <w:tcMar>
+              <w:top w:type="dxa" w:w="60"/>
+              <w:left w:type="dxa" w:w="100"/>
+              <w:bottom w:type="dxa" w:w="60"/>
+              <w:right w:type="dxa" w:w="100"/>
+            </w:tcMar>
+          </w:tcPr>
+          <w:p>
+            <w:pPr>
+              <w:spacing w:after="30"/>
+            </w:pPr>
+            <w:r>
+              <w:rPr>
+                <w:rFonts w:ascii="Calibri" w:cs="Calibri" w:eastAsia="Calibri" w:hAnsi="Calibri"/>
+                <w:sz w:val="20"/>
+                <w:szCs w:val="20"/>
+              </w:rPr>
+              <w:t xml:space="preserve">① Coût : la conversion est gratuite ; l’ÉTAT gazeux se paie ensuite (−2 part./s, grille qui essore, dashs comptés).</w:t>
+            </w:r>
+          </w:p>
+          <w:p>
+            <w:pPr>
+              <w:spacing w:after="40"/>
+            </w:pPr>
+            <w:r>
+              <w:rPr>
+                <w:rFonts w:ascii="Calibri" w:cs="Calibri" w:eastAsia="Calibri" w:hAnsi="Calibri"/>
+                <w:sz w:val="20"/>
+                <w:szCs w:val="20"/>
+              </w:rPr>
+              <w:t xml:space="preserve">② Quand : centre du corps dans la zone. Vaporisation 0,5 s, corps entier. Verrouillé dedans, persiste à la sortie.</w:t>
+            </w:r>
+          </w:p>
+        </w:tc>
+      </w:tr>
+      <w:tr>
+        <w:tc>
+          <w:tcPr>
+            <w:tcW w:type="dxa" w:w="1400"/>
+            <w:shd w:fill="1F5C8B" w:val="clear"/>
+            <w:tcMar>
+              <w:top w:type="dxa" w:w="60"/>
+              <w:left w:type="dxa" w:w="100"/>
+              <w:bottom w:type="dxa" w:w="60"/>
+              <w:right w:type="dxa" w:w="100"/>
+            </w:tcMar>
+          </w:tcPr>
+          <w:p>
+            <w:pPr>
+              <w:spacing w:after="20"/>
+            </w:pPr>
+            <w:r>
+              <w:rPr>
+                <w:rFonts w:ascii="Calibri" w:cs="Calibri" w:eastAsia="Calibri" w:hAnsi="Calibri"/>
+                <w:b/>
+                <w:bCs/>
+                <w:color w:val="FFFFFF"/>
+                <w:sz w:val="19"/>
+                <w:szCs w:val="19"/>
+              </w:rPr>
+              <w:t xml:space="preserve">SOLIDE</w:t>
+            </w:r>
+          </w:p>
+        </w:tc>
+        <w:tc>
+          <w:tcPr>
+            <w:tcW w:type="dxa" w:w="3260"/>
+            <w:tcMar>
+              <w:top w:type="dxa" w:w="60"/>
+              <w:left w:type="dxa" w:w="100"/>
+              <w:bottom w:type="dxa" w:w="60"/>
+              <w:right w:type="dxa" w:w="100"/>
+            </w:tcMar>
+          </w:tcPr>
+          <w:p>
+            <w:pPr>
+              <w:spacing w:after="30"/>
+            </w:pPr>
+            <w:r>
+              <w:rPr>
+                <w:rFonts w:ascii="Calibri" w:cs="Calibri" w:eastAsia="Calibri" w:hAnsi="Calibri"/>
+                <w:sz w:val="20"/>
+                <w:szCs w:val="20"/>
+              </w:rPr>
+              <w:t xml:space="preserve">① Coût : aucun.</w:t>
+            </w:r>
+          </w:p>
+          <w:p>
+            <w:pPr>
+              <w:spacing w:after="40"/>
+            </w:pPr>
+            <w:r>
+              <w:rPr>
+                <w:rFonts w:ascii="Calibri" w:cs="Calibri" w:eastAsia="Calibri" w:hAnsi="Calibri"/>
+                <w:sz w:val="20"/>
+                <w:szCs w:val="20"/>
+              </w:rPr>
+              <w:t xml:space="preserve">② Quand : centre du corps dans la zone. Dégel 2,5 s (le bloc fond sur son élan), corps entier. Verrouillé dedans, persiste à la sortie.</w:t>
+            </w:r>
+          </w:p>
+        </w:tc>
+        <w:tc>
+          <w:tcPr>
+            <w:tcW w:type="dxa" w:w="3260"/>
+            <w:tcMar>
+              <w:top w:type="dxa" w:w="60"/>
+              <w:left w:type="dxa" w:w="100"/>
+              <w:bottom w:type="dxa" w:w="60"/>
+              <w:right w:type="dxa" w:w="100"/>
+            </w:tcMar>
+          </w:tcPr>
+          <w:p>
+            <w:pPr>
+              <w:spacing w:after="80"/>
+              <w:jc w:val="center"/>
+            </w:pPr>
+            <w:r>
+              <w:rPr>
+                <w:rFonts w:ascii="Calibri" w:cs="Calibri" w:eastAsia="Calibri" w:hAnsi="Calibri"/>
+                <w:color w:val="5A6672"/>
+                <w:sz w:val="28"/>
+                <w:szCs w:val="28"/>
+              </w:rPr>
+              <w:t xml:space="preserve">⟍</w:t>
+            </w:r>
+          </w:p>
+        </w:tc>
+        <w:tc>
+          <w:tcPr>
+            <w:tcW w:type="dxa" w:w="3280"/>
+            <w:tcMar>
+              <w:top w:type="dxa" w:w="60"/>
+              <w:left w:type="dxa" w:w="100"/>
+              <w:bottom w:type="dxa" w:w="60"/>
+              <w:right w:type="dxa" w:w="100"/>
+            </w:tcMar>
+          </w:tcPr>
+          <w:p>
+            <w:pPr>
+              <w:spacing w:after="30"/>
+            </w:pPr>
+            <w:r>
+              <w:rPr>
+                <w:rFonts w:ascii="Calibri" w:cs="Calibri" w:eastAsia="Calibri" w:hAnsi="Calibri"/>
+                <w:sz w:val="20"/>
+                <w:szCs w:val="20"/>
+              </w:rPr>
+              <w:t xml:space="preserve">① Coût : gratuit à la conversion ; l’état gazeux se paie ensuite.</w:t>
+            </w:r>
+          </w:p>
+          <w:p>
+            <w:pPr>
+              <w:spacing w:after="40"/>
+            </w:pPr>
+            <w:r>
+              <w:rPr>
+                <w:rFonts w:ascii="Calibri" w:cs="Calibri" w:eastAsia="Calibri" w:hAnsi="Calibri"/>
+                <w:sz w:val="20"/>
+                <w:szCs w:val="20"/>
+              </w:rPr>
+              <w:t xml:space="preserve">② Quand : centre du corps dans la zone. Pas de sublimation directe : dégel 2,5 s PUIS vaporisation 0,5 s (enchaînés automatiquement par la zone).</w:t>
+            </w:r>
+          </w:p>
+        </w:tc>
+      </w:tr>
+      <w:tr>
+        <w:tc>
+          <w:tcPr>
+            <w:tcW w:type="dxa" w:w="1400"/>
+            <w:shd w:fill="1F5C8B" w:val="clear"/>
+            <w:tcMar>
+              <w:top w:type="dxa" w:w="60"/>
+              <w:left w:type="dxa" w:w="100"/>
+              <w:bottom w:type="dxa" w:w="60"/>
+              <w:right w:type="dxa" w:w="100"/>
+            </w:tcMar>
+          </w:tcPr>
+          <w:p>
+            <w:pPr>
+              <w:spacing w:after="20"/>
+            </w:pPr>
+            <w:r>
+              <w:rPr>
+                <w:rFonts w:ascii="Calibri" w:cs="Calibri" w:eastAsia="Calibri" w:hAnsi="Calibri"/>
+                <w:b/>
+                <w:bCs/>
+                <w:color w:val="FFFFFF"/>
+                <w:sz w:val="19"/>
+                <w:szCs w:val="19"/>
+              </w:rPr>
+              <w:t xml:space="preserve">GAZEUX</w:t>
+            </w:r>
+          </w:p>
+        </w:tc>
+        <w:tc>
+          <w:tcPr>
+            <w:tcW w:type="dxa" w:w="3260"/>
+            <w:tcMar>
+              <w:top w:type="dxa" w:w="60"/>
+              <w:left w:type="dxa" w:w="100"/>
+              <w:bottom w:type="dxa" w:w="60"/>
+              <w:right w:type="dxa" w:w="100"/>
+            </w:tcMar>
+          </w:tcPr>
+          <w:p>
+            <w:pPr>
+              <w:spacing w:after="30"/>
+            </w:pPr>
+            <w:r>
+              <w:rPr>
+                <w:rFonts w:ascii="Calibri" w:cs="Calibri" w:eastAsia="Calibri" w:hAnsi="Calibri"/>
+                <w:sz w:val="20"/>
+                <w:szCs w:val="20"/>
+              </w:rPr>
+              <w:t xml:space="preserve">① Coût : aucun (les pertes ont déjà eu lieu pendant l’état vapeur).</w:t>
+            </w:r>
+          </w:p>
+          <w:p>
+            <w:pPr>
+              <w:spacing w:after="40"/>
+            </w:pPr>
+            <w:r>
+              <w:rPr>
+                <w:rFonts w:ascii="Calibri" w:cs="Calibri" w:eastAsia="Calibri" w:hAnsi="Calibri"/>
+                <w:sz w:val="20"/>
+                <w:szCs w:val="20"/>
+              </w:rPr>
+              <w:t xml:space="preserve">② Quand : centre du corps dans la zone. Condensation 0,9 s + regroupement (les gouttelettes sont rappelées vers le corps, 420 u/s²).</w:t>
+            </w:r>
+          </w:p>
+        </w:tc>
+        <w:tc>
+          <w:tcPr>
+            <w:tcW w:type="dxa" w:w="3260"/>
+            <w:tcMar>
+              <w:top w:type="dxa" w:w="60"/>
+              <w:left w:type="dxa" w:w="100"/>
+              <w:bottom w:type="dxa" w:w="60"/>
+              <w:right w:type="dxa" w:w="100"/>
+            </w:tcMar>
+          </w:tcPr>
+          <w:p>
+            <w:pPr>
+              <w:spacing w:after="30"/>
+            </w:pPr>
+            <w:r>
+              <w:rPr>
+                <w:rFonts w:ascii="Calibri" w:cs="Calibri" w:eastAsia="Calibri" w:hAnsi="Calibri"/>
+                <w:sz w:val="20"/>
+                <w:szCs w:val="20"/>
+              </w:rPr>
+              <w:t xml:space="preserve">① Coût : aucun.</w:t>
+            </w:r>
+          </w:p>
+          <w:p>
+            <w:pPr>
+              <w:spacing w:after="40"/>
+            </w:pPr>
+            <w:r>
+              <w:rPr>
+                <w:rFonts w:ascii="Calibri" w:cs="Calibri" w:eastAsia="Calibri" w:hAnsi="Calibri"/>
+                <w:sz w:val="20"/>
+                <w:szCs w:val="20"/>
+              </w:rPr>
+              <w:t xml:space="preserve">② Quand : centre du corps dans la zone. Pas de direct : condensation 0,9 s PUIS prise 0,45 s (enchaînées par la zone).</w:t>
+            </w:r>
+          </w:p>
+        </w:tc>
+        <w:tc>
+          <w:tcPr>
+            <w:tcW w:type="dxa" w:w="3280"/>
+            <w:tcMar>
+              <w:top w:type="dxa" w:w="60"/>
+              <w:left w:type="dxa" w:w="100"/>
+              <w:bottom w:type="dxa" w:w="60"/>
+              <w:right w:type="dxa" w:w="100"/>
+            </w:tcMar>
+          </w:tcPr>
+          <w:p>
+            <w:pPr>
+              <w:spacing w:after="80"/>
+              <w:jc w:val="center"/>
+            </w:pPr>
+            <w:r>
+              <w:rPr>
+                <w:rFonts w:ascii="Calibri" w:cs="Calibri" w:eastAsia="Calibri" w:hAnsi="Calibri"/>
+                <w:color w:val="5A6672"/>
+                <w:sz w:val="28"/>
+                <w:szCs w:val="28"/>
+              </w:rPr>
+              <w:t xml:space="preserve">⟍</w:t>
+            </w:r>
+          </w:p>
+        </w:tc>
+      </w:tr>
+    </w:tbl>
+    <w:p>
+      <w:pPr>
+        <w:pStyle w:val="Heading1"/>
+      </w:pPr>
+      <w:r>
+        <w:rPr>
+          <w:rFonts w:ascii="Calibri" w:cs="Calibri" w:eastAsia="Calibri" w:hAnsi="Calibri"/>
+          <w:b/>
+          <w:bCs/>
+          <w:color w:val="1F5C8B"/>
+          <w:sz w:val="26"/>
+          <w:szCs w:val="26"/>
+        </w:rPr>
+        <w:t xml:space="preserve">2. Transformations par BLOCS (matériaux à aura)</w:t>
+      </w:r>
+    </w:p>
+    <w:p>
+      <w:pPr>
+        <w:spacing w:after="80"/>
+      </w:pPr>
+      <w:r>
+        <w:rPr>
+          <w:rFonts w:ascii="Calibri" w:cs="Calibri" w:eastAsia="Calibri" w:hAnsi="Calibri"/>
+          <w:color w:val="5A6672"/>
+          <w:sz w:val="18"/>
+          <w:szCs w:val="18"/>
+        </w:rPr>
+        <w:t xml:space="preserve">Les blocs n’imposent rien au corps entier : leur aura travaille PARTICULE PAR PARTICULE — on peut n’être que partiellement gelé ou vaporisé, et la traversée rapide limite l’effet.</w:t>
       </w:r>
     </w:p>
     <w:tbl>
@@ -79,9 +680,9 @@
       <w:tblGrid>
         <w:gridCol w:w="1750"/>
         <w:gridCol w:w="1150"/>
-        <w:gridCol w:w="3300"/>
-        <w:gridCol w:w="2650"/>
-        <w:gridCol w:w="2350"/>
+        <w:gridCol w:w="3600"/>
+        <w:gridCol w:w="2500"/>
+        <w:gridCol w:w="2200"/>
       </w:tblGrid>
       <w:tr>
         <w:tc>
@@ -97,7 +698,7 @@
           </w:tcPr>
           <w:p>
             <w:pPr>
-              <w:spacing w:after="80"/>
+              <w:spacing w:after="20"/>
             </w:pPr>
             <w:r>
               <w:rPr>
@@ -108,7 +709,7 @@
                 <w:sz w:val="19"/>
                 <w:szCs w:val="19"/>
               </w:rPr>
-              <w:t xml:space="preserve">Cause</w:t>
+              <w:t xml:space="preserve">Bloc</w:t>
             </w:r>
           </w:p>
         </w:tc>
@@ -125,7 +726,7 @@
           </w:tcPr>
           <w:p>
             <w:pPr>
-              <w:spacing w:after="80"/>
+              <w:spacing w:after="20"/>
             </w:pPr>
             <w:r>
               <w:rPr>
@@ -142,7 +743,7 @@
         </w:tc>
         <w:tc>
           <w:tcPr>
-            <w:tcW w:type="dxa" w:w="3300"/>
+            <w:tcW w:type="dxa" w:w="3600"/>
             <w:shd w:fill="1F5C8B" w:val="clear"/>
             <w:tcMar>
               <w:top w:type="dxa" w:w="60"/>
@@ -153,7 +754,7 @@
           </w:tcPr>
           <w:p>
             <w:pPr>
-              <w:spacing w:after="80"/>
+              <w:spacing w:after="20"/>
             </w:pPr>
             <w:r>
               <w:rPr>
@@ -164,13 +765,13 @@
                 <w:sz w:val="19"/>
                 <w:szCs w:val="19"/>
               </w:rPr>
-              <w:t xml:space="preserve">Déclencheur (règle actuelle)</w:t>
-            </w:r>
-          </w:p>
-        </w:tc>
-        <w:tc>
-          <w:tcPr>
-            <w:tcW w:type="dxa" w:w="2650"/>
+              <w:t xml:space="preserve">Règle actuelle</w:t>
+            </w:r>
+          </w:p>
+        </w:tc>
+        <w:tc>
+          <w:tcPr>
+            <w:tcW w:type="dxa" w:w="2500"/>
             <w:shd w:fill="1F5C8B" w:val="clear"/>
             <w:tcMar>
               <w:top w:type="dxa" w:w="60"/>
@@ -181,7 +782,7 @@
           </w:tcPr>
           <w:p>
             <w:pPr>
-              <w:spacing w:after="80"/>
+              <w:spacing w:after="20"/>
             </w:pPr>
             <w:r>
               <w:rPr>
@@ -192,13 +793,13 @@
                 <w:sz w:val="19"/>
                 <w:szCs w:val="19"/>
               </w:rPr>
-              <w:t xml:space="preserve">Vitesse actuelle</w:t>
-            </w:r>
-          </w:p>
-        </w:tc>
-        <w:tc>
-          <w:tcPr>
-            <w:tcW w:type="dxa" w:w="2350"/>
+              <w:t xml:space="preserve">Vitesse</w:t>
+            </w:r>
+          </w:p>
+        </w:tc>
+        <w:tc>
+          <w:tcPr>
+            <w:tcW w:type="dxa" w:w="2200"/>
             <w:shd w:fill="1F5C8B" w:val="clear"/>
             <w:tcMar>
               <w:top w:type="dxa" w:w="60"/>
@@ -209,7 +810,7 @@
           </w:tcPr>
           <w:p>
             <w:pPr>
-              <w:spacing w:after="80"/>
+              <w:spacing w:after="20"/>
             </w:pPr>
             <w:r>
               <w:rPr>
@@ -220,7 +821,7 @@
                 <w:sz w:val="19"/>
                 <w:szCs w:val="19"/>
               </w:rPr>
-              <w:t xml:space="preserve">Seuil (à définir)</w:t>
+              <w:t xml:space="preserve">Seuil</w:t>
             </w:r>
           </w:p>
         </w:tc>
@@ -229,6 +830,254 @@
         <w:tc>
           <w:tcPr>
             <w:tcW w:type="dxa" w:w="1750"/>
+            <w:tcMar>
+              <w:top w:type="dxa" w:w="60"/>
+              <w:left w:type="dxa" w:w="100"/>
+              <w:bottom w:type="dxa" w:w="60"/>
+              <w:right w:type="dxa" w:w="100"/>
+            </w:tcMar>
+          </w:tcPr>
+          <w:p>
+            <w:pPr>
+              <w:spacing w:after="40"/>
+            </w:pPr>
+            <w:r>
+              <w:rPr>
+                <w:rFonts w:ascii="Calibri" w:cs="Calibri" w:eastAsia="Calibri" w:hAnsi="Calibri"/>
+                <w:b/>
+                <w:bCs/>
+                <w:sz w:val="20"/>
+                <w:szCs w:val="20"/>
+              </w:rPr>
+              <w:t xml:space="preserve">Hublot / plaque froide</w:t>
+            </w:r>
+          </w:p>
+        </w:tc>
+        <w:tc>
+          <w:tcPr>
+            <w:tcW w:type="dxa" w:w="1150"/>
+            <w:tcMar>
+              <w:top w:type="dxa" w:w="60"/>
+              <w:left w:type="dxa" w:w="100"/>
+              <w:bottom w:type="dxa" w:w="60"/>
+              <w:right w:type="dxa" w:w="100"/>
+            </w:tcMar>
+          </w:tcPr>
+          <w:p>
+            <w:pPr>
+              <w:spacing w:after="40"/>
+            </w:pPr>
+            <w:r>
+              <w:rPr>
+                <w:rFonts w:ascii="Calibri" w:cs="Calibri" w:eastAsia="Calibri" w:hAnsi="Calibri"/>
+                <w:sz w:val="20"/>
+                <w:szCs w:val="20"/>
+              </w:rPr>
+              <w:t xml:space="preserve">SOLIDE</w:t>
+            </w:r>
+          </w:p>
+        </w:tc>
+        <w:tc>
+          <w:tcPr>
+            <w:tcW w:type="dxa" w:w="3600"/>
+            <w:tcMar>
+              <w:top w:type="dxa" w:w="60"/>
+              <w:left w:type="dxa" w:w="100"/>
+              <w:bottom w:type="dxa" w:w="60"/>
+              <w:right w:type="dxa" w:w="100"/>
+            </w:tcMar>
+          </w:tcPr>
+          <w:p>
+            <w:pPr>
+              <w:spacing w:after="40"/>
+            </w:pPr>
+            <w:r>
+              <w:rPr>
+                <w:rFonts w:ascii="Calibri" w:cs="Calibri" w:eastAsia="Calibri" w:hAnsi="Calibri"/>
+                <w:sz w:val="20"/>
+                <w:szCs w:val="20"/>
+              </w:rPr>
+              <w:t xml:space="preserve">Aura de gel, PAR PARTICULE : chaque goutte exposée givre (traînée) puis gèle — le corps peut être partiellement gelé. La glace qui touche la plaque est SOUDÉE net. La vapeur y condense vite, et la vapeur perdue ailleurs y perle en rosée récupérable.</w:t>
+            </w:r>
+          </w:p>
+        </w:tc>
+        <w:tc>
+          <w:tcPr>
+            <w:tcW w:type="dxa" w:w="2500"/>
+            <w:tcMar>
+              <w:top w:type="dxa" w:w="60"/>
+              <w:left w:type="dxa" w:w="100"/>
+              <w:bottom w:type="dxa" w:w="60"/>
+              <w:right w:type="dxa" w:w="100"/>
+            </w:tcMar>
+          </w:tcPr>
+          <w:p>
+            <w:pPr>
+              <w:spacing w:after="40"/>
+            </w:pPr>
+            <w:r>
+              <w:rPr>
+                <w:rFonts w:ascii="Calibri" w:cs="Calibri" w:eastAsia="Calibri" w:hAnsi="Calibri"/>
+                <w:sz w:val="20"/>
+                <w:szCs w:val="20"/>
+              </w:rPr>
+              <w:t xml:space="preserve">1,2 s à plein bain (freezeTime) ; givre : traînée 3/s (frostSluggish)</w:t>
+            </w:r>
+          </w:p>
+        </w:tc>
+        <w:tc>
+          <w:tcPr>
+            <w:tcW w:type="dxa" w:w="2200"/>
+            <w:tcMar>
+              <w:top w:type="dxa" w:w="60"/>
+              <w:left w:type="dxa" w:w="100"/>
+              <w:bottom w:type="dxa" w:w="60"/>
+              <w:right w:type="dxa" w:w="100"/>
+            </w:tcMar>
+          </w:tcPr>
+          <w:p>
+            <w:pPr>
+              <w:spacing w:after="40"/>
+            </w:pPr>
+            <w:r>
+              <w:rPr>
+                <w:rFonts w:ascii="Calibri" w:cs="Calibri" w:eastAsia="Calibri" w:hAnsi="Calibri"/>
+                <w:sz w:val="20"/>
+                <w:szCs w:val="20"/>
+              </w:rPr>
+              <w:t xml:space="preserve">aucun : par particule</w:t>
+            </w:r>
+          </w:p>
+        </w:tc>
+      </w:tr>
+      <w:tr>
+        <w:tc>
+          <w:tcPr>
+            <w:tcW w:type="dxa" w:w="1750"/>
+            <w:tcMar>
+              <w:top w:type="dxa" w:w="60"/>
+              <w:left w:type="dxa" w:w="100"/>
+              <w:bottom w:type="dxa" w:w="60"/>
+              <w:right w:type="dxa" w:w="100"/>
+            </w:tcMar>
+          </w:tcPr>
+          <w:p>
+            <w:pPr>
+              <w:spacing w:after="40"/>
+            </w:pPr>
+            <w:r>
+              <w:rPr>
+                <w:rFonts w:ascii="Calibri" w:cs="Calibri" w:eastAsia="Calibri" w:hAnsi="Calibri"/>
+                <w:b/>
+                <w:bCs/>
+                <w:sz w:val="20"/>
+                <w:szCs w:val="20"/>
+              </w:rPr>
+              <w:t xml:space="preserve">Radiateur</w:t>
+            </w:r>
+          </w:p>
+        </w:tc>
+        <w:tc>
+          <w:tcPr>
+            <w:tcW w:type="dxa" w:w="1150"/>
+            <w:tcMar>
+              <w:top w:type="dxa" w:w="60"/>
+              <w:left w:type="dxa" w:w="100"/>
+              <w:bottom w:type="dxa" w:w="60"/>
+              <w:right w:type="dxa" w:w="100"/>
+            </w:tcMar>
+          </w:tcPr>
+          <w:p>
+            <w:pPr>
+              <w:spacing w:after="40"/>
+            </w:pPr>
+            <w:r>
+              <w:rPr>
+                <w:rFonts w:ascii="Calibri" w:cs="Calibri" w:eastAsia="Calibri" w:hAnsi="Calibri"/>
+                <w:sz w:val="20"/>
+                <w:szCs w:val="20"/>
+              </w:rPr>
+              <w:t xml:space="preserve">GAZEUX</w:t>
+            </w:r>
+          </w:p>
+        </w:tc>
+        <w:tc>
+          <w:tcPr>
+            <w:tcW w:type="dxa" w:w="3600"/>
+            <w:tcMar>
+              <w:top w:type="dxa" w:w="60"/>
+              <w:left w:type="dxa" w:w="100"/>
+              <w:bottom w:type="dxa" w:w="60"/>
+              <w:right w:type="dxa" w:w="100"/>
+            </w:tcMar>
+          </w:tcPr>
+          <w:p>
+            <w:pPr>
+              <w:spacing w:after="40"/>
+            </w:pPr>
+            <w:r>
+              <w:rPr>
+                <w:rFonts w:ascii="Calibri" w:cs="Calibri" w:eastAsia="Calibri" w:hAnsi="Calibri"/>
+                <w:sz w:val="20"/>
+                <w:szCs w:val="20"/>
+              </w:rPr>
+              <w:t xml:space="preserve">Aura de chaleur, PAR PARTICULE : l’eau frémit puis se vaporise, qu’on le veuille ou non. Dégèle la glace (libère un bloc soudé). La vapeur qui FRÔLE le halo recharge un dash (+1 impulsion offerte). La vapeur qui s’attarde s’évapore (perdue).</w:t>
+            </w:r>
+          </w:p>
+        </w:tc>
+        <w:tc>
+          <w:tcPr>
+            <w:tcW w:type="dxa" w:w="2500"/>
+            <w:tcMar>
+              <w:top w:type="dxa" w:w="60"/>
+              <w:left w:type="dxa" w:w="100"/>
+              <w:bottom w:type="dxa" w:w="60"/>
+              <w:right w:type="dxa" w:w="100"/>
+            </w:tcMar>
+          </w:tcPr>
+          <w:p>
+            <w:pPr>
+              <w:spacing w:after="40"/>
+            </w:pPr>
+            <w:r>
+              <w:rPr>
+                <w:rFonts w:ascii="Calibri" w:cs="Calibri" w:eastAsia="Calibri" w:hAnsi="Calibri"/>
+                <w:sz w:val="20"/>
+                <w:szCs w:val="20"/>
+              </w:rPr>
+              <w:t xml:space="preserve">1,2 s à plein bain (boilTime) ; dégel forcé 0,35 s (heatThawTime)</w:t>
+            </w:r>
+          </w:p>
+        </w:tc>
+        <w:tc>
+          <w:tcPr>
+            <w:tcW w:type="dxa" w:w="2200"/>
+            <w:tcMar>
+              <w:top w:type="dxa" w:w="60"/>
+              <w:left w:type="dxa" w:w="100"/>
+              <w:bottom w:type="dxa" w:w="60"/>
+              <w:right w:type="dxa" w:w="100"/>
+            </w:tcMar>
+          </w:tcPr>
+          <w:p>
+            <w:pPr>
+              <w:spacing w:after="40"/>
+            </w:pPr>
+            <w:r>
+              <w:rPr>
+                <w:rFonts w:ascii="Calibri" w:cs="Calibri" w:eastAsia="Calibri" w:hAnsi="Calibri"/>
+                <w:sz w:val="20"/>
+                <w:szCs w:val="20"/>
+              </w:rPr>
+              <w:t xml:space="preserve">aucun : par particule</w:t>
+            </w:r>
+          </w:p>
+        </w:tc>
+      </w:tr>
+      <w:tr>
+        <w:tc>
+          <w:tcPr>
+            <w:tcW w:type="dxa" w:w="1750"/>
             <w:shd w:fill="FFF3D6" w:val="clear"/>
             <w:tcMar>
               <w:top w:type="dxa" w:w="60"/>
@@ -239,7 +1088,7 @@
           </w:tcPr>
           <w:p>
             <w:pPr>
-              <w:spacing w:after="20"/>
+              <w:spacing w:after="30"/>
             </w:pPr>
             <w:r>
               <w:rPr>
@@ -265,7 +1114,7 @@
                 <w:sz w:val="17"/>
                 <w:szCs w:val="17"/>
               </w:rPr>
-              <w:t xml:space="preserve">n’existe pas encore</w:t>
+              <w:t xml:space="preserve">n’existe pas encore — proposition</w:t>
             </w:r>
           </w:p>
         </w:tc>
@@ -296,7 +1145,7 @@
         </w:tc>
         <w:tc>
           <w:tcPr>
-            <w:tcW w:type="dxa" w:w="3300"/>
+            <w:tcW w:type="dxa" w:w="3600"/>
             <w:shd w:fill="FFF3D6" w:val="clear"/>
             <w:tcMar>
               <w:top w:type="dxa" w:w="60"/>
@@ -315,13 +1164,13 @@
                 <w:sz w:val="20"/>
                 <w:szCs w:val="20"/>
               </w:rPr>
-              <w:t xml:space="preserve">Proposition : jet vertical qui recondense tout ce qui le traverse. Équivalents actuels : zone EAU (« chambre pressurisée ») ; le radiateur dégèle la glace.</w:t>
-            </w:r>
-          </w:p>
-        </w:tc>
-        <w:tc>
-          <w:tcPr>
-            <w:tcW w:type="dxa" w:w="2650"/>
+              <w:t xml:space="preserve">Proposition : une buse qui arrose vers le bas ; tout ce qui traverse le jet redevient EAU (glace dégelée, vapeur condensée). Le « reset d’état » posé par le level designer — l’inverse exact du radiateur, comme la membrane est l’inverse de la grille.</w:t>
+            </w:r>
+          </w:p>
+        </w:tc>
+        <w:tc>
+          <w:tcPr>
+            <w:tcW w:type="dxa" w:w="2500"/>
             <w:shd w:fill="FFF3D6" w:val="clear"/>
             <w:tcMar>
               <w:top w:type="dxa" w:w="60"/>
@@ -340,13 +1189,13 @@
                 <w:sz w:val="20"/>
                 <w:szCs w:val="20"/>
               </w:rPr>
-              <w:t xml:space="preserve">—</w:t>
-            </w:r>
-          </w:p>
-        </w:tc>
-        <w:tc>
-          <w:tcPr>
-            <w:tcW w:type="dxa" w:w="2350"/>
+              <w:t xml:space="preserve">à définir (suggestion : 0,5 s dans le jet)</w:t>
+            </w:r>
+          </w:p>
+        </w:tc>
+        <w:tc>
+          <w:tcPr>
+            <w:tcW w:type="dxa" w:w="2200"/>
             <w:shd w:fill="FFF3D6" w:val="clear"/>
             <w:tcMar>
               <w:top w:type="dxa" w:w="60"/>
@@ -366,706 +1215,6 @@
                 <w:szCs w:val="20"/>
               </w:rPr>
               <w:t xml:space="preserve">70 % du volume sous le jet (proposé)</w:t>
-            </w:r>
-          </w:p>
-        </w:tc>
-      </w:tr>
-      <w:tr>
-        <w:tc>
-          <w:tcPr>
-            <w:tcW w:type="dxa" w:w="1750"/>
-            <w:tcMar>
-              <w:top w:type="dxa" w:w="60"/>
-              <w:left w:type="dxa" w:w="100"/>
-              <w:bottom w:type="dxa" w:w="60"/>
-              <w:right w:type="dxa" w:w="100"/>
-            </w:tcMar>
-          </w:tcPr>
-          <w:p>
-            <w:pPr>
-              <w:spacing w:after="20"/>
-            </w:pPr>
-            <w:r>
-              <w:rPr>
-                <w:rFonts w:ascii="Calibri" w:cs="Calibri" w:eastAsia="Calibri" w:hAnsi="Calibri"/>
-                <w:b/>
-                <w:bCs/>
-                <w:sz w:val="20"/>
-                <w:szCs w:val="20"/>
-              </w:rPr>
-              <w:t xml:space="preserve">Hublot brisé / plaque froide</w:t>
-            </w:r>
-          </w:p>
-          <w:p>
-            <w:pPr>
-              <w:spacing w:after="40"/>
-            </w:pPr>
-            <w:r>
-              <w:rPr>
-                <w:rFonts w:ascii="Calibri" w:cs="Calibri" w:eastAsia="Calibri" w:hAnsi="Calibri"/>
-                <w:i/>
-                <w:iCs/>
-                <w:color w:val="5A6672"/>
-                <w:sz w:val="17"/>
-                <w:szCs w:val="17"/>
-              </w:rPr>
-              <w:t xml:space="preserve">matériau</w:t>
-            </w:r>
-          </w:p>
-        </w:tc>
-        <w:tc>
-          <w:tcPr>
-            <w:tcW w:type="dxa" w:w="1150"/>
-            <w:tcMar>
-              <w:top w:type="dxa" w:w="60"/>
-              <w:left w:type="dxa" w:w="100"/>
-              <w:bottom w:type="dxa" w:w="60"/>
-              <w:right w:type="dxa" w:w="100"/>
-            </w:tcMar>
-          </w:tcPr>
-          <w:p>
-            <w:pPr>
-              <w:spacing w:after="40"/>
-            </w:pPr>
-            <w:r>
-              <w:rPr>
-                <w:rFonts w:ascii="Calibri" w:cs="Calibri" w:eastAsia="Calibri" w:hAnsi="Calibri"/>
-                <w:sz w:val="20"/>
-                <w:szCs w:val="20"/>
-              </w:rPr>
-              <w:t xml:space="preserve">SOLIDE</w:t>
-            </w:r>
-          </w:p>
-        </w:tc>
-        <w:tc>
-          <w:tcPr>
-            <w:tcW w:type="dxa" w:w="3300"/>
-            <w:tcMar>
-              <w:top w:type="dxa" w:w="60"/>
-              <w:left w:type="dxa" w:w="100"/>
-              <w:bottom w:type="dxa" w:w="60"/>
-              <w:right w:type="dxa" w:w="100"/>
-            </w:tcMar>
-          </w:tcPr>
-          <w:p>
-            <w:pPr>
-              <w:spacing w:after="40"/>
-            </w:pPr>
-            <w:r>
-              <w:rPr>
-                <w:rFonts w:ascii="Calibri" w:cs="Calibri" w:eastAsia="Calibri" w:hAnsi="Calibri"/>
-                <w:sz w:val="20"/>
-                <w:szCs w:val="20"/>
-              </w:rPr>
-              <w:t xml:space="preserve">Aura de gel, PAR PARTICULE : chaque goutte exposée givre puis gèle. La glace qui touche la plaque est soudée net. La vapeur y condense, et la vapeur perdue ailleurs y perle en rosée.</w:t>
-            </w:r>
-          </w:p>
-        </w:tc>
-        <w:tc>
-          <w:tcPr>
-            <w:tcW w:type="dxa" w:w="2650"/>
-            <w:tcMar>
-              <w:top w:type="dxa" w:w="60"/>
-              <w:left w:type="dxa" w:w="100"/>
-              <w:bottom w:type="dxa" w:w="60"/>
-              <w:right w:type="dxa" w:w="100"/>
-            </w:tcMar>
-          </w:tcPr>
-          <w:p>
-            <w:pPr>
-              <w:spacing w:after="40"/>
-            </w:pPr>
-            <w:r>
-              <w:rPr>
-                <w:rFonts w:ascii="Calibri" w:cs="Calibri" w:eastAsia="Calibri" w:hAnsi="Calibri"/>
-                <w:sz w:val="20"/>
-                <w:szCs w:val="20"/>
-              </w:rPr>
-              <w:t xml:space="preserve">1,2 s à plein bain (freezeTime) ; givre = traînée avant la prise (frostSluggish 3/s)</w:t>
-            </w:r>
-          </w:p>
-        </w:tc>
-        <w:tc>
-          <w:tcPr>
-            <w:tcW w:type="dxa" w:w="2350"/>
-            <w:tcMar>
-              <w:top w:type="dxa" w:w="60"/>
-              <w:left w:type="dxa" w:w="100"/>
-              <w:bottom w:type="dxa" w:w="60"/>
-              <w:right w:type="dxa" w:w="100"/>
-            </w:tcMar>
-          </w:tcPr>
-          <w:p>
-            <w:pPr>
-              <w:spacing w:after="40"/>
-            </w:pPr>
-            <w:r>
-              <w:rPr>
-                <w:rFonts w:ascii="Calibri" w:cs="Calibri" w:eastAsia="Calibri" w:hAnsi="Calibri"/>
-                <w:sz w:val="20"/>
-                <w:szCs w:val="20"/>
-              </w:rPr>
-              <w:t xml:space="preserve">aucun (par particule)</w:t>
-            </w:r>
-          </w:p>
-        </w:tc>
-      </w:tr>
-      <w:tr>
-        <w:tc>
-          <w:tcPr>
-            <w:tcW w:type="dxa" w:w="1750"/>
-            <w:tcMar>
-              <w:top w:type="dxa" w:w="60"/>
-              <w:left w:type="dxa" w:w="100"/>
-              <w:bottom w:type="dxa" w:w="60"/>
-              <w:right w:type="dxa" w:w="100"/>
-            </w:tcMar>
-          </w:tcPr>
-          <w:p>
-            <w:pPr>
-              <w:spacing w:after="20"/>
-            </w:pPr>
-            <w:r>
-              <w:rPr>
-                <w:rFonts w:ascii="Calibri" w:cs="Calibri" w:eastAsia="Calibri" w:hAnsi="Calibri"/>
-                <w:b/>
-                <w:bCs/>
-                <w:sz w:val="20"/>
-                <w:szCs w:val="20"/>
-              </w:rPr>
-              <w:t xml:space="preserve">Radiateur</w:t>
-            </w:r>
-          </w:p>
-          <w:p>
-            <w:pPr>
-              <w:spacing w:after="40"/>
-            </w:pPr>
-            <w:r>
-              <w:rPr>
-                <w:rFonts w:ascii="Calibri" w:cs="Calibri" w:eastAsia="Calibri" w:hAnsi="Calibri"/>
-                <w:i/>
-                <w:iCs/>
-                <w:color w:val="5A6672"/>
-                <w:sz w:val="17"/>
-                <w:szCs w:val="17"/>
-              </w:rPr>
-              <w:t xml:space="preserve">matériau</w:t>
-            </w:r>
-          </w:p>
-        </w:tc>
-        <w:tc>
-          <w:tcPr>
-            <w:tcW w:type="dxa" w:w="1150"/>
-            <w:tcMar>
-              <w:top w:type="dxa" w:w="60"/>
-              <w:left w:type="dxa" w:w="100"/>
-              <w:bottom w:type="dxa" w:w="60"/>
-              <w:right w:type="dxa" w:w="100"/>
-            </w:tcMar>
-          </w:tcPr>
-          <w:p>
-            <w:pPr>
-              <w:spacing w:after="40"/>
-            </w:pPr>
-            <w:r>
-              <w:rPr>
-                <w:rFonts w:ascii="Calibri" w:cs="Calibri" w:eastAsia="Calibri" w:hAnsi="Calibri"/>
-                <w:sz w:val="20"/>
-                <w:szCs w:val="20"/>
-              </w:rPr>
-              <w:t xml:space="preserve">GAZEUX</w:t>
-            </w:r>
-          </w:p>
-        </w:tc>
-        <w:tc>
-          <w:tcPr>
-            <w:tcW w:type="dxa" w:w="3300"/>
-            <w:tcMar>
-              <w:top w:type="dxa" w:w="60"/>
-              <w:left w:type="dxa" w:w="100"/>
-              <w:bottom w:type="dxa" w:w="60"/>
-              <w:right w:type="dxa" w:w="100"/>
-            </w:tcMar>
-          </w:tcPr>
-          <w:p>
-            <w:pPr>
-              <w:spacing w:after="40"/>
-            </w:pPr>
-            <w:r>
-              <w:rPr>
-                <w:rFonts w:ascii="Calibri" w:cs="Calibri" w:eastAsia="Calibri" w:hAnsi="Calibri"/>
-                <w:sz w:val="20"/>
-                <w:szCs w:val="20"/>
-              </w:rPr>
-              <w:t xml:space="preserve">Aura de chaleur, PAR PARTICULE. Dégèle aussi la glace (0,35 s). La vapeur qui frôle le halo recharge un dash (+1 impulsion offerte).</w:t>
-            </w:r>
-          </w:p>
-        </w:tc>
-        <w:tc>
-          <w:tcPr>
-            <w:tcW w:type="dxa" w:w="2650"/>
-            <w:tcMar>
-              <w:top w:type="dxa" w:w="60"/>
-              <w:left w:type="dxa" w:w="100"/>
-              <w:bottom w:type="dxa" w:w="60"/>
-              <w:right w:type="dxa" w:w="100"/>
-            </w:tcMar>
-          </w:tcPr>
-          <w:p>
-            <w:pPr>
-              <w:spacing w:after="40"/>
-            </w:pPr>
-            <w:r>
-              <w:rPr>
-                <w:rFonts w:ascii="Calibri" w:cs="Calibri" w:eastAsia="Calibri" w:hAnsi="Calibri"/>
-                <w:sz w:val="20"/>
-                <w:szCs w:val="20"/>
-              </w:rPr>
-              <w:t xml:space="preserve">1,2 s à plein bain (boilTime) ; dégel forcé 0,35 s (heatThawTime)</w:t>
-            </w:r>
-          </w:p>
-        </w:tc>
-        <w:tc>
-          <w:tcPr>
-            <w:tcW w:type="dxa" w:w="2350"/>
-            <w:tcMar>
-              <w:top w:type="dxa" w:w="60"/>
-              <w:left w:type="dxa" w:w="100"/>
-              <w:bottom w:type="dxa" w:w="60"/>
-              <w:right w:type="dxa" w:w="100"/>
-            </w:tcMar>
-          </w:tcPr>
-          <w:p>
-            <w:pPr>
-              <w:spacing w:after="40"/>
-            </w:pPr>
-            <w:r>
-              <w:rPr>
-                <w:rFonts w:ascii="Calibri" w:cs="Calibri" w:eastAsia="Calibri" w:hAnsi="Calibri"/>
-                <w:sz w:val="20"/>
-                <w:szCs w:val="20"/>
-              </w:rPr>
-              <w:t xml:space="preserve">aucun (par particule)</w:t>
-            </w:r>
-          </w:p>
-        </w:tc>
-      </w:tr>
-      <w:tr>
-        <w:tc>
-          <w:tcPr>
-            <w:tcW w:type="dxa" w:w="1750"/>
-            <w:tcMar>
-              <w:top w:type="dxa" w:w="60"/>
-              <w:left w:type="dxa" w:w="100"/>
-              <w:bottom w:type="dxa" w:w="60"/>
-              <w:right w:type="dxa" w:w="100"/>
-            </w:tcMar>
-          </w:tcPr>
-          <w:p>
-            <w:pPr>
-              <w:spacing w:after="20"/>
-            </w:pPr>
-            <w:r>
-              <w:rPr>
-                <w:rFonts w:ascii="Calibri" w:cs="Calibri" w:eastAsia="Calibri" w:hAnsi="Calibri"/>
-                <w:b/>
-                <w:bCs/>
-                <w:sz w:val="20"/>
-                <w:szCs w:val="20"/>
-              </w:rPr>
-              <w:t xml:space="preserve">Zone LIQUIDE</w:t>
-            </w:r>
-          </w:p>
-          <w:p>
-            <w:pPr>
-              <w:spacing w:after="40"/>
-            </w:pPr>
-            <w:r>
-              <w:rPr>
-                <w:rFonts w:ascii="Calibri" w:cs="Calibri" w:eastAsia="Calibri" w:hAnsi="Calibri"/>
-                <w:i/>
-                <w:iCs/>
-                <w:color w:val="5A6672"/>
-                <w:sz w:val="17"/>
-                <w:szCs w:val="17"/>
-              </w:rPr>
-              <w:t xml:space="preserve">« chambre pressurisée »</w:t>
-            </w:r>
-          </w:p>
-        </w:tc>
-        <w:tc>
-          <w:tcPr>
-            <w:tcW w:type="dxa" w:w="1150"/>
-            <w:tcMar>
-              <w:top w:type="dxa" w:w="60"/>
-              <w:left w:type="dxa" w:w="100"/>
-              <w:bottom w:type="dxa" w:w="60"/>
-              <w:right w:type="dxa" w:w="100"/>
-            </w:tcMar>
-          </w:tcPr>
-          <w:p>
-            <w:pPr>
-              <w:spacing w:after="40"/>
-            </w:pPr>
-            <w:r>
-              <w:rPr>
-                <w:rFonts w:ascii="Calibri" w:cs="Calibri" w:eastAsia="Calibri" w:hAnsi="Calibri"/>
-                <w:sz w:val="20"/>
-                <w:szCs w:val="20"/>
-              </w:rPr>
-              <w:t xml:space="preserve">LIQUIDE</w:t>
-            </w:r>
-          </w:p>
-        </w:tc>
-        <w:tc>
-          <w:tcPr>
-            <w:tcW w:type="dxa" w:w="3300"/>
-            <w:tcMar>
-              <w:top w:type="dxa" w:w="60"/>
-              <w:left w:type="dxa" w:w="100"/>
-              <w:bottom w:type="dxa" w:w="60"/>
-              <w:right w:type="dxa" w:w="100"/>
-            </w:tcMar>
-          </w:tcPr>
-          <w:p>
-            <w:pPr>
-              <w:spacing w:after="40"/>
-            </w:pPr>
-            <w:r>
-              <w:rPr>
-                <w:rFonts w:ascii="Calibri" w:cs="Calibri" w:eastAsia="Calibri" w:hAnsi="Calibri"/>
-                <w:sz w:val="20"/>
-                <w:szCs w:val="20"/>
-              </w:rPr>
-              <w:t xml:space="preserve">Le CENTRE du corps entre dans la zone → tout le corps se convertit, sélecteur d’état verrouillé tant qu’on y est.</w:t>
-            </w:r>
-          </w:p>
-        </w:tc>
-        <w:tc>
-          <w:tcPr>
-            <w:tcW w:type="dxa" w:w="2650"/>
-            <w:tcMar>
-              <w:top w:type="dxa" w:w="60"/>
-              <w:left w:type="dxa" w:w="100"/>
-              <w:bottom w:type="dxa" w:w="60"/>
-              <w:right w:type="dxa" w:w="100"/>
-            </w:tcMar>
-          </w:tcPr>
-          <w:p>
-            <w:pPr>
-              <w:spacing w:after="40"/>
-            </w:pPr>
-            <w:r>
-              <w:rPr>
-                <w:rFonts w:ascii="Calibri" w:cs="Calibri" w:eastAsia="Calibri" w:hAnsi="Calibri"/>
-                <w:sz w:val="20"/>
-                <w:szCs w:val="20"/>
-              </w:rPr>
-              <w:t xml:space="preserve">condensation 0,9 s / dégel 2,5 s</w:t>
-            </w:r>
-          </w:p>
-        </w:tc>
-        <w:tc>
-          <w:tcPr>
-            <w:tcW w:type="dxa" w:w="2350"/>
-            <w:tcMar>
-              <w:top w:type="dxa" w:w="60"/>
-              <w:left w:type="dxa" w:w="100"/>
-              <w:bottom w:type="dxa" w:w="60"/>
-              <w:right w:type="dxa" w:w="100"/>
-            </w:tcMar>
-          </w:tcPr>
-          <w:p>
-            <w:pPr>
-              <w:spacing w:after="40"/>
-            </w:pPr>
-            <w:r>
-              <w:rPr>
-                <w:rFonts w:ascii="Calibri" w:cs="Calibri" w:eastAsia="Calibri" w:hAnsi="Calibri"/>
-                <w:sz w:val="20"/>
-                <w:szCs w:val="20"/>
-              </w:rPr>
-              <w:t xml:space="preserve">centroïde (≈ majorité du volume)</w:t>
-            </w:r>
-          </w:p>
-        </w:tc>
-      </w:tr>
-      <w:tr>
-        <w:tc>
-          <w:tcPr>
-            <w:tcW w:type="dxa" w:w="1750"/>
-            <w:tcMar>
-              <w:top w:type="dxa" w:w="60"/>
-              <w:left w:type="dxa" w:w="100"/>
-              <w:bottom w:type="dxa" w:w="60"/>
-              <w:right w:type="dxa" w:w="100"/>
-            </w:tcMar>
-          </w:tcPr>
-          <w:p>
-            <w:pPr>
-              <w:spacing w:after="20"/>
-            </w:pPr>
-            <w:r>
-              <w:rPr>
-                <w:rFonts w:ascii="Calibri" w:cs="Calibri" w:eastAsia="Calibri" w:hAnsi="Calibri"/>
-                <w:b/>
-                <w:bCs/>
-                <w:sz w:val="20"/>
-                <w:szCs w:val="20"/>
-              </w:rPr>
-              <w:t xml:space="preserve">Zone SOLIDE</w:t>
-            </w:r>
-          </w:p>
-          <w:p>
-            <w:pPr>
-              <w:spacing w:after="40"/>
-            </w:pPr>
-            <w:r>
-              <w:rPr>
-                <w:rFonts w:ascii="Calibri" w:cs="Calibri" w:eastAsia="Calibri" w:hAnsi="Calibri"/>
-                <w:i/>
-                <w:iCs/>
-                <w:color w:val="5A6672"/>
-                <w:sz w:val="17"/>
-                <w:szCs w:val="17"/>
-              </w:rPr>
-              <w:t xml:space="preserve">« hublot fendu »</w:t>
-            </w:r>
-          </w:p>
-        </w:tc>
-        <w:tc>
-          <w:tcPr>
-            <w:tcW w:type="dxa" w:w="1150"/>
-            <w:tcMar>
-              <w:top w:type="dxa" w:w="60"/>
-              <w:left w:type="dxa" w:w="100"/>
-              <w:bottom w:type="dxa" w:w="60"/>
-              <w:right w:type="dxa" w:w="100"/>
-            </w:tcMar>
-          </w:tcPr>
-          <w:p>
-            <w:pPr>
-              <w:spacing w:after="40"/>
-            </w:pPr>
-            <w:r>
-              <w:rPr>
-                <w:rFonts w:ascii="Calibri" w:cs="Calibri" w:eastAsia="Calibri" w:hAnsi="Calibri"/>
-                <w:sz w:val="20"/>
-                <w:szCs w:val="20"/>
-              </w:rPr>
-              <w:t xml:space="preserve">SOLIDE</w:t>
-            </w:r>
-          </w:p>
-        </w:tc>
-        <w:tc>
-          <w:tcPr>
-            <w:tcW w:type="dxa" w:w="3300"/>
-            <w:tcMar>
-              <w:top w:type="dxa" w:w="60"/>
-              <w:left w:type="dxa" w:w="100"/>
-              <w:bottom w:type="dxa" w:w="60"/>
-              <w:right w:type="dxa" w:w="100"/>
-            </w:tcMar>
-          </w:tcPr>
-          <w:p>
-            <w:pPr>
-              <w:spacing w:after="40"/>
-            </w:pPr>
-            <w:r>
-              <w:rPr>
-                <w:rFonts w:ascii="Calibri" w:cs="Calibri" w:eastAsia="Calibri" w:hAnsi="Calibri"/>
-                <w:sz w:val="20"/>
-                <w:szCs w:val="20"/>
-              </w:rPr>
-              <w:t xml:space="preserve">Idem : déclenchement au centroïde, conversion du corps entier, état verrouillé.</w:t>
-            </w:r>
-          </w:p>
-        </w:tc>
-        <w:tc>
-          <w:tcPr>
-            <w:tcW w:type="dxa" w:w="2650"/>
-            <w:tcMar>
-              <w:top w:type="dxa" w:w="60"/>
-              <w:left w:type="dxa" w:w="100"/>
-              <w:bottom w:type="dxa" w:w="60"/>
-              <w:right w:type="dxa" w:w="100"/>
-            </w:tcMar>
-          </w:tcPr>
-          <w:p>
-            <w:pPr>
-              <w:spacing w:after="40"/>
-            </w:pPr>
-            <w:r>
-              <w:rPr>
-                <w:rFonts w:ascii="Calibri" w:cs="Calibri" w:eastAsia="Calibri" w:hAnsi="Calibri"/>
-                <w:sz w:val="20"/>
-                <w:szCs w:val="20"/>
-              </w:rPr>
-              <w:t xml:space="preserve">prise 0,45 s (freezeSelfTime)</w:t>
-            </w:r>
-          </w:p>
-        </w:tc>
-        <w:tc>
-          <w:tcPr>
-            <w:tcW w:type="dxa" w:w="2350"/>
-            <w:tcMar>
-              <w:top w:type="dxa" w:w="60"/>
-              <w:left w:type="dxa" w:w="100"/>
-              <w:bottom w:type="dxa" w:w="60"/>
-              <w:right w:type="dxa" w:w="100"/>
-            </w:tcMar>
-          </w:tcPr>
-          <w:p>
-            <w:pPr>
-              <w:spacing w:after="40"/>
-            </w:pPr>
-            <w:r>
-              <w:rPr>
-                <w:rFonts w:ascii="Calibri" w:cs="Calibri" w:eastAsia="Calibri" w:hAnsi="Calibri"/>
-                <w:sz w:val="20"/>
-                <w:szCs w:val="20"/>
-              </w:rPr>
-              <w:t xml:space="preserve">centroïde (≈ majorité du volume)</w:t>
-            </w:r>
-          </w:p>
-        </w:tc>
-      </w:tr>
-      <w:tr>
-        <w:tc>
-          <w:tcPr>
-            <w:tcW w:type="dxa" w:w="1750"/>
-            <w:tcMar>
-              <w:top w:type="dxa" w:w="60"/>
-              <w:left w:type="dxa" w:w="100"/>
-              <w:bottom w:type="dxa" w:w="60"/>
-              <w:right w:type="dxa" w:w="100"/>
-            </w:tcMar>
-          </w:tcPr>
-          <w:p>
-            <w:pPr>
-              <w:spacing w:after="20"/>
-            </w:pPr>
-            <w:r>
-              <w:rPr>
-                <w:rFonts w:ascii="Calibri" w:cs="Calibri" w:eastAsia="Calibri" w:hAnsi="Calibri"/>
-                <w:b/>
-                <w:bCs/>
-                <w:sz w:val="20"/>
-                <w:szCs w:val="20"/>
-              </w:rPr>
-              <w:t xml:space="preserve">Zone GAZ</w:t>
-            </w:r>
-          </w:p>
-          <w:p>
-            <w:pPr>
-              <w:spacing w:after="40"/>
-            </w:pPr>
-            <w:r>
-              <w:rPr>
-                <w:rFonts w:ascii="Calibri" w:cs="Calibri" w:eastAsia="Calibri" w:hAnsi="Calibri"/>
-                <w:i/>
-                <w:iCs/>
-                <w:color w:val="5A6672"/>
-                <w:sz w:val="17"/>
-                <w:szCs w:val="17"/>
-              </w:rPr>
-              <w:t xml:space="preserve">« conduite rompue »</w:t>
-            </w:r>
-          </w:p>
-        </w:tc>
-        <w:tc>
-          <w:tcPr>
-            <w:tcW w:type="dxa" w:w="1150"/>
-            <w:tcMar>
-              <w:top w:type="dxa" w:w="60"/>
-              <w:left w:type="dxa" w:w="100"/>
-              <w:bottom w:type="dxa" w:w="60"/>
-              <w:right w:type="dxa" w:w="100"/>
-            </w:tcMar>
-          </w:tcPr>
-          <w:p>
-            <w:pPr>
-              <w:spacing w:after="40"/>
-            </w:pPr>
-            <w:r>
-              <w:rPr>
-                <w:rFonts w:ascii="Calibri" w:cs="Calibri" w:eastAsia="Calibri" w:hAnsi="Calibri"/>
-                <w:sz w:val="20"/>
-                <w:szCs w:val="20"/>
-              </w:rPr>
-              <w:t xml:space="preserve">GAZEUX</w:t>
-            </w:r>
-          </w:p>
-        </w:tc>
-        <w:tc>
-          <w:tcPr>
-            <w:tcW w:type="dxa" w:w="3300"/>
-            <w:tcMar>
-              <w:top w:type="dxa" w:w="60"/>
-              <w:left w:type="dxa" w:w="100"/>
-              <w:bottom w:type="dxa" w:w="60"/>
-              <w:right w:type="dxa" w:w="100"/>
-            </w:tcMar>
-          </w:tcPr>
-          <w:p>
-            <w:pPr>
-              <w:spacing w:after="40"/>
-            </w:pPr>
-            <w:r>
-              <w:rPr>
-                <w:rFonts w:ascii="Calibri" w:cs="Calibri" w:eastAsia="Calibri" w:hAnsi="Calibri"/>
-                <w:sz w:val="20"/>
-                <w:szCs w:val="20"/>
-              </w:rPr>
-              <w:t xml:space="preserve">Idem : déclenchement au centroïde, conversion du corps entier, état verrouillé.</w:t>
-            </w:r>
-          </w:p>
-        </w:tc>
-        <w:tc>
-          <w:tcPr>
-            <w:tcW w:type="dxa" w:w="2650"/>
-            <w:tcMar>
-              <w:top w:type="dxa" w:w="60"/>
-              <w:left w:type="dxa" w:w="100"/>
-              <w:bottom w:type="dxa" w:w="60"/>
-              <w:right w:type="dxa" w:w="100"/>
-            </w:tcMar>
-          </w:tcPr>
-          <w:p>
-            <w:pPr>
-              <w:spacing w:after="40"/>
-            </w:pPr>
-            <w:r>
-              <w:rPr>
-                <w:rFonts w:ascii="Calibri" w:cs="Calibri" w:eastAsia="Calibri" w:hAnsi="Calibri"/>
-                <w:sz w:val="20"/>
-                <w:szCs w:val="20"/>
-              </w:rPr>
-              <w:t xml:space="preserve">vaporisation 0,5 s (vaporizeTime)</w:t>
-            </w:r>
-          </w:p>
-        </w:tc>
-        <w:tc>
-          <w:tcPr>
-            <w:tcW w:type="dxa" w:w="2350"/>
-            <w:tcMar>
-              <w:top w:type="dxa" w:w="60"/>
-              <w:left w:type="dxa" w:w="100"/>
-              <w:bottom w:type="dxa" w:w="60"/>
-              <w:right w:type="dxa" w:w="100"/>
-            </w:tcMar>
-          </w:tcPr>
-          <w:p>
-            <w:pPr>
-              <w:spacing w:after="40"/>
-            </w:pPr>
-            <w:r>
-              <w:rPr>
-                <w:rFonts w:ascii="Calibri" w:cs="Calibri" w:eastAsia="Calibri" w:hAnsi="Calibri"/>
-                <w:sz w:val="20"/>
-                <w:szCs w:val="20"/>
-              </w:rPr>
-              <w:t xml:space="preserve">centroïde (≈ majorité du volume)</w:t>
             </w:r>
           </w:p>
         </w:tc>
@@ -1084,7 +1233,7 @@
           <w:sz w:val="26"/>
           <w:szCs w:val="26"/>
         </w:rPr>
-        <w:t xml:space="preserve">2. Matrice état → état : ① coût · ② temps</w:t>
+        <w:t xml:space="preserve">3. Changements VOLONTAIRES état → état — ① coût · ② temps</w:t>
       </w:r>
     </w:p>
     <w:p>
@@ -1098,7 +1247,7 @@
           <w:sz w:val="18"/>
           <w:szCs w:val="18"/>
         </w:rPr>
-        <w:t xml:space="preserve">Rappel de lecture : la diagonale ⟍ est l’identité (rien à faire). Les changements volontaires passent par F/G au clavier, X/Y/B à la manette, ❄/💨 au tactile.</w:t>
+        <w:t xml:space="preserve">F/G au clavier, X/Y/B à la manette, ❄/💨 au tactile. La diagonale ⟍ est l’identité.</w:t>
       </w:r>
     </w:p>
     <w:tbl>
@@ -1133,7 +1282,7 @@
           </w:tcPr>
           <w:p>
             <w:pPr>
-              <w:spacing w:after="80"/>
+              <w:spacing w:after="20"/>
             </w:pPr>
             <w:r>
               <w:rPr>
@@ -1161,7 +1310,7 @@
           </w:tcPr>
           <w:p>
             <w:pPr>
-              <w:spacing w:after="80"/>
+              <w:spacing w:after="20"/>
             </w:pPr>
             <w:r>
               <w:rPr>
@@ -1189,7 +1338,7 @@
           </w:tcPr>
           <w:p>
             <w:pPr>
-              <w:spacing w:after="80"/>
+              <w:spacing w:after="20"/>
             </w:pPr>
             <w:r>
               <w:rPr>
@@ -1217,7 +1366,7 @@
           </w:tcPr>
           <w:p>
             <w:pPr>
-              <w:spacing w:after="80"/>
+              <w:spacing w:after="20"/>
             </w:pPr>
             <w:r>
               <w:rPr>
@@ -1247,7 +1396,7 @@
           </w:tcPr>
           <w:p>
             <w:pPr>
-              <w:spacing w:after="80"/>
+              <w:spacing w:after="20"/>
             </w:pPr>
             <w:r>
               <w:rPr>
@@ -1300,7 +1449,7 @@
           </w:tcPr>
           <w:p>
             <w:pPr>
-              <w:spacing w:after="20"/>
+              <w:spacing w:after="30"/>
             </w:pPr>
             <w:r>
               <w:rPr>
@@ -1321,7 +1470,7 @@
                 <w:sz w:val="20"/>
                 <w:szCs w:val="20"/>
               </w:rPr>
-              <w:t xml:space="preserve">② Temps : 0,45 s (touche F / bouton X) · 1,2 s par particule au froid.</w:t>
+              <w:t xml:space="preserve">② Temps : 0,45 s (F / bouton X) · 1,2 s par particule au froid.</w:t>
             </w:r>
           </w:p>
         </w:tc>
@@ -1337,28 +1486,28 @@
           </w:tcPr>
           <w:p>
             <w:pPr>
-              <w:spacing w:after="20"/>
-            </w:pPr>
-            <w:r>
-              <w:rPr>
-                <w:rFonts w:ascii="Calibri" w:cs="Calibri" w:eastAsia="Calibri" w:hAnsi="Calibri"/>
-                <w:sz w:val="20"/>
-                <w:szCs w:val="20"/>
-              </w:rPr>
-              <w:t xml:space="preserve">① Coût : l’état se paie — évaporation continue de 2 part./s ; la grille essore au passage. Les dashs sont COMPTÉS : 3 par écran (réglable par tableau), le radiateur frôlé en offre un.</w:t>
-            </w:r>
-          </w:p>
-          <w:p>
-            <w:pPr>
-              <w:spacing w:after="40"/>
-            </w:pPr>
-            <w:r>
-              <w:rPr>
-                <w:rFonts w:ascii="Calibri" w:cs="Calibri" w:eastAsia="Calibri" w:hAnsi="Calibri"/>
-                <w:sz w:val="20"/>
-                <w:szCs w:val="20"/>
-              </w:rPr>
-              <w:t xml:space="preserve">② Temps : 0,5 s (touche G / bouton Y) · 1,2 s par particule au radiateur.</w:t>
+              <w:spacing w:after="30"/>
+            </w:pPr>
+            <w:r>
+              <w:rPr>
+                <w:rFonts w:ascii="Calibri" w:cs="Calibri" w:eastAsia="Calibri" w:hAnsi="Calibri"/>
+                <w:sz w:val="20"/>
+                <w:szCs w:val="20"/>
+              </w:rPr>
+              <w:t xml:space="preserve">① Coût : l’état se paie — évaporation continue 2 part./s ; la grille essore au passage. Dashs COMPTÉS : 3 par écran (réglable par tableau), radiateur frôlé = +1 offert.</w:t>
+            </w:r>
+          </w:p>
+          <w:p>
+            <w:pPr>
+              <w:spacing w:after="40"/>
+            </w:pPr>
+            <w:r>
+              <w:rPr>
+                <w:rFonts w:ascii="Calibri" w:cs="Calibri" w:eastAsia="Calibri" w:hAnsi="Calibri"/>
+                <w:sz w:val="20"/>
+                <w:szCs w:val="20"/>
+              </w:rPr>
+              <w:t xml:space="preserve">② Temps : 0,5 s (G / bouton Y) · 1,2 s par particule au radiateur.</w:t>
             </w:r>
           </w:p>
         </w:tc>
@@ -1377,7 +1526,7 @@
           </w:tcPr>
           <w:p>
             <w:pPr>
-              <w:spacing w:after="80"/>
+              <w:spacing w:after="20"/>
             </w:pPr>
             <w:r>
               <w:rPr>
@@ -1404,7 +1553,7 @@
           </w:tcPr>
           <w:p>
             <w:pPr>
-              <w:spacing w:after="20"/>
+              <w:spacing w:after="30"/>
             </w:pPr>
             <w:r>
               <w:rPr>
@@ -1476,7 +1625,7 @@
                 <w:sz w:val="20"/>
                 <w:szCs w:val="20"/>
               </w:rPr>
-              <w:t xml:space="preserve">✕ Pas de transition directe (pas de sublimation) : passe par l’eau, ≈ 2,5 + 0,5 s. Le radiateur enchaîne les deux tout seul (0,35 + 1,2 s).</w:t>
+              <w:t xml:space="preserve">✕ Pas de sublimation directe : passe par l’eau (≈ 2,5 + 0,5 s). Le radiateur enchaîne les deux tout seul (0,35 + 1,2 s).</w:t>
             </w:r>
           </w:p>
         </w:tc>
@@ -1495,7 +1644,7 @@
           </w:tcPr>
           <w:p>
             <w:pPr>
-              <w:spacing w:after="80"/>
+              <w:spacing w:after="20"/>
             </w:pPr>
             <w:r>
               <w:rPr>
@@ -1522,28 +1671,28 @@
           </w:tcPr>
           <w:p>
             <w:pPr>
-              <w:spacing w:after="20"/>
-            </w:pPr>
-            <w:r>
-              <w:rPr>
-                <w:rFonts w:ascii="Calibri" w:cs="Calibri" w:eastAsia="Calibri" w:hAnsi="Calibri"/>
-                <w:sz w:val="20"/>
-                <w:szCs w:val="20"/>
-              </w:rPr>
-              <w:t xml:space="preserve">① Coût : aucun coût direct (les pertes ont déjà eu lieu pendant l’état vapeur).</w:t>
-            </w:r>
-          </w:p>
-          <w:p>
-            <w:pPr>
-              <w:spacing w:after="40"/>
-            </w:pPr>
-            <w:r>
-              <w:rPr>
-                <w:rFonts w:ascii="Calibri" w:cs="Calibri" w:eastAsia="Calibri" w:hAnsi="Calibri"/>
-                <w:sz w:val="20"/>
-                <w:szCs w:val="20"/>
-              </w:rPr>
-              <w:t xml:space="preserve">② Temps : 0,9 s (condenseTime) + regroupement — les gouttelettes sont rappelées vers le corps (420 u/s²), rien ne se disperse.</w:t>
+              <w:spacing w:after="30"/>
+            </w:pPr>
+            <w:r>
+              <w:rPr>
+                <w:rFonts w:ascii="Calibri" w:cs="Calibri" w:eastAsia="Calibri" w:hAnsi="Calibri"/>
+                <w:sz w:val="20"/>
+                <w:szCs w:val="20"/>
+              </w:rPr>
+              <w:t xml:space="preserve">① Coût : aucun coût direct (les pertes ont eu lieu pendant l’état vapeur).</w:t>
+            </w:r>
+          </w:p>
+          <w:p>
+            <w:pPr>
+              <w:spacing w:after="40"/>
+            </w:pPr>
+            <w:r>
+              <w:rPr>
+                <w:rFonts w:ascii="Calibri" w:cs="Calibri" w:eastAsia="Calibri" w:hAnsi="Calibri"/>
+                <w:sz w:val="20"/>
+                <w:szCs w:val="20"/>
+              </w:rPr>
+              <w:t xml:space="preserve">② Temps : 0,9 s (condenseTime) + regroupement (420 u/s²) — rien ne se disperse.</w:t>
             </w:r>
           </w:p>
         </w:tc>
@@ -1568,7 +1717,7 @@
                 <w:sz w:val="20"/>
                 <w:szCs w:val="20"/>
               </w:rPr>
-              <w:t xml:space="preserve">✕ Pas de direct : passe par l’eau, ≈ 0,9 + 0,45 s. Les zones l’orchestrent automatiquement.</w:t>
+              <w:t xml:space="preserve">✕ Pas de direct : passe par l’eau (≈ 0,9 + 0,45 s). Les zones l’orchestrent automatiquement.</w:t>
             </w:r>
           </w:p>
         </w:tc>
@@ -1613,7 +1762,7 @@
           <w:sz w:val="26"/>
           <w:szCs w:val="26"/>
         </w:rPr>
-        <w:t xml:space="preserve">3. Recommandations</w:t>
+        <w:t xml:space="preserve">4. Recommandations</w:t>
       </w:r>
     </w:p>
     <w:p>
@@ -1647,7 +1796,7 @@
           <w:sz w:val="19"/>
           <w:szCs w:val="19"/>
         </w:rPr>
-        <w:t xml:space="preserve">Aujourd’hui deux régimes coexistent : les auras convertissent par particule (corps partiellement transformé possible), les zones au centroïde (tout ou rien). Recommandation : un paramètre « seuil de transformation » (défaut 70 %) — quand X % du volume est sous influence, TOUT le corps bascule. Réglable au banc, et par zone/matériau dans l’éditeur. C’est la règle de l’exemple en tête du tableau 1.</w:t>
+        <w:t xml:space="preserve">Aujourd’hui deux régimes : les blocs convertissent par particule (corps partiellement transformé possible), les zones au centroïde (tout ou rien dès que le centre entre). Recommandation : un paramètre « seuil de transformation » (défaut 70 %) — quand X % du volume est sous influence, TOUT le corps bascule. Réglable au banc, et par zone/bloc dans l’éditeur.</w:t>
       </w:r>
     </w:p>
     <w:p>
@@ -1667,7 +1816,7 @@
           <w:sz w:val="20"/>
           <w:szCs w:val="20"/>
         </w:rPr>
-        <w:t xml:space="preserve">Garder l’HYSTÉRÉSIS, et l’écrire dans les règles.</w:t>
+        <w:t xml:space="preserve">Aligner les ASSETS des zones sur ce document.</w:t>
       </w:r>
     </w:p>
     <w:p>
@@ -1681,7 +1830,7 @@
           <w:sz w:val="19"/>
           <w:szCs w:val="19"/>
         </w:rPr>
-        <w:t xml:space="preserve">Une particule devient gaz à vapeur = 1 mais ne redevient liquide qu’en dessous de 0,55 : l’aller-retour n’est pas symétrique. C’est ce qui évite le clignotement au bord des auras — à conserver quel que soit le seuil choisi, et à documenter (ligne « retour » dans le tableau 2).</w:t>
+        <w:t xml:space="preserve">Zone SOLIDE : « hublot fendu » — déjà conforme. Zone GAZ : le jeu peint une « conduite rompue », ce document propose le radiateur. Zone LIQUIDE : le jeu peint une « chambre pressurisée », ce document propose la douche de décontamination. Trancher, puis renommer décors et étiquettes pour qu’un seul vocabulaire circule (jeu, légende, ce document).</w:t>
       </w:r>
     </w:p>
     <w:p>
@@ -1701,7 +1850,7 @@
           <w:sz w:val="20"/>
           <w:szCs w:val="20"/>
         </w:rPr>
-        <w:t xml:space="preserve">Décider du sort de la SUBLIMATION (solide ↔ gazeux).</w:t>
+        <w:t xml:space="preserve">Garder l’HYSTÉRÉSIS, et l’écrire dans les règles.</w:t>
       </w:r>
     </w:p>
     <w:p>
@@ -1715,7 +1864,7 @@
           <w:sz w:val="19"/>
           <w:szCs w:val="19"/>
         </w:rPr>
-        <w:t xml:space="preserve">Aucune transition directe aujourd’hui : lisible, mais deux cases vides dans la matrice. Deux options : l’assumer comme règle du lore (« l’échantillon repasse toujours par l’eau »), ou l’autoriser uniquement via une cause extrême (radiateur au contact d’un bloc = sublimation en 2 s, coûteuse). À trancher avant d’ajouter des zones gaz sur des parcours de glace.</w:t>
+        <w:t xml:space="preserve">Une particule devient gaz à vapeur = 1 mais ne redevient liquide qu’en dessous de 0,55 : l’aller-retour n’est pas symétrique. C’est l’anti-clignotement au bord des auras — à conserver quel que soit le seuil choisi.</w:t>
       </w:r>
     </w:p>
     <w:p>
@@ -1735,7 +1884,7 @@
           <w:sz w:val="20"/>
           <w:szCs w:val="20"/>
         </w:rPr>
-        <w:t xml:space="preserve">Créer la DOUCHE DE DÉCONTAMINATION.</w:t>
+        <w:t xml:space="preserve">Décider du sort de la SUBLIMATION (solide ↔ gazeux).</w:t>
       </w:r>
     </w:p>
     <w:p>
@@ -1749,7 +1898,7 @@
           <w:sz w:val="19"/>
           <w:szCs w:val="19"/>
         </w:rPr>
-        <w:t xml:space="preserve">La colonne existe dans le tableau, pas dans le jeu. Proposition : un matériau « buse » qui arrose vers le bas ; ce qui traverse le jet redevient EAU (glace dégelée, vapeur condensée) au seuil volumique choisi. Rôle de game design : le « reset d’état » placé par le level designer — l’inverse exact du radiateur, comme la membrane est l’inverse de la grille.</w:t>
+        <w:t xml:space="preserve">Aucune transition directe : lisible, mais deux cases barrées. Options : l’assumer comme règle du lore (« l’échantillon repasse toujours par l’eau »), ou l’autoriser via une cause extrême (radiateur au contact d’un bloc = sublimation lente et coûteuse).</w:t>
       </w:r>
     </w:p>
     <w:p>
@@ -1769,7 +1918,7 @@
           <w:sz w:val="20"/>
           <w:szCs w:val="20"/>
         </w:rPr>
-        <w:t xml:space="preserve">Ajouter un TEMPS DE TRANSFORMATION visible.</w:t>
+        <w:t xml:space="preserve">Créer la DOUCHE DE DÉCONTAMINATION (bloc + asset de zone).</w:t>
       </w:r>
     </w:p>
     <w:p>
@@ -1783,7 +1932,7 @@
           <w:sz w:val="19"/>
           <w:szCs w:val="19"/>
         </w:rPr>
-        <w:t xml:space="preserve">Les temps existent (0,45 s / 0,5 s / 0,9 s / 2,5 s) mais rien ne les montre : un anneau de progression autour du corps pendant la prise / la vaporisation / le dégel rendrait la règle lisible sans lire ce document.</w:t>
+        <w:t xml:space="preserve">Elle a deux vies possibles : en BLOC (buse posée par le level designer, tableau 2) et en ASSET de la zone forcée LIQUIDE (tableau 1). Les deux peuvent partager le même décor — une seule modélisation.</w:t>
       </w:r>
     </w:p>
     <w:p>
@@ -1803,7 +1952,7 @@
           <w:sz w:val="20"/>
           <w:szCs w:val="20"/>
         </w:rPr>
-        <w:t xml:space="preserve">Les coûts au même endroit.</w:t>
+        <w:t xml:space="preserve">Rendre les TEMPS DE TRANSFORMATION visibles.</w:t>
       </w:r>
     </w:p>
     <w:p>
@@ -1817,7 +1966,41 @@
           <w:sz w:val="19"/>
           <w:szCs w:val="19"/>
         </w:rPr>
-        <w:t xml:space="preserve">Le seul vrai coût d’état est celui de la vapeur (2 part./s + essorage de grille + dashs comptés). Si d’autres coûts apparaissent (par exemple un péage de gel), les inscrire dans la case ① du tableau 2 — une seule source de vérité, ce document.</w:t>
+        <w:t xml:space="preserve">Les temps existent (0,45 / 0,5 / 0,9 / 2,5 s) mais rien ne les montre : un anneau de progression autour du corps pendant la prise, la vaporisation ou le dégel rendrait la règle lisible sans lire ce document.</w:t>
+      </w:r>
+    </w:p>
+    <w:p>
+      <w:pPr>
+        <w:pStyle w:val="ListParagraph"/>
+        <w:numPr>
+          <w:ilvl w:val="0"/>
+          <w:numId w:val="2"/>
+        </w:numPr>
+        <w:spacing w:after="30" w:before="100"/>
+      </w:pPr>
+      <w:r>
+        <w:rPr>
+          <w:rFonts w:ascii="Calibri" w:cs="Calibri" w:eastAsia="Calibri" w:hAnsi="Calibri"/>
+          <w:b/>
+          <w:bCs/>
+          <w:sz w:val="20"/>
+          <w:szCs w:val="20"/>
+        </w:rPr>
+        <w:t xml:space="preserve">Les coûts au même endroit.</w:t>
+      </w:r>
+    </w:p>
+    <w:p>
+      <w:pPr>
+        <w:spacing w:after="90"/>
+        <w:ind w:left="360"/>
+      </w:pPr>
+      <w:r>
+        <w:rPr>
+          <w:rFonts w:ascii="Calibri" w:cs="Calibri" w:eastAsia="Calibri" w:hAnsi="Calibri"/>
+          <w:sz w:val="19"/>
+          <w:szCs w:val="19"/>
+        </w:rPr>
+        <w:t xml:space="preserve">Le seul vrai coût d’état est celui de la vapeur (2 part./s + essorage de grille + dashs comptés). Tout nouveau coût s’inscrit dans les cases ① — une seule source de vérité, ce document.</w:t>
       </w:r>
     </w:p>
     <w:sectPr>

</xml_diff>

<commit_message>
Radiateur : passage à l'état gazeux à 50 % (réarmement 30 %), doc à jour
Réglage demandé : la bascule automatique se déclenche dès la moitié du
corps vaporisée. docs/Sujet21-transformations.docx reflète le seuil
(ligne Radiateur du tableau des blocs + recommandation nº 1).

Co-Authored-By: Claude Fable 5 <noreply@anthropic.com>
Claude-Session: https://claude.ai/code/session_01JcgQjhbx7n2WuX197SocGM
</commit_message>
<xml_diff>
--- a/docs/Sujet21-transformations.docx
+++ b/docs/Sujet21-transformations.docx
@@ -1021,7 +1021,7 @@
                 <w:sz w:val="20"/>
                 <w:szCs w:val="20"/>
               </w:rPr>
-              <w:t xml:space="preserve">Aura de chaleur, PAR PARTICULE : l’eau frémit puis se vaporise, qu’on le veuille ou non. Dégèle la glace (libère un bloc soudé). La vapeur qui FRÔLE le halo recharge un dash (+1 impulsion offerte). La vapeur qui s’attarde s’évapore (perdue).</w:t>
+              <w:t xml:space="preserve">Aura de chaleur, PAR PARTICULE : l’eau frémit puis se vaporise, qu’on le veuille ou non. Dégèle la glace (libère un bloc soudé). La vapeur qui FRÔLE le halo recharge un dash (+1 impulsion offerte). La vapeur qui s’attarde s’évapore (perdue). À 50 % du corps vaporisé, le jeu PASSE à l’état gazeux (dash, sélecteur, sons) — réarmement sous 30 %.</w:t>
             </w:r>
           </w:p>
         </w:tc>
@@ -1069,7 +1069,7 @@
                 <w:sz w:val="20"/>
                 <w:szCs w:val="20"/>
               </w:rPr>
-              <w:t xml:space="preserve">aucun : par particule</w:t>
+              <w:t xml:space="preserve">vaporisation : par particule · passage à l’ÉTAT gazeux : 50 % du corps</w:t>
             </w:r>
           </w:p>
         </w:tc>
@@ -1796,7 +1796,7 @@
           <w:sz w:val="19"/>
           <w:szCs w:val="19"/>
         </w:rPr>
-        <w:t xml:space="preserve">Aujourd’hui deux régimes : les blocs convertissent par particule (corps partiellement transformé possible), les zones au centroïde (tout ou rien dès que le centre entre). Recommandation : un paramètre « seuil de transformation » (défaut 70 %) — quand X % du volume est sous influence, TOUT le corps bascule. Réglable au banc, et par zone/bloc dans l’éditeur.</w:t>
+        <w:t xml:space="preserve">Aujourd’hui deux régimes : les blocs convertissent par particule (corps partiellement transformé possible), les zones au centroïde (tout ou rien dès que le centre entre). Recommandation : un paramètre « seuil de transformation » réglable au banc et par zone/bloc dans l’éditeur. Première application VALIDÉE : le radiateur fait passer à l’état gazeux à 50 % du corps vaporisé (réarmement sous 30 %).</w:t>
       </w:r>
     </w:p>
     <w:p>

</xml_diff>

<commit_message>
Radiateur : passage à l'état gazeux à 50 % (réarmement 30 %), doc à jour (#103)
Réglage demandé : la bascule automatique se déclenche dès la moitié du
corps vaporisée. docs/Sujet21-transformations.docx reflète le seuil
(ligne Radiateur du tableau des blocs + recommandation nº 1).


Claude-Session: https://claude.ai/code/session_01JcgQjhbx7n2WuX197SocGM

Co-authored-by: Claude <noreply@anthropic.com>
</commit_message>
<xml_diff>
--- a/docs/Sujet21-transformations.docx
+++ b/docs/Sujet21-transformations.docx
@@ -1021,7 +1021,7 @@
                 <w:sz w:val="20"/>
                 <w:szCs w:val="20"/>
               </w:rPr>
-              <w:t xml:space="preserve">Aura de chaleur, PAR PARTICULE : l’eau frémit puis se vaporise, qu’on le veuille ou non. Dégèle la glace (libère un bloc soudé). La vapeur qui FRÔLE le halo recharge un dash (+1 impulsion offerte). La vapeur qui s’attarde s’évapore (perdue).</w:t>
+              <w:t xml:space="preserve">Aura de chaleur, PAR PARTICULE : l’eau frémit puis se vaporise, qu’on le veuille ou non. Dégèle la glace (libère un bloc soudé). La vapeur qui FRÔLE le halo recharge un dash (+1 impulsion offerte). La vapeur qui s’attarde s’évapore (perdue). À 50 % du corps vaporisé, le jeu PASSE à l’état gazeux (dash, sélecteur, sons) — réarmement sous 30 %.</w:t>
             </w:r>
           </w:p>
         </w:tc>
@@ -1069,7 +1069,7 @@
                 <w:sz w:val="20"/>
                 <w:szCs w:val="20"/>
               </w:rPr>
-              <w:t xml:space="preserve">aucun : par particule</w:t>
+              <w:t xml:space="preserve">vaporisation : par particule · passage à l’ÉTAT gazeux : 50 % du corps</w:t>
             </w:r>
           </w:p>
         </w:tc>
@@ -1796,7 +1796,7 @@
           <w:sz w:val="19"/>
           <w:szCs w:val="19"/>
         </w:rPr>
-        <w:t xml:space="preserve">Aujourd’hui deux régimes : les blocs convertissent par particule (corps partiellement transformé possible), les zones au centroïde (tout ou rien dès que le centre entre). Recommandation : un paramètre « seuil de transformation » (défaut 70 %) — quand X % du volume est sous influence, TOUT le corps bascule. Réglable au banc, et par zone/bloc dans l’éditeur.</w:t>
+        <w:t xml:space="preserve">Aujourd’hui deux régimes : les blocs convertissent par particule (corps partiellement transformé possible), les zones au centroïde (tout ou rien dès que le centre entre). Recommandation : un paramètre « seuil de transformation » réglable au banc et par zone/bloc dans l’éditeur. Première application VALIDÉE : le radiateur fait passer à l’état gazeux à 50 % du corps vaporisé (réarmement sous 30 %).</w:t>
       </w:r>
     </w:p>
     <w:p>

</xml_diff>

<commit_message>
Docs : section brainstorm bloc radiateur (5 idées, analyses, recommandations)
Recharge exigeant l'état gaz (+33 % de vie vapeur), usage unique
(recommandé : recharge consommable, transfo permanente), deux blocs
distincts brasero/borne, déclenchement au volume ACTIF (recommandé
90-95 % du corps principal), aura réglable par bloc (+ plaques froides).
Rien d'implémenté : la section prépare les décisions.

Co-Authored-By: Claude Fable 5 <noreply@anthropic.com>
Claude-Session: https://claude.ai/code/session_01JcgQjhbx7n2WuX197SocGM
</commit_message>
<xml_diff>
--- a/docs/Sujet21-transformations.docx
+++ b/docs/Sujet21-transformations.docx
@@ -1762,7 +1762,612 @@
           <w:sz w:val="26"/>
           <w:szCs w:val="26"/>
         </w:rPr>
-        <w:t xml:space="preserve">4. Recommandations</w:t>
+        <w:t xml:space="preserve">4. Brainstorm — bloc radiateur (à trancher)</w:t>
+      </w:r>
+    </w:p>
+    <w:p>
+      <w:pPr>
+        <w:spacing w:after="80"/>
+      </w:pPr>
+      <w:r>
+        <w:rPr>
+          <w:rFonts w:ascii="Calibri" w:cs="Calibri" w:eastAsia="Calibri" w:hAnsi="Calibri"/>
+          <w:color w:val="5A6672"/>
+          <w:sz w:val="18"/>
+          <w:szCs w:val="18"/>
+        </w:rPr>
+        <w:t xml:space="preserve">Les idées de la session du 12/08, chacune avec analyse et recommandation. Rien ici n’est implémenté : cette section prépare les décisions.</w:t>
+      </w:r>
+    </w:p>
+    <w:tbl>
+      <w:tblPr>
+        <w:tblW w:type="dxa" w:w="11200"/>
+        <w:tblBorders>
+          <w:top w:val="single" w:color="auto" w:sz="4"/>
+          <w:left w:val="single" w:color="auto" w:sz="4"/>
+          <w:bottom w:val="single" w:color="auto" w:sz="4"/>
+          <w:right w:val="single" w:color="auto" w:sz="4"/>
+          <w:insideH w:val="single" w:color="auto" w:sz="4"/>
+          <w:insideV w:val="single" w:color="auto" w:sz="4"/>
+        </w:tblBorders>
+      </w:tblPr>
+      <w:tblGrid>
+        <w:gridCol w:w="3450"/>
+        <w:gridCol w:w="5250"/>
+        <w:gridCol w:w="2500"/>
+      </w:tblGrid>
+      <w:tr>
+        <w:tc>
+          <w:tcPr>
+            <w:tcW w:type="dxa" w:w="3450"/>
+            <w:shd w:fill="1F5C8B" w:val="clear"/>
+            <w:tcMar>
+              <w:top w:type="dxa" w:w="60"/>
+              <w:left w:type="dxa" w:w="100"/>
+              <w:bottom w:type="dxa" w:w="60"/>
+              <w:right w:type="dxa" w:w="100"/>
+            </w:tcMar>
+          </w:tcPr>
+          <w:p>
+            <w:pPr>
+              <w:spacing w:after="20"/>
+            </w:pPr>
+            <w:r>
+              <w:rPr>
+                <w:rFonts w:ascii="Calibri" w:cs="Calibri" w:eastAsia="Calibri" w:hAnsi="Calibri"/>
+                <w:b/>
+                <w:bCs/>
+                <w:color w:val="FFFFFF"/>
+                <w:sz w:val="19"/>
+                <w:szCs w:val="19"/>
+              </w:rPr>
+              <w:t xml:space="preserve">Idée (brainstorm)</w:t>
+            </w:r>
+          </w:p>
+        </w:tc>
+        <w:tc>
+          <w:tcPr>
+            <w:tcW w:type="dxa" w:w="5250"/>
+            <w:shd w:fill="1F5C8B" w:val="clear"/>
+            <w:tcMar>
+              <w:top w:type="dxa" w:w="60"/>
+              <w:left w:type="dxa" w:w="100"/>
+              <w:bottom w:type="dxa" w:w="60"/>
+              <w:right w:type="dxa" w:w="100"/>
+            </w:tcMar>
+          </w:tcPr>
+          <w:p>
+            <w:pPr>
+              <w:spacing w:after="20"/>
+            </w:pPr>
+            <w:r>
+              <w:rPr>
+                <w:rFonts w:ascii="Calibri" w:cs="Calibri" w:eastAsia="Calibri" w:hAnsi="Calibri"/>
+                <w:b/>
+                <w:bCs/>
+                <w:color w:val="FFFFFF"/>
+                <w:sz w:val="19"/>
+                <w:szCs w:val="19"/>
+              </w:rPr>
+              <w:t xml:space="preserve">Analyse &amp; recommandation</w:t>
+            </w:r>
+          </w:p>
+        </w:tc>
+        <w:tc>
+          <w:tcPr>
+            <w:tcW w:type="dxa" w:w="2500"/>
+            <w:shd w:fill="1F5C8B" w:val="clear"/>
+            <w:tcMar>
+              <w:top w:type="dxa" w:w="60"/>
+              <w:left w:type="dxa" w:w="100"/>
+              <w:bottom w:type="dxa" w:w="60"/>
+              <w:right w:type="dxa" w:w="100"/>
+            </w:tcMar>
+          </w:tcPr>
+          <w:p>
+            <w:pPr>
+              <w:spacing w:after="20"/>
+            </w:pPr>
+            <w:r>
+              <w:rPr>
+                <w:rFonts w:ascii="Calibri" w:cs="Calibri" w:eastAsia="Calibri" w:hAnsi="Calibri"/>
+                <w:b/>
+                <w:bCs/>
+                <w:color w:val="FFFFFF"/>
+                <w:sz w:val="19"/>
+                <w:szCs w:val="19"/>
+              </w:rPr>
+              <w:t xml:space="preserve">Statut</w:t>
+            </w:r>
+          </w:p>
+        </w:tc>
+      </w:tr>
+      <w:tr>
+        <w:tc>
+          <w:tcPr>
+            <w:tcW w:type="dxa" w:w="3450"/>
+            <w:tcMar>
+              <w:top w:type="dxa" w:w="60"/>
+              <w:left w:type="dxa" w:w="100"/>
+              <w:bottom w:type="dxa" w:w="60"/>
+              <w:right w:type="dxa" w:w="100"/>
+            </w:tcMar>
+          </w:tcPr>
+          <w:p>
+            <w:pPr>
+              <w:spacing w:after="40"/>
+            </w:pPr>
+            <w:r>
+              <w:rPr>
+                <w:rFonts w:ascii="Calibri" w:cs="Calibri" w:eastAsia="Calibri" w:hAnsi="Calibri"/>
+                <w:b/>
+                <w:bCs/>
+                <w:sz w:val="20"/>
+                <w:szCs w:val="20"/>
+              </w:rPr>
+              <w:t xml:space="preserve">Recharge de dash : il faut être SOUS FORME DE GAZ pour l’obtenir. À 3 dashs par écran, +1 dash = +33 % de « vie » vapeur.</w:t>
+            </w:r>
+          </w:p>
+        </w:tc>
+        <w:tc>
+          <w:tcPr>
+            <w:tcW w:type="dxa" w:w="5250"/>
+            <w:tcMar>
+              <w:top w:type="dxa" w:w="60"/>
+              <w:left w:type="dxa" w:w="100"/>
+              <w:bottom w:type="dxa" w:w="60"/>
+              <w:right w:type="dxa" w:w="100"/>
+            </w:tcMar>
+          </w:tcPr>
+          <w:p>
+            <w:pPr>
+              <w:spacing w:after="30"/>
+            </w:pPr>
+            <w:r>
+              <w:rPr>
+                <w:rFonts w:ascii="Calibri" w:cs="Calibri" w:eastAsia="Calibri" w:hAnsi="Calibri"/>
+                <w:sz w:val="20"/>
+                <w:szCs w:val="20"/>
+              </w:rPr>
+              <w:t xml:space="preserve">D’accord — la recharge devient une manœuvre délibérée, pas un bonus de passage. Aujourd’hui il suffit qu’une particule de vapeur frôle le halo ; exiger l’ÉTAT gazeux (l’intention, pas quelques gouttes vaporisées) rend la règle lisible et cohérente avec la bascule à 50 %.</w:t>
+            </w:r>
+          </w:p>
+          <w:p>
+            <w:pPr>
+              <w:spacing w:after="40"/>
+            </w:pPr>
+            <w:r>
+              <w:rPr>
+                <w:rFonts w:ascii="Calibri" w:cs="Calibri" w:eastAsia="Calibri" w:hAnsi="Calibri"/>
+                <w:sz w:val="20"/>
+                <w:szCs w:val="20"/>
+              </w:rPr>
+              <w:t xml:space="preserve">Penser les dashs comme la barre de vie de la vapeur est une bonne lecture : afficher le gain comme un ramassage (+1 impulsion qui clignote au viseur et sur la jauge).</w:t>
+            </w:r>
+          </w:p>
+        </w:tc>
+        <w:tc>
+          <w:tcPr>
+            <w:tcW w:type="dxa" w:w="2500"/>
+            <w:tcMar>
+              <w:top w:type="dxa" w:w="60"/>
+              <w:left w:type="dxa" w:w="100"/>
+              <w:bottom w:type="dxa" w:w="60"/>
+              <w:right w:type="dxa" w:w="100"/>
+            </w:tcMar>
+          </w:tcPr>
+          <w:p>
+            <w:pPr>
+              <w:spacing w:after="40"/>
+            </w:pPr>
+            <w:r>
+              <w:rPr>
+                <w:rFonts w:ascii="Calibri" w:cs="Calibri" w:eastAsia="Calibri" w:hAnsi="Calibri"/>
+                <w:sz w:val="20"/>
+                <w:szCs w:val="20"/>
+              </w:rPr>
+              <w:t xml:space="preserve">À trancher — recommandé : OUI</w:t>
+            </w:r>
+          </w:p>
+        </w:tc>
+      </w:tr>
+      <w:tr>
+        <w:tc>
+          <w:tcPr>
+            <w:tcW w:type="dxa" w:w="3450"/>
+            <w:tcMar>
+              <w:top w:type="dxa" w:w="60"/>
+              <w:left w:type="dxa" w:w="100"/>
+              <w:bottom w:type="dxa" w:w="60"/>
+              <w:right w:type="dxa" w:w="100"/>
+            </w:tcMar>
+          </w:tcPr>
+          <w:p>
+            <w:pPr>
+              <w:spacing w:after="40"/>
+            </w:pPr>
+            <w:r>
+              <w:rPr>
+                <w:rFonts w:ascii="Calibri" w:cs="Calibri" w:eastAsia="Calibri" w:hAnsi="Calibri"/>
+                <w:b/>
+                <w:bCs/>
+                <w:sz w:val="20"/>
+                <w:szCs w:val="20"/>
+              </w:rPr>
+              <w:t xml:space="preserve">Un bloc chauffage s’utilise UNE SEULE FOIS : soit recharge (en arrivant gaz), soit transfo (vaporisation). Question : autoriser plusieurs usages du même effet (eau → gaz → eau → retour au même radiateur) ?</w:t>
+            </w:r>
+          </w:p>
+        </w:tc>
+        <w:tc>
+          <w:tcPr>
+            <w:tcW w:type="dxa" w:w="5250"/>
+            <w:tcMar>
+              <w:top w:type="dxa" w:w="60"/>
+              <w:left w:type="dxa" w:w="100"/>
+              <w:bottom w:type="dxa" w:w="60"/>
+              <w:right w:type="dxa" w:w="100"/>
+            </w:tcMar>
+          </w:tcPr>
+          <w:p>
+            <w:pPr>
+              <w:spacing w:after="30"/>
+            </w:pPr>
+            <w:r>
+              <w:rPr>
+                <w:rFonts w:ascii="Calibri" w:cs="Calibri" w:eastAsia="Calibri" w:hAnsi="Calibri"/>
+                <w:sz w:val="20"/>
+                <w:szCs w:val="20"/>
+              </w:rPr>
+              <w:t xml:space="preserve">Recommandation : séparer le sort des deux effets. La RECHARGE à usage unique, oui — sinon un même radiateur devient une ferme à dashs infinis (aller-retour gaz → +1 → gaz → +1…), ce qui annule les dashs comptés. Le bloc s’éteint visuellement après usage (braises grises) : l’état se lit.</w:t>
+            </w:r>
+          </w:p>
+          <w:p>
+            <w:pPr>
+              <w:spacing w:after="30"/>
+            </w:pPr>
+            <w:r>
+              <w:rPr>
+                <w:rFonts w:ascii="Calibri" w:cs="Calibri" w:eastAsia="Calibri" w:hAnsi="Calibri"/>
+                <w:sz w:val="20"/>
+                <w:szCs w:val="20"/>
+              </w:rPr>
+              <w:t xml:space="preserve">La TRANSFO à usage unique, prudence : c’est une propriété physique du bloc (il chauffe), et l’éteindre après un usage crée des soft-locks — le joueur qui se recondense par erreur reste piégé si l’unique vaporisateur est consommé. Recommandé : transfo TOUJOURS ACTIVE, recharge consommable. Alternative douce si l’usage unique est voulu partout : un long temps de recharge du bloc (cooldown 20–30 s) plutôt qu’une extinction définitive.</w:t>
+            </w:r>
+          </w:p>
+          <w:p>
+            <w:pPr>
+              <w:spacing w:after="40"/>
+            </w:pPr>
+            <w:r>
+              <w:rPr>
+                <w:rFonts w:ascii="Calibri" w:cs="Calibri" w:eastAsia="Calibri" w:hAnsi="Calibri"/>
+                <w:sz w:val="20"/>
+                <w:szCs w:val="20"/>
+              </w:rPr>
+              <w:t xml:space="preserve">Dans l’éditeur : un champ « usages » par radiateur (1 / ∞ / cooldown).</w:t>
+            </w:r>
+          </w:p>
+        </w:tc>
+        <w:tc>
+          <w:tcPr>
+            <w:tcW w:type="dxa" w:w="2500"/>
+            <w:tcMar>
+              <w:top w:type="dxa" w:w="60"/>
+              <w:left w:type="dxa" w:w="100"/>
+              <w:bottom w:type="dxa" w:w="60"/>
+              <w:right w:type="dxa" w:w="100"/>
+            </w:tcMar>
+          </w:tcPr>
+          <w:p>
+            <w:pPr>
+              <w:spacing w:after="40"/>
+            </w:pPr>
+            <w:r>
+              <w:rPr>
+                <w:rFonts w:ascii="Calibri" w:cs="Calibri" w:eastAsia="Calibri" w:hAnsi="Calibri"/>
+                <w:sz w:val="20"/>
+                <w:szCs w:val="20"/>
+              </w:rPr>
+              <w:t xml:space="preserve">À trancher — recommandé : recharge unique, transfo permanente</w:t>
+            </w:r>
+          </w:p>
+        </w:tc>
+      </w:tr>
+      <w:tr>
+        <w:tc>
+          <w:tcPr>
+            <w:tcW w:type="dxa" w:w="3450"/>
+            <w:tcMar>
+              <w:top w:type="dxa" w:w="60"/>
+              <w:left w:type="dxa" w:w="100"/>
+              <w:bottom w:type="dxa" w:w="60"/>
+              <w:right w:type="dxa" w:w="100"/>
+            </w:tcMar>
+          </w:tcPr>
+          <w:p>
+            <w:pPr>
+              <w:spacing w:after="40"/>
+            </w:pPr>
+            <w:r>
+              <w:rPr>
+                <w:rFonts w:ascii="Calibri" w:cs="Calibri" w:eastAsia="Calibri" w:hAnsi="Calibri"/>
+                <w:b/>
+                <w:bCs/>
+                <w:sz w:val="20"/>
+                <w:szCs w:val="20"/>
+              </w:rPr>
+              <w:t xml:space="preserve">Intérêt de faire des chauffages DE TRANSFO et des chauffages DE RECHARGE distincts ?</w:t>
+            </w:r>
+          </w:p>
+        </w:tc>
+        <w:tc>
+          <w:tcPr>
+            <w:tcW w:type="dxa" w:w="5250"/>
+            <w:tcMar>
+              <w:top w:type="dxa" w:w="60"/>
+              <w:left w:type="dxa" w:w="100"/>
+              <w:bottom w:type="dxa" w:w="60"/>
+              <w:right w:type="dxa" w:w="100"/>
+            </w:tcMar>
+          </w:tcPr>
+          <w:p>
+            <w:pPr>
+              <w:spacing w:after="30"/>
+            </w:pPr>
+            <w:r>
+              <w:rPr>
+                <w:rFonts w:ascii="Calibri" w:cs="Calibri" w:eastAsia="Calibri" w:hAnsi="Calibri"/>
+                <w:sz w:val="20"/>
+                <w:szCs w:val="20"/>
+              </w:rPr>
+              <w:t xml:space="preserve">Oui, fort intérêt. Deux rôles = deux mots du vocabulaire de level design : le BRASERO (toujours actif, transforme — un danger-outil qu’on traverse) et la BORNE DE RECHARGE (consommable, exige l’état gaz, donne +1 dash — un objectif qu’on vise). Un bloc unique qui fait les deux crée des accidents : on vient pour la transfo et on consomme la recharge sans le vouloir.</w:t>
+            </w:r>
+          </w:p>
+          <w:p>
+            <w:pPr>
+              <w:spacing w:after="40"/>
+            </w:pPr>
+            <w:r>
+              <w:rPr>
+                <w:rFonts w:ascii="Calibri" w:cs="Calibri" w:eastAsia="Calibri" w:hAnsi="Calibri"/>
+                <w:sz w:val="20"/>
+                <w:szCs w:val="20"/>
+              </w:rPr>
+              <w:t xml:space="preserve">Les distinguer visuellement : lueur orange pour le brasero, lueur cyan/blanche et pictogramme +1 pour la borne. La borne peut être un NOUVEL asset compact (pas une copie du radiateur).</w:t>
+            </w:r>
+          </w:p>
+        </w:tc>
+        <w:tc>
+          <w:tcPr>
+            <w:tcW w:type="dxa" w:w="2500"/>
+            <w:tcMar>
+              <w:top w:type="dxa" w:w="60"/>
+              <w:left w:type="dxa" w:w="100"/>
+              <w:bottom w:type="dxa" w:w="60"/>
+              <w:right w:type="dxa" w:w="100"/>
+            </w:tcMar>
+          </w:tcPr>
+          <w:p>
+            <w:pPr>
+              <w:spacing w:after="40"/>
+            </w:pPr>
+            <w:r>
+              <w:rPr>
+                <w:rFonts w:ascii="Calibri" w:cs="Calibri" w:eastAsia="Calibri" w:hAnsi="Calibri"/>
+                <w:sz w:val="20"/>
+                <w:szCs w:val="20"/>
+              </w:rPr>
+              <w:t xml:space="preserve">À trancher — recommandé : OUI, deux blocs</w:t>
+            </w:r>
+          </w:p>
+        </w:tc>
+      </w:tr>
+      <w:tr>
+        <w:tc>
+          <w:tcPr>
+            <w:tcW w:type="dxa" w:w="3450"/>
+            <w:tcMar>
+              <w:top w:type="dxa" w:w="60"/>
+              <w:left w:type="dxa" w:w="100"/>
+              <w:bottom w:type="dxa" w:w="60"/>
+              <w:right w:type="dxa" w:w="100"/>
+            </w:tcMar>
+          </w:tcPr>
+          <w:p>
+            <w:pPr>
+              <w:spacing w:after="40"/>
+            </w:pPr>
+            <w:r>
+              <w:rPr>
+                <w:rFonts w:ascii="Calibri" w:cs="Calibri" w:eastAsia="Calibri" w:hAnsi="Calibri"/>
+                <w:b/>
+                <w:bCs/>
+                <w:sz w:val="20"/>
+                <w:szCs w:val="20"/>
+              </w:rPr>
+              <w:t xml:space="preserve">Déclenchement : 100 % du VOLUME ACTIF doit être dans la zone de chauffe (les gouttelettes éjectées pour la propulsion au fil de la partie ne comptent pas).</w:t>
+            </w:r>
+          </w:p>
+        </w:tc>
+        <w:tc>
+          <w:tcPr>
+            <w:tcW w:type="dxa" w:w="5250"/>
+            <w:tcMar>
+              <w:top w:type="dxa" w:w="60"/>
+              <w:left w:type="dxa" w:w="100"/>
+              <w:bottom w:type="dxa" w:w="60"/>
+              <w:right w:type="dxa" w:w="100"/>
+            </w:tcMar>
+          </w:tcPr>
+          <w:p>
+            <w:pPr>
+              <w:spacing w:after="30"/>
+            </w:pPr>
+            <w:r>
+              <w:rPr>
+                <w:rFonts w:ascii="Calibri" w:cs="Calibri" w:eastAsia="Calibri" w:hAnsi="Calibri"/>
+                <w:sz w:val="20"/>
+                <w:szCs w:val="20"/>
+              </w:rPr>
+              <w:t xml:space="preserve">La notion de VOLUME ACTIF est la bonne clé : le corps principal (l’amas connexe le plus grand), pas les gouttes égarées — c’est déjà ainsi que la victoire a été réglée (bouton CONTINUER), et c’est calculable à chaque image.</w:t>
+            </w:r>
+          </w:p>
+          <w:p>
+            <w:pPr>
+              <w:spacing w:after="30"/>
+            </w:pPr>
+            <w:r>
+              <w:rPr>
+                <w:rFonts w:ascii="Calibri" w:cs="Calibri" w:eastAsia="Calibri" w:hAnsi="Calibri"/>
+                <w:sz w:val="20"/>
+                <w:szCs w:val="20"/>
+              </w:rPr>
+              <w:t xml:space="preserve">Réserve sur le 100 % strict : une goutte du corps qui dépasse d’un pixel bloque le déclenchement — frustration de « pixel hunting ». Recommandé : « le corps principal ENTIER dans l’aura » avec une tolérance de 90–95 %, ou formulé autrement : aucune partie du corps principal à plus de X unités hors du halo. À caler en test.</w:t>
+            </w:r>
+          </w:p>
+          <w:p>
+            <w:pPr>
+              <w:spacing w:after="40"/>
+            </w:pPr>
+            <w:r>
+              <w:rPr>
+                <w:rFonts w:ascii="Calibri" w:cs="Calibri" w:eastAsia="Calibri" w:hAnsi="Calibri"/>
+                <w:sz w:val="20"/>
+                <w:szCs w:val="20"/>
+              </w:rPr>
+              <w:t xml:space="preserve">À articuler avec la bascule d’état à 50 % : 50 % = passage à l’état gazeux (transfo), 90–100 % du volume actif = consommation d’un effet à usage unique (recharge).</w:t>
+            </w:r>
+          </w:p>
+        </w:tc>
+        <w:tc>
+          <w:tcPr>
+            <w:tcW w:type="dxa" w:w="2500"/>
+            <w:tcMar>
+              <w:top w:type="dxa" w:w="60"/>
+              <w:left w:type="dxa" w:w="100"/>
+              <w:bottom w:type="dxa" w:w="60"/>
+              <w:right w:type="dxa" w:w="100"/>
+            </w:tcMar>
+          </w:tcPr>
+          <w:p>
+            <w:pPr>
+              <w:spacing w:after="40"/>
+            </w:pPr>
+            <w:r>
+              <w:rPr>
+                <w:rFonts w:ascii="Calibri" w:cs="Calibri" w:eastAsia="Calibri" w:hAnsi="Calibri"/>
+                <w:sz w:val="20"/>
+                <w:szCs w:val="20"/>
+              </w:rPr>
+              <w:t xml:space="preserve">À trancher — recommandé : 90–95 % du corps principal</w:t>
+            </w:r>
+          </w:p>
+        </w:tc>
+      </w:tr>
+      <w:tr>
+        <w:tc>
+          <w:tcPr>
+            <w:tcW w:type="dxa" w:w="3450"/>
+            <w:tcMar>
+              <w:top w:type="dxa" w:w="60"/>
+              <w:left w:type="dxa" w:w="100"/>
+              <w:bottom w:type="dxa" w:w="60"/>
+              <w:right w:type="dxa" w:w="100"/>
+            </w:tcMar>
+          </w:tcPr>
+          <w:p>
+            <w:pPr>
+              <w:spacing w:after="40"/>
+            </w:pPr>
+            <w:r>
+              <w:rPr>
+                <w:rFonts w:ascii="Calibri" w:cs="Calibri" w:eastAsia="Calibri" w:hAnsi="Calibri"/>
+                <w:b/>
+                <w:bCs/>
+                <w:sz w:val="20"/>
+                <w:szCs w:val="20"/>
+              </w:rPr>
+              <w:t xml:space="preserve">Taille de l’AURA réglable par radiateur : gros blocs à petite aura, petits blocs à grande aura.</w:t>
+            </w:r>
+          </w:p>
+        </w:tc>
+        <w:tc>
+          <w:tcPr>
+            <w:tcW w:type="dxa" w:w="5250"/>
+            <w:tcMar>
+              <w:top w:type="dxa" w:w="60"/>
+              <w:left w:type="dxa" w:w="100"/>
+              <w:bottom w:type="dxa" w:w="60"/>
+              <w:right w:type="dxa" w:w="100"/>
+            </w:tcMar>
+          </w:tcPr>
+          <w:p>
+            <w:pPr>
+              <w:spacing w:after="30"/>
+            </w:pPr>
+            <w:r>
+              <w:rPr>
+                <w:rFonts w:ascii="Calibri" w:cs="Calibri" w:eastAsia="Calibri" w:hAnsi="Calibri"/>
+                <w:sz w:val="20"/>
+                <w:szCs w:val="20"/>
+              </w:rPr>
+              <w:t xml:space="preserve">Oui — champ « aura » par bloc dans l’éditeur (comme l’angle des parois). Gros bloc + petite aura = fournaise localisée qu’on frôle ; petit bloc + grande aura = chaleur ambiante qui commande toute une salle.</w:t>
+            </w:r>
+          </w:p>
+          <w:p>
+            <w:pPr>
+              <w:spacing w:after="40"/>
+            </w:pPr>
+            <w:r>
+              <w:rPr>
+                <w:rFonts w:ascii="Calibri" w:cs="Calibri" w:eastAsia="Calibri" w:hAnsi="Calibri"/>
+                <w:sz w:val="20"/>
+                <w:szCs w:val="20"/>
+              </w:rPr>
+              <w:t xml:space="preserve">Le rendu dessine déjà la VRAIE portée de l’aura (même formule que la physique) : la promesse visuelle reste honnête quelle que soit la taille. Prévoir des bornes (≈ 40 à 300 unités) et, par symétrie, offrir le même réglage aux plaques froides.</w:t>
+            </w:r>
+          </w:p>
+        </w:tc>
+        <w:tc>
+          <w:tcPr>
+            <w:tcW w:type="dxa" w:w="2500"/>
+            <w:tcMar>
+              <w:top w:type="dxa" w:w="60"/>
+              <w:left w:type="dxa" w:w="100"/>
+              <w:bottom w:type="dxa" w:w="60"/>
+              <w:right w:type="dxa" w:w="100"/>
+            </w:tcMar>
+          </w:tcPr>
+          <w:p>
+            <w:pPr>
+              <w:spacing w:after="40"/>
+            </w:pPr>
+            <w:r>
+              <w:rPr>
+                <w:rFonts w:ascii="Calibri" w:cs="Calibri" w:eastAsia="Calibri" w:hAnsi="Calibri"/>
+                <w:sz w:val="20"/>
+                <w:szCs w:val="20"/>
+              </w:rPr>
+              <w:t xml:space="preserve">À trancher — recommandé : OUI (+ plaques froides)</w:t>
+            </w:r>
+          </w:p>
+        </w:tc>
+      </w:tr>
+    </w:tbl>
+    <w:p>
+      <w:pPr>
+        <w:pStyle w:val="Heading1"/>
+      </w:pPr>
+      <w:r>
+        <w:rPr>
+          <w:rFonts w:ascii="Calibri" w:cs="Calibri" w:eastAsia="Calibri" w:hAnsi="Calibri"/>
+          <w:b/>
+          <w:bCs/>
+          <w:color w:val="1F5C8B"/>
+          <w:sz w:val="26"/>
+          <w:szCs w:val="26"/>
+        </w:rPr>
+        <w:t xml:space="preserve">5. Recommandations</w:t>
       </w:r>
     </w:p>
     <w:p>

</xml_diff>

<commit_message>
Docs : section brainstorm bloc radiateur (5 idées, analyses, recommandations) (#104)
Recharge exigeant l'état gaz (+33 % de vie vapeur), usage unique
(recommandé : recharge consommable, transfo permanente), deux blocs
distincts brasero/borne, déclenchement au volume ACTIF (recommandé
90-95 % du corps principal), aura réglable par bloc (+ plaques froides).
Rien d'implémenté : la section prépare les décisions.


Claude-Session: https://claude.ai/code/session_01JcgQjhbx7n2WuX197SocGM

Co-authored-by: Claude <noreply@anthropic.com>
</commit_message>
<xml_diff>
--- a/docs/Sujet21-transformations.docx
+++ b/docs/Sujet21-transformations.docx
@@ -1762,7 +1762,612 @@
           <w:sz w:val="26"/>
           <w:szCs w:val="26"/>
         </w:rPr>
-        <w:t xml:space="preserve">4. Recommandations</w:t>
+        <w:t xml:space="preserve">4. Brainstorm — bloc radiateur (à trancher)</w:t>
+      </w:r>
+    </w:p>
+    <w:p>
+      <w:pPr>
+        <w:spacing w:after="80"/>
+      </w:pPr>
+      <w:r>
+        <w:rPr>
+          <w:rFonts w:ascii="Calibri" w:cs="Calibri" w:eastAsia="Calibri" w:hAnsi="Calibri"/>
+          <w:color w:val="5A6672"/>
+          <w:sz w:val="18"/>
+          <w:szCs w:val="18"/>
+        </w:rPr>
+        <w:t xml:space="preserve">Les idées de la session du 12/08, chacune avec analyse et recommandation. Rien ici n’est implémenté : cette section prépare les décisions.</w:t>
+      </w:r>
+    </w:p>
+    <w:tbl>
+      <w:tblPr>
+        <w:tblW w:type="dxa" w:w="11200"/>
+        <w:tblBorders>
+          <w:top w:val="single" w:color="auto" w:sz="4"/>
+          <w:left w:val="single" w:color="auto" w:sz="4"/>
+          <w:bottom w:val="single" w:color="auto" w:sz="4"/>
+          <w:right w:val="single" w:color="auto" w:sz="4"/>
+          <w:insideH w:val="single" w:color="auto" w:sz="4"/>
+          <w:insideV w:val="single" w:color="auto" w:sz="4"/>
+        </w:tblBorders>
+      </w:tblPr>
+      <w:tblGrid>
+        <w:gridCol w:w="3450"/>
+        <w:gridCol w:w="5250"/>
+        <w:gridCol w:w="2500"/>
+      </w:tblGrid>
+      <w:tr>
+        <w:tc>
+          <w:tcPr>
+            <w:tcW w:type="dxa" w:w="3450"/>
+            <w:shd w:fill="1F5C8B" w:val="clear"/>
+            <w:tcMar>
+              <w:top w:type="dxa" w:w="60"/>
+              <w:left w:type="dxa" w:w="100"/>
+              <w:bottom w:type="dxa" w:w="60"/>
+              <w:right w:type="dxa" w:w="100"/>
+            </w:tcMar>
+          </w:tcPr>
+          <w:p>
+            <w:pPr>
+              <w:spacing w:after="20"/>
+            </w:pPr>
+            <w:r>
+              <w:rPr>
+                <w:rFonts w:ascii="Calibri" w:cs="Calibri" w:eastAsia="Calibri" w:hAnsi="Calibri"/>
+                <w:b/>
+                <w:bCs/>
+                <w:color w:val="FFFFFF"/>
+                <w:sz w:val="19"/>
+                <w:szCs w:val="19"/>
+              </w:rPr>
+              <w:t xml:space="preserve">Idée (brainstorm)</w:t>
+            </w:r>
+          </w:p>
+        </w:tc>
+        <w:tc>
+          <w:tcPr>
+            <w:tcW w:type="dxa" w:w="5250"/>
+            <w:shd w:fill="1F5C8B" w:val="clear"/>
+            <w:tcMar>
+              <w:top w:type="dxa" w:w="60"/>
+              <w:left w:type="dxa" w:w="100"/>
+              <w:bottom w:type="dxa" w:w="60"/>
+              <w:right w:type="dxa" w:w="100"/>
+            </w:tcMar>
+          </w:tcPr>
+          <w:p>
+            <w:pPr>
+              <w:spacing w:after="20"/>
+            </w:pPr>
+            <w:r>
+              <w:rPr>
+                <w:rFonts w:ascii="Calibri" w:cs="Calibri" w:eastAsia="Calibri" w:hAnsi="Calibri"/>
+                <w:b/>
+                <w:bCs/>
+                <w:color w:val="FFFFFF"/>
+                <w:sz w:val="19"/>
+                <w:szCs w:val="19"/>
+              </w:rPr>
+              <w:t xml:space="preserve">Analyse &amp; recommandation</w:t>
+            </w:r>
+          </w:p>
+        </w:tc>
+        <w:tc>
+          <w:tcPr>
+            <w:tcW w:type="dxa" w:w="2500"/>
+            <w:shd w:fill="1F5C8B" w:val="clear"/>
+            <w:tcMar>
+              <w:top w:type="dxa" w:w="60"/>
+              <w:left w:type="dxa" w:w="100"/>
+              <w:bottom w:type="dxa" w:w="60"/>
+              <w:right w:type="dxa" w:w="100"/>
+            </w:tcMar>
+          </w:tcPr>
+          <w:p>
+            <w:pPr>
+              <w:spacing w:after="20"/>
+            </w:pPr>
+            <w:r>
+              <w:rPr>
+                <w:rFonts w:ascii="Calibri" w:cs="Calibri" w:eastAsia="Calibri" w:hAnsi="Calibri"/>
+                <w:b/>
+                <w:bCs/>
+                <w:color w:val="FFFFFF"/>
+                <w:sz w:val="19"/>
+                <w:szCs w:val="19"/>
+              </w:rPr>
+              <w:t xml:space="preserve">Statut</w:t>
+            </w:r>
+          </w:p>
+        </w:tc>
+      </w:tr>
+      <w:tr>
+        <w:tc>
+          <w:tcPr>
+            <w:tcW w:type="dxa" w:w="3450"/>
+            <w:tcMar>
+              <w:top w:type="dxa" w:w="60"/>
+              <w:left w:type="dxa" w:w="100"/>
+              <w:bottom w:type="dxa" w:w="60"/>
+              <w:right w:type="dxa" w:w="100"/>
+            </w:tcMar>
+          </w:tcPr>
+          <w:p>
+            <w:pPr>
+              <w:spacing w:after="40"/>
+            </w:pPr>
+            <w:r>
+              <w:rPr>
+                <w:rFonts w:ascii="Calibri" w:cs="Calibri" w:eastAsia="Calibri" w:hAnsi="Calibri"/>
+                <w:b/>
+                <w:bCs/>
+                <w:sz w:val="20"/>
+                <w:szCs w:val="20"/>
+              </w:rPr>
+              <w:t xml:space="preserve">Recharge de dash : il faut être SOUS FORME DE GAZ pour l’obtenir. À 3 dashs par écran, +1 dash = +33 % de « vie » vapeur.</w:t>
+            </w:r>
+          </w:p>
+        </w:tc>
+        <w:tc>
+          <w:tcPr>
+            <w:tcW w:type="dxa" w:w="5250"/>
+            <w:tcMar>
+              <w:top w:type="dxa" w:w="60"/>
+              <w:left w:type="dxa" w:w="100"/>
+              <w:bottom w:type="dxa" w:w="60"/>
+              <w:right w:type="dxa" w:w="100"/>
+            </w:tcMar>
+          </w:tcPr>
+          <w:p>
+            <w:pPr>
+              <w:spacing w:after="30"/>
+            </w:pPr>
+            <w:r>
+              <w:rPr>
+                <w:rFonts w:ascii="Calibri" w:cs="Calibri" w:eastAsia="Calibri" w:hAnsi="Calibri"/>
+                <w:sz w:val="20"/>
+                <w:szCs w:val="20"/>
+              </w:rPr>
+              <w:t xml:space="preserve">D’accord — la recharge devient une manœuvre délibérée, pas un bonus de passage. Aujourd’hui il suffit qu’une particule de vapeur frôle le halo ; exiger l’ÉTAT gazeux (l’intention, pas quelques gouttes vaporisées) rend la règle lisible et cohérente avec la bascule à 50 %.</w:t>
+            </w:r>
+          </w:p>
+          <w:p>
+            <w:pPr>
+              <w:spacing w:after="40"/>
+            </w:pPr>
+            <w:r>
+              <w:rPr>
+                <w:rFonts w:ascii="Calibri" w:cs="Calibri" w:eastAsia="Calibri" w:hAnsi="Calibri"/>
+                <w:sz w:val="20"/>
+                <w:szCs w:val="20"/>
+              </w:rPr>
+              <w:t xml:space="preserve">Penser les dashs comme la barre de vie de la vapeur est une bonne lecture : afficher le gain comme un ramassage (+1 impulsion qui clignote au viseur et sur la jauge).</w:t>
+            </w:r>
+          </w:p>
+        </w:tc>
+        <w:tc>
+          <w:tcPr>
+            <w:tcW w:type="dxa" w:w="2500"/>
+            <w:tcMar>
+              <w:top w:type="dxa" w:w="60"/>
+              <w:left w:type="dxa" w:w="100"/>
+              <w:bottom w:type="dxa" w:w="60"/>
+              <w:right w:type="dxa" w:w="100"/>
+            </w:tcMar>
+          </w:tcPr>
+          <w:p>
+            <w:pPr>
+              <w:spacing w:after="40"/>
+            </w:pPr>
+            <w:r>
+              <w:rPr>
+                <w:rFonts w:ascii="Calibri" w:cs="Calibri" w:eastAsia="Calibri" w:hAnsi="Calibri"/>
+                <w:sz w:val="20"/>
+                <w:szCs w:val="20"/>
+              </w:rPr>
+              <w:t xml:space="preserve">À trancher — recommandé : OUI</w:t>
+            </w:r>
+          </w:p>
+        </w:tc>
+      </w:tr>
+      <w:tr>
+        <w:tc>
+          <w:tcPr>
+            <w:tcW w:type="dxa" w:w="3450"/>
+            <w:tcMar>
+              <w:top w:type="dxa" w:w="60"/>
+              <w:left w:type="dxa" w:w="100"/>
+              <w:bottom w:type="dxa" w:w="60"/>
+              <w:right w:type="dxa" w:w="100"/>
+            </w:tcMar>
+          </w:tcPr>
+          <w:p>
+            <w:pPr>
+              <w:spacing w:after="40"/>
+            </w:pPr>
+            <w:r>
+              <w:rPr>
+                <w:rFonts w:ascii="Calibri" w:cs="Calibri" w:eastAsia="Calibri" w:hAnsi="Calibri"/>
+                <w:b/>
+                <w:bCs/>
+                <w:sz w:val="20"/>
+                <w:szCs w:val="20"/>
+              </w:rPr>
+              <w:t xml:space="preserve">Un bloc chauffage s’utilise UNE SEULE FOIS : soit recharge (en arrivant gaz), soit transfo (vaporisation). Question : autoriser plusieurs usages du même effet (eau → gaz → eau → retour au même radiateur) ?</w:t>
+            </w:r>
+          </w:p>
+        </w:tc>
+        <w:tc>
+          <w:tcPr>
+            <w:tcW w:type="dxa" w:w="5250"/>
+            <w:tcMar>
+              <w:top w:type="dxa" w:w="60"/>
+              <w:left w:type="dxa" w:w="100"/>
+              <w:bottom w:type="dxa" w:w="60"/>
+              <w:right w:type="dxa" w:w="100"/>
+            </w:tcMar>
+          </w:tcPr>
+          <w:p>
+            <w:pPr>
+              <w:spacing w:after="30"/>
+            </w:pPr>
+            <w:r>
+              <w:rPr>
+                <w:rFonts w:ascii="Calibri" w:cs="Calibri" w:eastAsia="Calibri" w:hAnsi="Calibri"/>
+                <w:sz w:val="20"/>
+                <w:szCs w:val="20"/>
+              </w:rPr>
+              <w:t xml:space="preserve">Recommandation : séparer le sort des deux effets. La RECHARGE à usage unique, oui — sinon un même radiateur devient une ferme à dashs infinis (aller-retour gaz → +1 → gaz → +1…), ce qui annule les dashs comptés. Le bloc s’éteint visuellement après usage (braises grises) : l’état se lit.</w:t>
+            </w:r>
+          </w:p>
+          <w:p>
+            <w:pPr>
+              <w:spacing w:after="30"/>
+            </w:pPr>
+            <w:r>
+              <w:rPr>
+                <w:rFonts w:ascii="Calibri" w:cs="Calibri" w:eastAsia="Calibri" w:hAnsi="Calibri"/>
+                <w:sz w:val="20"/>
+                <w:szCs w:val="20"/>
+              </w:rPr>
+              <w:t xml:space="preserve">La TRANSFO à usage unique, prudence : c’est une propriété physique du bloc (il chauffe), et l’éteindre après un usage crée des soft-locks — le joueur qui se recondense par erreur reste piégé si l’unique vaporisateur est consommé. Recommandé : transfo TOUJOURS ACTIVE, recharge consommable. Alternative douce si l’usage unique est voulu partout : un long temps de recharge du bloc (cooldown 20–30 s) plutôt qu’une extinction définitive.</w:t>
+            </w:r>
+          </w:p>
+          <w:p>
+            <w:pPr>
+              <w:spacing w:after="40"/>
+            </w:pPr>
+            <w:r>
+              <w:rPr>
+                <w:rFonts w:ascii="Calibri" w:cs="Calibri" w:eastAsia="Calibri" w:hAnsi="Calibri"/>
+                <w:sz w:val="20"/>
+                <w:szCs w:val="20"/>
+              </w:rPr>
+              <w:t xml:space="preserve">Dans l’éditeur : un champ « usages » par radiateur (1 / ∞ / cooldown).</w:t>
+            </w:r>
+          </w:p>
+        </w:tc>
+        <w:tc>
+          <w:tcPr>
+            <w:tcW w:type="dxa" w:w="2500"/>
+            <w:tcMar>
+              <w:top w:type="dxa" w:w="60"/>
+              <w:left w:type="dxa" w:w="100"/>
+              <w:bottom w:type="dxa" w:w="60"/>
+              <w:right w:type="dxa" w:w="100"/>
+            </w:tcMar>
+          </w:tcPr>
+          <w:p>
+            <w:pPr>
+              <w:spacing w:after="40"/>
+            </w:pPr>
+            <w:r>
+              <w:rPr>
+                <w:rFonts w:ascii="Calibri" w:cs="Calibri" w:eastAsia="Calibri" w:hAnsi="Calibri"/>
+                <w:sz w:val="20"/>
+                <w:szCs w:val="20"/>
+              </w:rPr>
+              <w:t xml:space="preserve">À trancher — recommandé : recharge unique, transfo permanente</w:t>
+            </w:r>
+          </w:p>
+        </w:tc>
+      </w:tr>
+      <w:tr>
+        <w:tc>
+          <w:tcPr>
+            <w:tcW w:type="dxa" w:w="3450"/>
+            <w:tcMar>
+              <w:top w:type="dxa" w:w="60"/>
+              <w:left w:type="dxa" w:w="100"/>
+              <w:bottom w:type="dxa" w:w="60"/>
+              <w:right w:type="dxa" w:w="100"/>
+            </w:tcMar>
+          </w:tcPr>
+          <w:p>
+            <w:pPr>
+              <w:spacing w:after="40"/>
+            </w:pPr>
+            <w:r>
+              <w:rPr>
+                <w:rFonts w:ascii="Calibri" w:cs="Calibri" w:eastAsia="Calibri" w:hAnsi="Calibri"/>
+                <w:b/>
+                <w:bCs/>
+                <w:sz w:val="20"/>
+                <w:szCs w:val="20"/>
+              </w:rPr>
+              <w:t xml:space="preserve">Intérêt de faire des chauffages DE TRANSFO et des chauffages DE RECHARGE distincts ?</w:t>
+            </w:r>
+          </w:p>
+        </w:tc>
+        <w:tc>
+          <w:tcPr>
+            <w:tcW w:type="dxa" w:w="5250"/>
+            <w:tcMar>
+              <w:top w:type="dxa" w:w="60"/>
+              <w:left w:type="dxa" w:w="100"/>
+              <w:bottom w:type="dxa" w:w="60"/>
+              <w:right w:type="dxa" w:w="100"/>
+            </w:tcMar>
+          </w:tcPr>
+          <w:p>
+            <w:pPr>
+              <w:spacing w:after="30"/>
+            </w:pPr>
+            <w:r>
+              <w:rPr>
+                <w:rFonts w:ascii="Calibri" w:cs="Calibri" w:eastAsia="Calibri" w:hAnsi="Calibri"/>
+                <w:sz w:val="20"/>
+                <w:szCs w:val="20"/>
+              </w:rPr>
+              <w:t xml:space="preserve">Oui, fort intérêt. Deux rôles = deux mots du vocabulaire de level design : le BRASERO (toujours actif, transforme — un danger-outil qu’on traverse) et la BORNE DE RECHARGE (consommable, exige l’état gaz, donne +1 dash — un objectif qu’on vise). Un bloc unique qui fait les deux crée des accidents : on vient pour la transfo et on consomme la recharge sans le vouloir.</w:t>
+            </w:r>
+          </w:p>
+          <w:p>
+            <w:pPr>
+              <w:spacing w:after="40"/>
+            </w:pPr>
+            <w:r>
+              <w:rPr>
+                <w:rFonts w:ascii="Calibri" w:cs="Calibri" w:eastAsia="Calibri" w:hAnsi="Calibri"/>
+                <w:sz w:val="20"/>
+                <w:szCs w:val="20"/>
+              </w:rPr>
+              <w:t xml:space="preserve">Les distinguer visuellement : lueur orange pour le brasero, lueur cyan/blanche et pictogramme +1 pour la borne. La borne peut être un NOUVEL asset compact (pas une copie du radiateur).</w:t>
+            </w:r>
+          </w:p>
+        </w:tc>
+        <w:tc>
+          <w:tcPr>
+            <w:tcW w:type="dxa" w:w="2500"/>
+            <w:tcMar>
+              <w:top w:type="dxa" w:w="60"/>
+              <w:left w:type="dxa" w:w="100"/>
+              <w:bottom w:type="dxa" w:w="60"/>
+              <w:right w:type="dxa" w:w="100"/>
+            </w:tcMar>
+          </w:tcPr>
+          <w:p>
+            <w:pPr>
+              <w:spacing w:after="40"/>
+            </w:pPr>
+            <w:r>
+              <w:rPr>
+                <w:rFonts w:ascii="Calibri" w:cs="Calibri" w:eastAsia="Calibri" w:hAnsi="Calibri"/>
+                <w:sz w:val="20"/>
+                <w:szCs w:val="20"/>
+              </w:rPr>
+              <w:t xml:space="preserve">À trancher — recommandé : OUI, deux blocs</w:t>
+            </w:r>
+          </w:p>
+        </w:tc>
+      </w:tr>
+      <w:tr>
+        <w:tc>
+          <w:tcPr>
+            <w:tcW w:type="dxa" w:w="3450"/>
+            <w:tcMar>
+              <w:top w:type="dxa" w:w="60"/>
+              <w:left w:type="dxa" w:w="100"/>
+              <w:bottom w:type="dxa" w:w="60"/>
+              <w:right w:type="dxa" w:w="100"/>
+            </w:tcMar>
+          </w:tcPr>
+          <w:p>
+            <w:pPr>
+              <w:spacing w:after="40"/>
+            </w:pPr>
+            <w:r>
+              <w:rPr>
+                <w:rFonts w:ascii="Calibri" w:cs="Calibri" w:eastAsia="Calibri" w:hAnsi="Calibri"/>
+                <w:b/>
+                <w:bCs/>
+                <w:sz w:val="20"/>
+                <w:szCs w:val="20"/>
+              </w:rPr>
+              <w:t xml:space="preserve">Déclenchement : 100 % du VOLUME ACTIF doit être dans la zone de chauffe (les gouttelettes éjectées pour la propulsion au fil de la partie ne comptent pas).</w:t>
+            </w:r>
+          </w:p>
+        </w:tc>
+        <w:tc>
+          <w:tcPr>
+            <w:tcW w:type="dxa" w:w="5250"/>
+            <w:tcMar>
+              <w:top w:type="dxa" w:w="60"/>
+              <w:left w:type="dxa" w:w="100"/>
+              <w:bottom w:type="dxa" w:w="60"/>
+              <w:right w:type="dxa" w:w="100"/>
+            </w:tcMar>
+          </w:tcPr>
+          <w:p>
+            <w:pPr>
+              <w:spacing w:after="30"/>
+            </w:pPr>
+            <w:r>
+              <w:rPr>
+                <w:rFonts w:ascii="Calibri" w:cs="Calibri" w:eastAsia="Calibri" w:hAnsi="Calibri"/>
+                <w:sz w:val="20"/>
+                <w:szCs w:val="20"/>
+              </w:rPr>
+              <w:t xml:space="preserve">La notion de VOLUME ACTIF est la bonne clé : le corps principal (l’amas connexe le plus grand), pas les gouttes égarées — c’est déjà ainsi que la victoire a été réglée (bouton CONTINUER), et c’est calculable à chaque image.</w:t>
+            </w:r>
+          </w:p>
+          <w:p>
+            <w:pPr>
+              <w:spacing w:after="30"/>
+            </w:pPr>
+            <w:r>
+              <w:rPr>
+                <w:rFonts w:ascii="Calibri" w:cs="Calibri" w:eastAsia="Calibri" w:hAnsi="Calibri"/>
+                <w:sz w:val="20"/>
+                <w:szCs w:val="20"/>
+              </w:rPr>
+              <w:t xml:space="preserve">Réserve sur le 100 % strict : une goutte du corps qui dépasse d’un pixel bloque le déclenchement — frustration de « pixel hunting ». Recommandé : « le corps principal ENTIER dans l’aura » avec une tolérance de 90–95 %, ou formulé autrement : aucune partie du corps principal à plus de X unités hors du halo. À caler en test.</w:t>
+            </w:r>
+          </w:p>
+          <w:p>
+            <w:pPr>
+              <w:spacing w:after="40"/>
+            </w:pPr>
+            <w:r>
+              <w:rPr>
+                <w:rFonts w:ascii="Calibri" w:cs="Calibri" w:eastAsia="Calibri" w:hAnsi="Calibri"/>
+                <w:sz w:val="20"/>
+                <w:szCs w:val="20"/>
+              </w:rPr>
+              <w:t xml:space="preserve">À articuler avec la bascule d’état à 50 % : 50 % = passage à l’état gazeux (transfo), 90–100 % du volume actif = consommation d’un effet à usage unique (recharge).</w:t>
+            </w:r>
+          </w:p>
+        </w:tc>
+        <w:tc>
+          <w:tcPr>
+            <w:tcW w:type="dxa" w:w="2500"/>
+            <w:tcMar>
+              <w:top w:type="dxa" w:w="60"/>
+              <w:left w:type="dxa" w:w="100"/>
+              <w:bottom w:type="dxa" w:w="60"/>
+              <w:right w:type="dxa" w:w="100"/>
+            </w:tcMar>
+          </w:tcPr>
+          <w:p>
+            <w:pPr>
+              <w:spacing w:after="40"/>
+            </w:pPr>
+            <w:r>
+              <w:rPr>
+                <w:rFonts w:ascii="Calibri" w:cs="Calibri" w:eastAsia="Calibri" w:hAnsi="Calibri"/>
+                <w:sz w:val="20"/>
+                <w:szCs w:val="20"/>
+              </w:rPr>
+              <w:t xml:space="preserve">À trancher — recommandé : 90–95 % du corps principal</w:t>
+            </w:r>
+          </w:p>
+        </w:tc>
+      </w:tr>
+      <w:tr>
+        <w:tc>
+          <w:tcPr>
+            <w:tcW w:type="dxa" w:w="3450"/>
+            <w:tcMar>
+              <w:top w:type="dxa" w:w="60"/>
+              <w:left w:type="dxa" w:w="100"/>
+              <w:bottom w:type="dxa" w:w="60"/>
+              <w:right w:type="dxa" w:w="100"/>
+            </w:tcMar>
+          </w:tcPr>
+          <w:p>
+            <w:pPr>
+              <w:spacing w:after="40"/>
+            </w:pPr>
+            <w:r>
+              <w:rPr>
+                <w:rFonts w:ascii="Calibri" w:cs="Calibri" w:eastAsia="Calibri" w:hAnsi="Calibri"/>
+                <w:b/>
+                <w:bCs/>
+                <w:sz w:val="20"/>
+                <w:szCs w:val="20"/>
+              </w:rPr>
+              <w:t xml:space="preserve">Taille de l’AURA réglable par radiateur : gros blocs à petite aura, petits blocs à grande aura.</w:t>
+            </w:r>
+          </w:p>
+        </w:tc>
+        <w:tc>
+          <w:tcPr>
+            <w:tcW w:type="dxa" w:w="5250"/>
+            <w:tcMar>
+              <w:top w:type="dxa" w:w="60"/>
+              <w:left w:type="dxa" w:w="100"/>
+              <w:bottom w:type="dxa" w:w="60"/>
+              <w:right w:type="dxa" w:w="100"/>
+            </w:tcMar>
+          </w:tcPr>
+          <w:p>
+            <w:pPr>
+              <w:spacing w:after="30"/>
+            </w:pPr>
+            <w:r>
+              <w:rPr>
+                <w:rFonts w:ascii="Calibri" w:cs="Calibri" w:eastAsia="Calibri" w:hAnsi="Calibri"/>
+                <w:sz w:val="20"/>
+                <w:szCs w:val="20"/>
+              </w:rPr>
+              <w:t xml:space="preserve">Oui — champ « aura » par bloc dans l’éditeur (comme l’angle des parois). Gros bloc + petite aura = fournaise localisée qu’on frôle ; petit bloc + grande aura = chaleur ambiante qui commande toute une salle.</w:t>
+            </w:r>
+          </w:p>
+          <w:p>
+            <w:pPr>
+              <w:spacing w:after="40"/>
+            </w:pPr>
+            <w:r>
+              <w:rPr>
+                <w:rFonts w:ascii="Calibri" w:cs="Calibri" w:eastAsia="Calibri" w:hAnsi="Calibri"/>
+                <w:sz w:val="20"/>
+                <w:szCs w:val="20"/>
+              </w:rPr>
+              <w:t xml:space="preserve">Le rendu dessine déjà la VRAIE portée de l’aura (même formule que la physique) : la promesse visuelle reste honnête quelle que soit la taille. Prévoir des bornes (≈ 40 à 300 unités) et, par symétrie, offrir le même réglage aux plaques froides.</w:t>
+            </w:r>
+          </w:p>
+        </w:tc>
+        <w:tc>
+          <w:tcPr>
+            <w:tcW w:type="dxa" w:w="2500"/>
+            <w:tcMar>
+              <w:top w:type="dxa" w:w="60"/>
+              <w:left w:type="dxa" w:w="100"/>
+              <w:bottom w:type="dxa" w:w="60"/>
+              <w:right w:type="dxa" w:w="100"/>
+            </w:tcMar>
+          </w:tcPr>
+          <w:p>
+            <w:pPr>
+              <w:spacing w:after="40"/>
+            </w:pPr>
+            <w:r>
+              <w:rPr>
+                <w:rFonts w:ascii="Calibri" w:cs="Calibri" w:eastAsia="Calibri" w:hAnsi="Calibri"/>
+                <w:sz w:val="20"/>
+                <w:szCs w:val="20"/>
+              </w:rPr>
+              <w:t xml:space="preserve">À trancher — recommandé : OUI (+ plaques froides)</w:t>
+            </w:r>
+          </w:p>
+        </w:tc>
+      </w:tr>
+    </w:tbl>
+    <w:p>
+      <w:pPr>
+        <w:pStyle w:val="Heading1"/>
+      </w:pPr>
+      <w:r>
+        <w:rPr>
+          <w:rFonts w:ascii="Calibri" w:cs="Calibri" w:eastAsia="Calibri" w:hAnsi="Calibri"/>
+          <w:b/>
+          <w:bCs/>
+          <w:color w:val="1F5C8B"/>
+          <w:sz w:val="26"/>
+          <w:szCs w:val="26"/>
+        </w:rPr>
+        <w:t xml:space="preserve">5. Recommandations</w:t>
       </w:r>
     </w:p>
     <w:p>

</xml_diff>

<commit_message>
Docs : la chaudière (transfo) et le surchauffeur (recharge de dash)
Lore tranché : le radiateur devient LA CHAUDIÈRE (transfo pure, ne
recharge plus les dashs) ; LE SURCHAUFFEUR entre comme borne de
recharge — le serpentin qui ré-injecte de l'énergie dans une vapeur
déjà formée (d'où l'exigence de l'état gazeux), +1 impulsion, usage
unique lisible au manomètre. Nouvelles cellules du tableau des blocs,
matrice état→état et brainstorm (lignes 1 et 3 tranchées) à jour.

Co-Authored-By: Claude Fable 5 <noreply@anthropic.com>
Claude-Session: https://claude.ai/code/session_01JcgQjhbx7n2WuX197SocGM
</commit_message>
<xml_diff>
--- a/docs/Sujet21-transformations.docx
+++ b/docs/Sujet21-transformations.docx
@@ -963,17 +963,33 @@
           </w:tcPr>
           <w:p>
             <w:pPr>
-              <w:spacing w:after="40"/>
-            </w:pPr>
-            <w:r>
-              <w:rPr>
-                <w:rFonts w:ascii="Calibri" w:cs="Calibri" w:eastAsia="Calibri" w:hAnsi="Calibri"/>
-                <w:b/>
-                <w:bCs/>
-                <w:sz w:val="20"/>
-                <w:szCs w:val="20"/>
-              </w:rPr>
-              <w:t xml:space="preserve">Radiateur</w:t>
+              <w:spacing w:after="30"/>
+            </w:pPr>
+            <w:r>
+              <w:rPr>
+                <w:rFonts w:ascii="Calibri" w:cs="Calibri" w:eastAsia="Calibri" w:hAnsi="Calibri"/>
+                <w:b/>
+                <w:bCs/>
+                <w:sz w:val="20"/>
+                <w:szCs w:val="20"/>
+              </w:rPr>
+              <w:t xml:space="preserve">Chaudière</w:t>
+            </w:r>
+          </w:p>
+          <w:p>
+            <w:pPr>
+              <w:spacing w:after="40"/>
+            </w:pPr>
+            <w:r>
+              <w:rPr>
+                <w:rFonts w:ascii="Calibri" w:cs="Calibri" w:eastAsia="Calibri" w:hAnsi="Calibri"/>
+                <w:i/>
+                <w:iCs/>
+                <w:color w:val="5A6672"/>
+                <w:sz w:val="17"/>
+                <w:szCs w:val="17"/>
+              </w:rPr>
+              <w:t xml:space="preserve">le chauffage de TRANSFO — l’actuel « radiateur », renommé. Toujours active. Ailettes, braise orange.</w:t>
             </w:r>
           </w:p>
         </w:tc>
@@ -1021,7 +1037,7 @@
                 <w:sz w:val="20"/>
                 <w:szCs w:val="20"/>
               </w:rPr>
-              <w:t xml:space="preserve">Aura de chaleur, PAR PARTICULE : l’eau frémit puis se vaporise, qu’on le veuille ou non. Dégèle la glace (libère un bloc soudé). La vapeur qui FRÔLE le halo recharge un dash (+1 impulsion offerte). La vapeur qui s’attarde s’évapore (perdue). À 50 % du corps vaporisé, le jeu PASSE à l’état gazeux (dash, sélecteur, sons) — réarmement sous 30 %.</w:t>
+              <w:t xml:space="preserve">Aura de chaleur, PAR PARTICULE : l’eau frémit puis se vaporise, qu’on le veuille ou non. Dégèle la glace (libère un bloc soudé). La vapeur qui s’attarde s’évapore (perdue). À 50 % du corps vaporisé, le jeu PASSE à l’état gazeux (dash, sélecteur, sons) — réarmement sous 30 %. Ne recharge PLUS les dashs : ce rôle passe au surchauffeur.</w:t>
             </w:r>
           </w:p>
         </w:tc>
@@ -1070,6 +1086,151 @@
                 <w:szCs w:val="20"/>
               </w:rPr>
               <w:t xml:space="preserve">vaporisation : par particule · passage à l’ÉTAT gazeux : 50 % du corps</w:t>
+            </w:r>
+          </w:p>
+        </w:tc>
+      </w:tr>
+      <w:tr>
+        <w:tc>
+          <w:tcPr>
+            <w:tcW w:type="dxa" w:w="1750"/>
+            <w:shd w:fill="FFF3D6" w:val="clear"/>
+            <w:tcMar>
+              <w:top w:type="dxa" w:w="60"/>
+              <w:left w:type="dxa" w:w="100"/>
+              <w:bottom w:type="dxa" w:w="60"/>
+              <w:right w:type="dxa" w:w="100"/>
+            </w:tcMar>
+          </w:tcPr>
+          <w:p>
+            <w:pPr>
+              <w:spacing w:after="30"/>
+            </w:pPr>
+            <w:r>
+              <w:rPr>
+                <w:rFonts w:ascii="Calibri" w:cs="Calibri" w:eastAsia="Calibri" w:hAnsi="Calibri"/>
+                <w:b/>
+                <w:bCs/>
+                <w:sz w:val="20"/>
+                <w:szCs w:val="20"/>
+              </w:rPr>
+              <w:t xml:space="preserve">Surchauffeur</w:t>
+            </w:r>
+          </w:p>
+          <w:p>
+            <w:pPr>
+              <w:spacing w:after="40"/>
+            </w:pPr>
+            <w:r>
+              <w:rPr>
+                <w:rFonts w:ascii="Calibri" w:cs="Calibri" w:eastAsia="Calibri" w:hAnsi="Calibri"/>
+                <w:i/>
+                <w:iCs/>
+                <w:color w:val="5A6672"/>
+                <w:sz w:val="17"/>
+                <w:szCs w:val="17"/>
+              </w:rPr>
+              <w:t xml:space="preserve">la borne de RECHARGE — validé le 12/08, à implémenter. Serpentin compact, lueur cyan-blanche, manomètre.</w:t>
+            </w:r>
+          </w:p>
+        </w:tc>
+        <w:tc>
+          <w:tcPr>
+            <w:tcW w:type="dxa" w:w="1150"/>
+            <w:shd w:fill="FFF3D6" w:val="clear"/>
+            <w:tcMar>
+              <w:top w:type="dxa" w:w="60"/>
+              <w:left w:type="dxa" w:w="100"/>
+              <w:bottom w:type="dxa" w:w="60"/>
+              <w:right w:type="dxa" w:w="100"/>
+            </w:tcMar>
+          </w:tcPr>
+          <w:p>
+            <w:pPr>
+              <w:spacing w:after="40"/>
+            </w:pPr>
+            <w:r>
+              <w:rPr>
+                <w:rFonts w:ascii="Calibri" w:cs="Calibri" w:eastAsia="Calibri" w:hAnsi="Calibri"/>
+                <w:sz w:val="20"/>
+                <w:szCs w:val="20"/>
+              </w:rPr>
+              <w:t xml:space="preserve">— (pas de changement d’état)</w:t>
+            </w:r>
+          </w:p>
+        </w:tc>
+        <w:tc>
+          <w:tcPr>
+            <w:tcW w:type="dxa" w:w="3600"/>
+            <w:shd w:fill="FFF3D6" w:val="clear"/>
+            <w:tcMar>
+              <w:top w:type="dxa" w:w="60"/>
+              <w:left w:type="dxa" w:w="100"/>
+              <w:bottom w:type="dxa" w:w="60"/>
+              <w:right w:type="dxa" w:w="100"/>
+            </w:tcMar>
+          </w:tcPr>
+          <w:p>
+            <w:pPr>
+              <w:spacing w:after="40"/>
+            </w:pPr>
+            <w:r>
+              <w:rPr>
+                <w:rFonts w:ascii="Calibri" w:cs="Calibri" w:eastAsia="Calibri" w:hAnsi="Calibri"/>
+                <w:sz w:val="20"/>
+                <w:szCs w:val="20"/>
+              </w:rPr>
+              <w:t xml:space="preserve">Lore : le serpentin qui ré-injecte de l’énergie dans une vapeur DÉJÀ FORMÉE pour la pousser plus loin dans les conduites — d’où la règle : il n’agit que sur l’ÉTAT GAZEUX. Corps principal en vapeur dans son aura → +1 IMPULSION (le viseur et la jauge clignotent). USAGE UNIQUE : le manomètre tombe à zéro, le serpentin s’éteint (gris). Sans effet sur l’eau et la glace — il ne chauffe pas assez pour transformer.</w:t>
+            </w:r>
+          </w:p>
+        </w:tc>
+        <w:tc>
+          <w:tcPr>
+            <w:tcW w:type="dxa" w:w="2500"/>
+            <w:shd w:fill="FFF3D6" w:val="clear"/>
+            <w:tcMar>
+              <w:top w:type="dxa" w:w="60"/>
+              <w:left w:type="dxa" w:w="100"/>
+              <w:bottom w:type="dxa" w:w="60"/>
+              <w:right w:type="dxa" w:w="100"/>
+            </w:tcMar>
+          </w:tcPr>
+          <w:p>
+            <w:pPr>
+              <w:spacing w:after="40"/>
+            </w:pPr>
+            <w:r>
+              <w:rPr>
+                <w:rFonts w:ascii="Calibri" w:cs="Calibri" w:eastAsia="Calibri" w:hAnsi="Calibri"/>
+                <w:sz w:val="20"/>
+                <w:szCs w:val="20"/>
+              </w:rPr>
+              <w:t xml:space="preserve">gain instantané dès la condition remplie ; champ « usages » (1 / ∞ / cooldown) dans l’éditeur</w:t>
+            </w:r>
+          </w:p>
+        </w:tc>
+        <w:tc>
+          <w:tcPr>
+            <w:tcW w:type="dxa" w:w="2200"/>
+            <w:shd w:fill="FFF3D6" w:val="clear"/>
+            <w:tcMar>
+              <w:top w:type="dxa" w:w="60"/>
+              <w:left w:type="dxa" w:w="100"/>
+              <w:bottom w:type="dxa" w:w="60"/>
+              <w:right w:type="dxa" w:w="100"/>
+            </w:tcMar>
+          </w:tcPr>
+          <w:p>
+            <w:pPr>
+              <w:spacing w:after="40"/>
+            </w:pPr>
+            <w:r>
+              <w:rPr>
+                <w:rFonts w:ascii="Calibri" w:cs="Calibri" w:eastAsia="Calibri" w:hAnsi="Calibri"/>
+                <w:sz w:val="20"/>
+                <w:szCs w:val="20"/>
+              </w:rPr>
+              <w:t xml:space="preserve">90–95 % du VOLUME ACTIF (corps principal, gouttes éjectées exclues) dans l’aura, à l’état gazeux — % exact à caler en test</w:t>
             </w:r>
           </w:p>
         </w:tc>
@@ -1494,7 +1655,7 @@
                 <w:sz w:val="20"/>
                 <w:szCs w:val="20"/>
               </w:rPr>
-              <w:t xml:space="preserve">① Coût : l’état se paie — évaporation continue 2 part./s ; la grille essore au passage. Dashs COMPTÉS : 3 par écran (réglable par tableau), radiateur frôlé = +1 offert.</w:t>
+              <w:t xml:space="preserve">① Coût : l’état se paie — évaporation continue 2 part./s ; la grille essore au passage. Dashs COMPTÉS : 3 par écran (réglable par tableau) ; un SURCHAUFFEUR = +1 impulsion (usage unique).</w:t>
             </w:r>
           </w:p>
           <w:p>
@@ -1963,10 +2124,12 @@
             <w:r>
               <w:rPr>
                 <w:rFonts w:ascii="Calibri" w:cs="Calibri" w:eastAsia="Calibri" w:hAnsi="Calibri"/>
-                <w:sz w:val="20"/>
-                <w:szCs w:val="20"/>
-              </w:rPr>
-              <w:t xml:space="preserve">À trancher — recommandé : OUI</w:t>
+                <w:b/>
+                <w:bCs/>
+                <w:sz w:val="20"/>
+                <w:szCs w:val="20"/>
+              </w:rPr>
+              <w:t xml:space="preserve">TRANCHÉ le 12/08 : OUI — porté par le surchauffeur (état gaz requis). Voir tableau 2.</w:t>
             </w:r>
           </w:p>
         </w:tc>
@@ -2154,10 +2317,12 @@
             <w:r>
               <w:rPr>
                 <w:rFonts w:ascii="Calibri" w:cs="Calibri" w:eastAsia="Calibri" w:hAnsi="Calibri"/>
-                <w:sz w:val="20"/>
-                <w:szCs w:val="20"/>
-              </w:rPr>
-              <w:t xml:space="preserve">À trancher — recommandé : OUI, deux blocs</w:t>
+                <w:b/>
+                <w:bCs/>
+                <w:sz w:val="20"/>
+                <w:szCs w:val="20"/>
+              </w:rPr>
+              <w:t xml:space="preserve">TRANCHÉ le 12/08 : OUI — la CHAUDIÈRE (transfo) et le SURCHAUFFEUR (recharge). Voir tableau 2.</w:t>
             </w:r>
           </w:p>
         </w:tc>

</xml_diff>

<commit_message>
Docs : la chaudière (transfo) et le surchauffeur (recharge de dash) (#105)
Lore tranché : le radiateur devient LA CHAUDIÈRE (transfo pure, ne
recharge plus les dashs) ; LE SURCHAUFFEUR entre comme borne de
recharge — le serpentin qui ré-injecte de l'énergie dans une vapeur
déjà formée (d'où l'exigence de l'état gazeux), +1 impulsion, usage
unique lisible au manomètre. Nouvelles cellules du tableau des blocs,
matrice état→état et brainstorm (lignes 1 et 3 tranchées) à jour.


Claude-Session: https://claude.ai/code/session_01JcgQjhbx7n2WuX197SocGM

Co-authored-by: Claude <noreply@anthropic.com>
</commit_message>
<xml_diff>
--- a/docs/Sujet21-transformations.docx
+++ b/docs/Sujet21-transformations.docx
@@ -963,17 +963,33 @@
           </w:tcPr>
           <w:p>
             <w:pPr>
-              <w:spacing w:after="40"/>
-            </w:pPr>
-            <w:r>
-              <w:rPr>
-                <w:rFonts w:ascii="Calibri" w:cs="Calibri" w:eastAsia="Calibri" w:hAnsi="Calibri"/>
-                <w:b/>
-                <w:bCs/>
-                <w:sz w:val="20"/>
-                <w:szCs w:val="20"/>
-              </w:rPr>
-              <w:t xml:space="preserve">Radiateur</w:t>
+              <w:spacing w:after="30"/>
+            </w:pPr>
+            <w:r>
+              <w:rPr>
+                <w:rFonts w:ascii="Calibri" w:cs="Calibri" w:eastAsia="Calibri" w:hAnsi="Calibri"/>
+                <w:b/>
+                <w:bCs/>
+                <w:sz w:val="20"/>
+                <w:szCs w:val="20"/>
+              </w:rPr>
+              <w:t xml:space="preserve">Chaudière</w:t>
+            </w:r>
+          </w:p>
+          <w:p>
+            <w:pPr>
+              <w:spacing w:after="40"/>
+            </w:pPr>
+            <w:r>
+              <w:rPr>
+                <w:rFonts w:ascii="Calibri" w:cs="Calibri" w:eastAsia="Calibri" w:hAnsi="Calibri"/>
+                <w:i/>
+                <w:iCs/>
+                <w:color w:val="5A6672"/>
+                <w:sz w:val="17"/>
+                <w:szCs w:val="17"/>
+              </w:rPr>
+              <w:t xml:space="preserve">le chauffage de TRANSFO — l’actuel « radiateur », renommé. Toujours active. Ailettes, braise orange.</w:t>
             </w:r>
           </w:p>
         </w:tc>
@@ -1021,7 +1037,7 @@
                 <w:sz w:val="20"/>
                 <w:szCs w:val="20"/>
               </w:rPr>
-              <w:t xml:space="preserve">Aura de chaleur, PAR PARTICULE : l’eau frémit puis se vaporise, qu’on le veuille ou non. Dégèle la glace (libère un bloc soudé). La vapeur qui FRÔLE le halo recharge un dash (+1 impulsion offerte). La vapeur qui s’attarde s’évapore (perdue). À 50 % du corps vaporisé, le jeu PASSE à l’état gazeux (dash, sélecteur, sons) — réarmement sous 30 %.</w:t>
+              <w:t xml:space="preserve">Aura de chaleur, PAR PARTICULE : l’eau frémit puis se vaporise, qu’on le veuille ou non. Dégèle la glace (libère un bloc soudé). La vapeur qui s’attarde s’évapore (perdue). À 50 % du corps vaporisé, le jeu PASSE à l’état gazeux (dash, sélecteur, sons) — réarmement sous 30 %. Ne recharge PLUS les dashs : ce rôle passe au surchauffeur.</w:t>
             </w:r>
           </w:p>
         </w:tc>
@@ -1070,6 +1086,151 @@
                 <w:szCs w:val="20"/>
               </w:rPr>
               <w:t xml:space="preserve">vaporisation : par particule · passage à l’ÉTAT gazeux : 50 % du corps</w:t>
+            </w:r>
+          </w:p>
+        </w:tc>
+      </w:tr>
+      <w:tr>
+        <w:tc>
+          <w:tcPr>
+            <w:tcW w:type="dxa" w:w="1750"/>
+            <w:shd w:fill="FFF3D6" w:val="clear"/>
+            <w:tcMar>
+              <w:top w:type="dxa" w:w="60"/>
+              <w:left w:type="dxa" w:w="100"/>
+              <w:bottom w:type="dxa" w:w="60"/>
+              <w:right w:type="dxa" w:w="100"/>
+            </w:tcMar>
+          </w:tcPr>
+          <w:p>
+            <w:pPr>
+              <w:spacing w:after="30"/>
+            </w:pPr>
+            <w:r>
+              <w:rPr>
+                <w:rFonts w:ascii="Calibri" w:cs="Calibri" w:eastAsia="Calibri" w:hAnsi="Calibri"/>
+                <w:b/>
+                <w:bCs/>
+                <w:sz w:val="20"/>
+                <w:szCs w:val="20"/>
+              </w:rPr>
+              <w:t xml:space="preserve">Surchauffeur</w:t>
+            </w:r>
+          </w:p>
+          <w:p>
+            <w:pPr>
+              <w:spacing w:after="40"/>
+            </w:pPr>
+            <w:r>
+              <w:rPr>
+                <w:rFonts w:ascii="Calibri" w:cs="Calibri" w:eastAsia="Calibri" w:hAnsi="Calibri"/>
+                <w:i/>
+                <w:iCs/>
+                <w:color w:val="5A6672"/>
+                <w:sz w:val="17"/>
+                <w:szCs w:val="17"/>
+              </w:rPr>
+              <w:t xml:space="preserve">la borne de RECHARGE — validé le 12/08, à implémenter. Serpentin compact, lueur cyan-blanche, manomètre.</w:t>
+            </w:r>
+          </w:p>
+        </w:tc>
+        <w:tc>
+          <w:tcPr>
+            <w:tcW w:type="dxa" w:w="1150"/>
+            <w:shd w:fill="FFF3D6" w:val="clear"/>
+            <w:tcMar>
+              <w:top w:type="dxa" w:w="60"/>
+              <w:left w:type="dxa" w:w="100"/>
+              <w:bottom w:type="dxa" w:w="60"/>
+              <w:right w:type="dxa" w:w="100"/>
+            </w:tcMar>
+          </w:tcPr>
+          <w:p>
+            <w:pPr>
+              <w:spacing w:after="40"/>
+            </w:pPr>
+            <w:r>
+              <w:rPr>
+                <w:rFonts w:ascii="Calibri" w:cs="Calibri" w:eastAsia="Calibri" w:hAnsi="Calibri"/>
+                <w:sz w:val="20"/>
+                <w:szCs w:val="20"/>
+              </w:rPr>
+              <w:t xml:space="preserve">— (pas de changement d’état)</w:t>
+            </w:r>
+          </w:p>
+        </w:tc>
+        <w:tc>
+          <w:tcPr>
+            <w:tcW w:type="dxa" w:w="3600"/>
+            <w:shd w:fill="FFF3D6" w:val="clear"/>
+            <w:tcMar>
+              <w:top w:type="dxa" w:w="60"/>
+              <w:left w:type="dxa" w:w="100"/>
+              <w:bottom w:type="dxa" w:w="60"/>
+              <w:right w:type="dxa" w:w="100"/>
+            </w:tcMar>
+          </w:tcPr>
+          <w:p>
+            <w:pPr>
+              <w:spacing w:after="40"/>
+            </w:pPr>
+            <w:r>
+              <w:rPr>
+                <w:rFonts w:ascii="Calibri" w:cs="Calibri" w:eastAsia="Calibri" w:hAnsi="Calibri"/>
+                <w:sz w:val="20"/>
+                <w:szCs w:val="20"/>
+              </w:rPr>
+              <w:t xml:space="preserve">Lore : le serpentin qui ré-injecte de l’énergie dans une vapeur DÉJÀ FORMÉE pour la pousser plus loin dans les conduites — d’où la règle : il n’agit que sur l’ÉTAT GAZEUX. Corps principal en vapeur dans son aura → +1 IMPULSION (le viseur et la jauge clignotent). USAGE UNIQUE : le manomètre tombe à zéro, le serpentin s’éteint (gris). Sans effet sur l’eau et la glace — il ne chauffe pas assez pour transformer.</w:t>
+            </w:r>
+          </w:p>
+        </w:tc>
+        <w:tc>
+          <w:tcPr>
+            <w:tcW w:type="dxa" w:w="2500"/>
+            <w:shd w:fill="FFF3D6" w:val="clear"/>
+            <w:tcMar>
+              <w:top w:type="dxa" w:w="60"/>
+              <w:left w:type="dxa" w:w="100"/>
+              <w:bottom w:type="dxa" w:w="60"/>
+              <w:right w:type="dxa" w:w="100"/>
+            </w:tcMar>
+          </w:tcPr>
+          <w:p>
+            <w:pPr>
+              <w:spacing w:after="40"/>
+            </w:pPr>
+            <w:r>
+              <w:rPr>
+                <w:rFonts w:ascii="Calibri" w:cs="Calibri" w:eastAsia="Calibri" w:hAnsi="Calibri"/>
+                <w:sz w:val="20"/>
+                <w:szCs w:val="20"/>
+              </w:rPr>
+              <w:t xml:space="preserve">gain instantané dès la condition remplie ; champ « usages » (1 / ∞ / cooldown) dans l’éditeur</w:t>
+            </w:r>
+          </w:p>
+        </w:tc>
+        <w:tc>
+          <w:tcPr>
+            <w:tcW w:type="dxa" w:w="2200"/>
+            <w:shd w:fill="FFF3D6" w:val="clear"/>
+            <w:tcMar>
+              <w:top w:type="dxa" w:w="60"/>
+              <w:left w:type="dxa" w:w="100"/>
+              <w:bottom w:type="dxa" w:w="60"/>
+              <w:right w:type="dxa" w:w="100"/>
+            </w:tcMar>
+          </w:tcPr>
+          <w:p>
+            <w:pPr>
+              <w:spacing w:after="40"/>
+            </w:pPr>
+            <w:r>
+              <w:rPr>
+                <w:rFonts w:ascii="Calibri" w:cs="Calibri" w:eastAsia="Calibri" w:hAnsi="Calibri"/>
+                <w:sz w:val="20"/>
+                <w:szCs w:val="20"/>
+              </w:rPr>
+              <w:t xml:space="preserve">90–95 % du VOLUME ACTIF (corps principal, gouttes éjectées exclues) dans l’aura, à l’état gazeux — % exact à caler en test</w:t>
             </w:r>
           </w:p>
         </w:tc>
@@ -1494,7 +1655,7 @@
                 <w:sz w:val="20"/>
                 <w:szCs w:val="20"/>
               </w:rPr>
-              <w:t xml:space="preserve">① Coût : l’état se paie — évaporation continue 2 part./s ; la grille essore au passage. Dashs COMPTÉS : 3 par écran (réglable par tableau), radiateur frôlé = +1 offert.</w:t>
+              <w:t xml:space="preserve">① Coût : l’état se paie — évaporation continue 2 part./s ; la grille essore au passage. Dashs COMPTÉS : 3 par écran (réglable par tableau) ; un SURCHAUFFEUR = +1 impulsion (usage unique).</w:t>
             </w:r>
           </w:p>
           <w:p>
@@ -1963,10 +2124,12 @@
             <w:r>
               <w:rPr>
                 <w:rFonts w:ascii="Calibri" w:cs="Calibri" w:eastAsia="Calibri" w:hAnsi="Calibri"/>
-                <w:sz w:val="20"/>
-                <w:szCs w:val="20"/>
-              </w:rPr>
-              <w:t xml:space="preserve">À trancher — recommandé : OUI</w:t>
+                <w:b/>
+                <w:bCs/>
+                <w:sz w:val="20"/>
+                <w:szCs w:val="20"/>
+              </w:rPr>
+              <w:t xml:space="preserve">TRANCHÉ le 12/08 : OUI — porté par le surchauffeur (état gaz requis). Voir tableau 2.</w:t>
             </w:r>
           </w:p>
         </w:tc>
@@ -2154,10 +2317,12 @@
             <w:r>
               <w:rPr>
                 <w:rFonts w:ascii="Calibri" w:cs="Calibri" w:eastAsia="Calibri" w:hAnsi="Calibri"/>
-                <w:sz w:val="20"/>
-                <w:szCs w:val="20"/>
-              </w:rPr>
-              <w:t xml:space="preserve">À trancher — recommandé : OUI, deux blocs</w:t>
+                <w:b/>
+                <w:bCs/>
+                <w:sz w:val="20"/>
+                <w:szCs w:val="20"/>
+              </w:rPr>
+              <w:t xml:space="preserve">TRANCHÉ le 12/08 : OUI — la CHAUDIÈRE (transfo) et le SURCHAUFFEUR (recharge). Voir tableau 2.</w:t>
             </w:r>
           </w:p>
         </w:tc>

</xml_diff>

<commit_message>
Docs : la chaudière ne se désactive jamais (tranché, anti soft-lock)
Ligne 2 du brainstorm marquée tranchée : transfo permanente, seul le
surchauffeur se consomme. Note renforcée dans la cellule chaudière.

Co-Authored-By: Claude Fable 5 <noreply@anthropic.com>
Claude-Session: https://claude.ai/code/session_01JcgQjhbx7n2WuX197SocGM
</commit_message>
<xml_diff>
--- a/docs/Sujet21-transformations.docx
+++ b/docs/Sujet21-transformations.docx
@@ -989,7 +989,7 @@
                 <w:sz w:val="17"/>
                 <w:szCs w:val="17"/>
               </w:rPr>
-              <w:t xml:space="preserve">le chauffage de TRANSFO — l’actuel « radiateur », renommé. Toujours active. Ailettes, braise orange.</w:t>
+              <w:t xml:space="preserve">le chauffage de TRANSFO — l’actuel « radiateur », renommé. TOUJOURS ACTIVE, ne se désactive jamais (anti soft-lock — tranché le 12/08). Ailettes, braise orange.</w:t>
             </w:r>
           </w:p>
         </w:tc>
@@ -2228,10 +2228,12 @@
             <w:r>
               <w:rPr>
                 <w:rFonts w:ascii="Calibri" w:cs="Calibri" w:eastAsia="Calibri" w:hAnsi="Calibri"/>
-                <w:sz w:val="20"/>
-                <w:szCs w:val="20"/>
-              </w:rPr>
-              <w:t xml:space="preserve">À trancher — recommandé : recharge unique, transfo permanente</w:t>
+                <w:b/>
+                <w:bCs/>
+                <w:sz w:val="20"/>
+                <w:szCs w:val="20"/>
+              </w:rPr>
+              <w:t xml:space="preserve">TRANCHÉ le 12/08 : la CHAUDIÈRE ne se désactive jamais (anti soft-lock) ; le SURCHAUFFEUR est à usage unique.</w:t>
             </w:r>
           </w:p>
         </w:tc>

</xml_diff>

<commit_message>
Docs : la chaudière ne se désactive jamais (tranché, anti soft-lock) (#106)
Ligne 2 du brainstorm marquée tranchée : transfo permanente, seul le
surchauffeur se consomme. Note renforcée dans la cellule chaudière.


Claude-Session: https://claude.ai/code/session_01JcgQjhbx7n2WuX197SocGM

Co-authored-by: Claude <noreply@anthropic.com>
</commit_message>
<xml_diff>
--- a/docs/Sujet21-transformations.docx
+++ b/docs/Sujet21-transformations.docx
@@ -989,7 +989,7 @@
                 <w:sz w:val="17"/>
                 <w:szCs w:val="17"/>
               </w:rPr>
-              <w:t xml:space="preserve">le chauffage de TRANSFO — l’actuel « radiateur », renommé. Toujours active. Ailettes, braise orange.</w:t>
+              <w:t xml:space="preserve">le chauffage de TRANSFO — l’actuel « radiateur », renommé. TOUJOURS ACTIVE, ne se désactive jamais (anti soft-lock — tranché le 12/08). Ailettes, braise orange.</w:t>
             </w:r>
           </w:p>
         </w:tc>
@@ -2228,10 +2228,12 @@
             <w:r>
               <w:rPr>
                 <w:rFonts w:ascii="Calibri" w:cs="Calibri" w:eastAsia="Calibri" w:hAnsi="Calibri"/>
-                <w:sz w:val="20"/>
-                <w:szCs w:val="20"/>
-              </w:rPr>
-              <w:t xml:space="preserve">À trancher — recommandé : recharge unique, transfo permanente</w:t>
+                <w:b/>
+                <w:bCs/>
+                <w:sz w:val="20"/>
+                <w:szCs w:val="20"/>
+              </w:rPr>
+              <w:t xml:space="preserve">TRANCHÉ le 12/08 : la CHAUDIÈRE ne se désactive jamais (anti soft-lock) ; le SURCHAUFFEUR est à usage unique.</w:t>
             </w:r>
           </w:p>
         </w:tc>

</xml_diff>

<commit_message>
Renommage : la grille devient L'ÉVENT (textes joueur, mécanique intacte)
La paroi qui ne laisse passer que la vapeur s'appelle l'évent — la
bouche par laquelle le vaisseau respire. Renommés : MATERIAL_NAMES,
étiquettes des tableaux (21-C, 21-F, 21-L, école S2), nom du tableau
21-L (« À travers l'évent ») et journaux de Véga, légende, panneau des
états, cartes d'onboarding, banc (péage d'évent), bouton d'éditeur
(avec infobulle), garde-fou levelIO, doc Word. Identifiants internes
(MAT_GRILLE, grilleAt…) inchangés — zéro changement de mécanique.

Co-Authored-By: Claude Fable 5 <noreply@anthropic.com>
Claude-Session: https://claude.ai/code/session_01JcgQjhbx7n2WuX197SocGM
</commit_message>
<xml_diff>
--- a/docs/Sujet21-transformations.docx
+++ b/docs/Sujet21-transformations.docx
@@ -356,7 +356,7 @@
                 <w:sz w:val="20"/>
                 <w:szCs w:val="20"/>
               </w:rPr>
-              <w:t xml:space="preserve">① Coût : la conversion est gratuite ; l’ÉTAT gazeux se paie ensuite (−2 part./s, grille qui essore, dashs comptés).</w:t>
+              <w:t xml:space="preserve">① Coût : la conversion est gratuite ; l’ÉTAT gazeux se paie ensuite (−2 part./s, évent qui essore, dashs comptés).</w:t>
             </w:r>
           </w:p>
           <w:p>
@@ -1325,7 +1325,7 @@
                 <w:sz w:val="20"/>
                 <w:szCs w:val="20"/>
               </w:rPr>
-              <w:t xml:space="preserve">Proposition : une buse qui arrose vers le bas ; tout ce qui traverse le jet redevient EAU (glace dégelée, vapeur condensée). Le « reset d’état » posé par le level designer — l’inverse exact du radiateur, comme la membrane est l’inverse de la grille.</w:t>
+              <w:t xml:space="preserve">Proposition : une buse qui arrose vers le bas ; tout ce qui traverse le jet redevient EAU (glace dégelée, vapeur condensée). Le « reset d’état » posé par le level designer — l’inverse exact de la chaudière, comme la membrane est l’inverse de l’évent.</w:t>
             </w:r>
           </w:p>
         </w:tc>
@@ -1655,7 +1655,7 @@
                 <w:sz w:val="20"/>
                 <w:szCs w:val="20"/>
               </w:rPr>
-              <w:t xml:space="preserve">① Coût : l’état se paie — évaporation continue 2 part./s ; la grille essore au passage. Dashs COMPTÉS : 3 par écran (réglable par tableau) ; un SURCHAUFFEUR = +1 impulsion (usage unique).</w:t>
+              <w:t xml:space="preserve">① Coût : l’état se paie — évaporation continue 2 part./s ; l’évent essore au passage. Dashs COMPTÉS : 3 par écran (réglable par tableau) ; un SURCHAUFFEUR = +1 impulsion (usage unique).</w:t>
             </w:r>
           </w:p>
           <w:p>

</xml_diff>

<commit_message>
Renommage : la grille devient L'ÉVENT (textes joueur, mécanique intacte) (#109)
La paroi qui ne laisse passer que la vapeur s'appelle l'évent — la
bouche par laquelle le vaisseau respire. Renommés : MATERIAL_NAMES,
étiquettes des tableaux (21-C, 21-F, 21-L, école S2), nom du tableau
21-L (« À travers l'évent ») et journaux de Véga, légende, panneau des
états, cartes d'onboarding, banc (péage d'évent), bouton d'éditeur
(avec infobulle), garde-fou levelIO, doc Word. Identifiants internes
(MAT_GRILLE, grilleAt…) inchangés — zéro changement de mécanique.


Claude-Session: https://claude.ai/code/session_01JcgQjhbx7n2WuX197SocGM

Co-authored-by: Claude <noreply@anthropic.com>
</commit_message>
<xml_diff>
--- a/docs/Sujet21-transformations.docx
+++ b/docs/Sujet21-transformations.docx
@@ -356,7 +356,7 @@
                 <w:sz w:val="20"/>
                 <w:szCs w:val="20"/>
               </w:rPr>
-              <w:t xml:space="preserve">① Coût : la conversion est gratuite ; l’ÉTAT gazeux se paie ensuite (−2 part./s, grille qui essore, dashs comptés).</w:t>
+              <w:t xml:space="preserve">① Coût : la conversion est gratuite ; l’ÉTAT gazeux se paie ensuite (−2 part./s, évent qui essore, dashs comptés).</w:t>
             </w:r>
           </w:p>
           <w:p>
@@ -1325,7 +1325,7 @@
                 <w:sz w:val="20"/>
                 <w:szCs w:val="20"/>
               </w:rPr>
-              <w:t xml:space="preserve">Proposition : une buse qui arrose vers le bas ; tout ce qui traverse le jet redevient EAU (glace dégelée, vapeur condensée). Le « reset d’état » posé par le level designer — l’inverse exact du radiateur, comme la membrane est l’inverse de la grille.</w:t>
+              <w:t xml:space="preserve">Proposition : une buse qui arrose vers le bas ; tout ce qui traverse le jet redevient EAU (glace dégelée, vapeur condensée). Le « reset d’état » posé par le level designer — l’inverse exact de la chaudière, comme la membrane est l’inverse de l’évent.</w:t>
             </w:r>
           </w:p>
         </w:tc>
@@ -1655,7 +1655,7 @@
                 <w:sz w:val="20"/>
                 <w:szCs w:val="20"/>
               </w:rPr>
-              <w:t xml:space="preserve">① Coût : l’état se paie — évaporation continue 2 part./s ; la grille essore au passage. Dashs COMPTÉS : 3 par écran (réglable par tableau) ; un SURCHAUFFEUR = +1 impulsion (usage unique).</w:t>
+              <w:t xml:space="preserve">① Coût : l’état se paie — évaporation continue 2 part./s ; l’évent essore au passage. Dashs COMPTÉS : 3 par écran (réglable par tableau) ; un SURCHAUFFEUR = +1 impulsion (usage unique).</w:t>
             </w:r>
           </w:p>
           <w:p>

</xml_diff>